<commit_message>
C5_docs(report): rebuild Word deliverable from revised draft
报告正文在上一版之后改动较大（新增 6.4 归因实验与表 4、原 6.4/6.5
顺延为 6.5/6.6、图 8 改用含周同期特征的改进模型、图 9 补新特征集对照、
364 天口径统一），Word 版需要同步重做。

新增 scripts/build_report_html.py：直接从 docs/report_draft.md 重建
stage2 排版 HTML，复用既有版式的 <head>、CSS（含 @page 页脚）与封面，
目录由标题自动生成。此后正文一改就能重建，不必重跑整条排版流水线。

修正两处会毁掉产物的缺陷：
- 段落一律挂在章级而非当前小节，导致 8.2 内容为空；patched HTML 里
  待替换片段退化成 "\n"，str.replace 把全文每个换行都替换了一遍，
  生成 7544 段的错乱文档。改为按切片替换，杜绝空片段全局替换。
- 附录 A 的 <URL> 尖括号被当成标签解析，转换丢段；改为裸链接。

scripts/patch_report_html.py 同步：表 4/表 5 表题、图 8 换用 *_tw 图、
图 9 补新特征集对照、图注口径统一为"已记录时段"。

第 8.2 节两处过时表述更正：成员 C 承担部分补 6.4 归因实验与
probe_target_week.py；"不足"中的版本未统一项改为已消除，并补记
时间特征取起点这一未试验项。

deliverables/城市电力负荷分析与预测_项目报告.docx 重新生成：
268 段无缺失、34/34 标题绑定、8 张表、12 张图，转换校验零问题。
</commit_message>
<xml_diff>
--- a/deliverables/城市电力负荷分析与预测_项目报告.docx
+++ b/deliverables/城市电力负荷分析与预测_项目报告.docx
@@ -137,7 +137,7 @@
         <w:rPr>
           <w:rFonts w:hint="eastAsia"/>
         </w:rPr>
-        <w:t>摘要</w:t>
+        <w:t>摘　要</w:t>
       </w:r>
       <w:r>
         <w:fldChar w:fldCharType="end" w:fldLock="0" w:dirty="0"/>
@@ -542,7 +542,7 @@
         <w:rPr>
           <w:rFonts w:hint="eastAsia"/>
         </w:rPr>
-        <w:t>4.1　全年走势</w:t>
+        <w:t>4.1　年内走势</w:t>
       </w:r>
       <w:r>
         <w:fldChar w:fldCharType="end" w:fldLock="0" w:dirty="0"/>
@@ -947,7 +947,7 @@
         <w:rPr>
           <w:rFonts w:hint="eastAsia"/>
         </w:rPr>
-        <w:t>5.4　本节结论的局限</w:t>
+        <w:t>5.4　局限</w:t>
       </w:r>
       <w:r>
         <w:fldChar w:fldCharType="end" w:fldLock="0" w:dirty="0"/>
@@ -1127,7 +1127,7 @@
         <w:rPr>
           <w:rFonts w:hint="eastAsia"/>
         </w:rPr>
-        <w:t>6.3　模型比较</w:t>
+        <w:t>6.3　模型比较（表 3、图 7）</w:t>
       </w:r>
       <w:r>
         <w:fldChar w:fldCharType="end" w:fldLock="0" w:dirty="0"/>
@@ -1172,7 +1172,7 @@
         <w:rPr>
           <w:rFonts w:hint="eastAsia"/>
         </w:rPr>
-        <w:t>6.4　天气特征消融</w:t>
+        <w:t>6.4　归因实验：补上目标时刻对齐的周同期特征</w:t>
       </w:r>
       <w:r>
         <w:fldChar w:fldCharType="end" w:fldLock="0" w:dirty="0"/>
@@ -1217,7 +1217,7 @@
         <w:rPr>
           <w:rFonts w:hint="eastAsia"/>
         </w:rPr>
-        <w:t>6.5　分区域与高峰时段误差分析</w:t>
+        <w:t>6.5　天气特征消融（表 5、图 9）</w:t>
       </w:r>
       <w:r>
         <w:fldChar w:fldCharType="end" w:fldLock="0" w:dirty="0"/>
@@ -1230,6 +1230,51 @@
       </w:r>
       <w:r>
         <w:instrText xml:space="preserve"> PAGEREF section-7-5 \h </w:instrText>
+      </w:r>
+      <w:r>
+        <w:fldChar w:fldCharType="separate" w:fldLock="0" w:dirty="0"/>
+      </w:r>
+      <w:r>
+        <w:t>1</w:t>
+      </w:r>
+      <w:r>
+        <w:fldChar w:fldCharType="end" w:fldLock="0" w:dirty="0"/>
+      </w:r>
+    </w:p>
+    <w:p>
+      <w:pPr>
+        <w:pStyle w:val="000004"/>
+        <w:tabs>
+          <w:tab w:val="right" w:leader="dot" w:pos="9072"/>
+        </w:tabs>
+        <w:ind w:left="200"/>
+      </w:pPr>
+      <w:r>
+        <w:fldChar w:fldCharType="begin" w:fldLock="0" w:dirty="0"/>
+      </w:r>
+      <w:r>
+        <w:instrText xml:space="preserve"> HYPERLINK \l "section-7-6" </w:instrText>
+      </w:r>
+      <w:r>
+        <w:fldChar w:fldCharType="separate" w:fldLock="0" w:dirty="0"/>
+      </w:r>
+      <w:r>
+        <w:rPr>
+          <w:rFonts w:hint="eastAsia"/>
+        </w:rPr>
+        <w:t>6.6　分区域与高峰时段误差分析（图 8）</w:t>
+      </w:r>
+      <w:r>
+        <w:fldChar w:fldCharType="end" w:fldLock="0" w:dirty="0"/>
+      </w:r>
+      <w:r>
+        <w:tab/>
+      </w:r>
+      <w:r>
+        <w:fldChar w:fldCharType="begin" w:fldLock="0" w:dirty="0"/>
+      </w:r>
+      <w:r>
+        <w:instrText xml:space="preserve"> PAGEREF section-7-6 \h </w:instrText>
       </w:r>
       <w:r>
         <w:fldChar w:fldCharType="separate" w:fldLock="0" w:dirty="0"/>
@@ -1468,6 +1513,96 @@
     </w:p>
     <w:p>
       <w:pPr>
+        <w:pStyle w:val="000004"/>
+        <w:tabs>
+          <w:tab w:val="right" w:leader="dot" w:pos="9072"/>
+        </w:tabs>
+        <w:ind w:left="200"/>
+      </w:pPr>
+      <w:r>
+        <w:fldChar w:fldCharType="begin" w:fldLock="0" w:dirty="0"/>
+      </w:r>
+      <w:r>
+        <w:instrText xml:space="preserve"> HYPERLINK \l "section-9-1" </w:instrText>
+      </w:r>
+      <w:r>
+        <w:fldChar w:fldCharType="separate" w:fldLock="0" w:dirty="0"/>
+      </w:r>
+      <w:r>
+        <w:rPr>
+          <w:rFonts w:hint="eastAsia"/>
+        </w:rPr>
+        <w:t>8.1　分工表</w:t>
+      </w:r>
+      <w:r>
+        <w:fldChar w:fldCharType="end" w:fldLock="0" w:dirty="0"/>
+      </w:r>
+      <w:r>
+        <w:tab/>
+      </w:r>
+      <w:r>
+        <w:fldChar w:fldCharType="begin" w:fldLock="0" w:dirty="0"/>
+      </w:r>
+      <w:r>
+        <w:instrText xml:space="preserve"> PAGEREF section-9-1 \h </w:instrText>
+      </w:r>
+      <w:r>
+        <w:fldChar w:fldCharType="separate" w:fldLock="0" w:dirty="0"/>
+      </w:r>
+      <w:r>
+        <w:t>1</w:t>
+      </w:r>
+      <w:r>
+        <w:fldChar w:fldCharType="end" w:fldLock="0" w:dirty="0"/>
+      </w:r>
+    </w:p>
+    <w:p>
+      <w:pPr>
+        <w:pStyle w:val="000004"/>
+        <w:tabs>
+          <w:tab w:val="right" w:leader="dot" w:pos="9072"/>
+        </w:tabs>
+        <w:ind w:left="200"/>
+      </w:pPr>
+      <w:r>
+        <w:fldChar w:fldCharType="begin" w:fldLock="0" w:dirty="0"/>
+      </w:r>
+      <w:r>
+        <w:instrText xml:space="preserve"> HYPERLINK \l "section-9-2" </w:instrText>
+      </w:r>
+      <w:r>
+        <w:fldChar w:fldCharType="separate" w:fldLock="0" w:dirty="0"/>
+      </w:r>
+      <w:r>
+        <w:rPr>
+          <w:rFonts w:hint="eastAsia"/>
+        </w:rPr>
+        <w:t>8.2　个人承担说明</w:t>
+      </w:r>
+      <w:r>
+        <w:fldChar w:fldCharType="end" w:fldLock="0" w:dirty="0"/>
+      </w:r>
+      <w:r>
+        <w:tab/>
+      </w:r>
+      <w:r>
+        <w:fldChar w:fldCharType="begin" w:fldLock="0" w:dirty="0"/>
+      </w:r>
+      <w:r>
+        <w:instrText xml:space="preserve"> PAGEREF section-9-2 \h </w:instrText>
+      </w:r>
+      <w:r>
+        <w:fldChar w:fldCharType="separate" w:fldLock="0" w:dirty="0"/>
+      </w:r>
+      <w:r>
+        <w:t>1</w:t>
+      </w:r>
+      <w:r>
+        <w:fldChar w:fldCharType="end" w:fldLock="0" w:dirty="0"/>
+      </w:r>
+    </w:p>
+    <w:p>
+      <w:pPr>
         <w:pStyle w:val="000003"/>
         <w:tabs>
           <w:tab w:val="right" w:leader="dot" w:pos="9072"/>
@@ -1500,6 +1635,141 @@
       </w:r>
       <w:r>
         <w:instrText xml:space="preserve"> PAGEREF section-10 \h </w:instrText>
+      </w:r>
+      <w:r>
+        <w:fldChar w:fldCharType="separate" w:fldLock="0" w:dirty="0"/>
+      </w:r>
+      <w:r>
+        <w:t>1</w:t>
+      </w:r>
+      <w:r>
+        <w:fldChar w:fldCharType="end" w:fldLock="0" w:dirty="0"/>
+      </w:r>
+    </w:p>
+    <w:p>
+      <w:pPr>
+        <w:pStyle w:val="000004"/>
+        <w:tabs>
+          <w:tab w:val="right" w:leader="dot" w:pos="9072"/>
+        </w:tabs>
+        <w:ind w:left="200"/>
+      </w:pPr>
+      <w:r>
+        <w:fldChar w:fldCharType="begin" w:fldLock="0" w:dirty="0"/>
+      </w:r>
+      <w:r>
+        <w:instrText xml:space="preserve"> HYPERLINK \l "section-10-1" </w:instrText>
+      </w:r>
+      <w:r>
+        <w:fldChar w:fldCharType="separate" w:fldLock="0" w:dirty="0"/>
+      </w:r>
+      <w:r>
+        <w:rPr>
+          <w:rFonts w:hint="eastAsia"/>
+        </w:rPr>
+        <w:t>附录 A　代码仓库</w:t>
+      </w:r>
+      <w:r>
+        <w:fldChar w:fldCharType="end" w:fldLock="0" w:dirty="0"/>
+      </w:r>
+      <w:r>
+        <w:tab/>
+      </w:r>
+      <w:r>
+        <w:fldChar w:fldCharType="begin" w:fldLock="0" w:dirty="0"/>
+      </w:r>
+      <w:r>
+        <w:instrText xml:space="preserve"> PAGEREF section-10-1 \h </w:instrText>
+      </w:r>
+      <w:r>
+        <w:fldChar w:fldCharType="separate" w:fldLock="0" w:dirty="0"/>
+      </w:r>
+      <w:r>
+        <w:t>1</w:t>
+      </w:r>
+      <w:r>
+        <w:fldChar w:fldCharType="end" w:fldLock="0" w:dirty="0"/>
+      </w:r>
+    </w:p>
+    <w:p>
+      <w:pPr>
+        <w:pStyle w:val="000004"/>
+        <w:tabs>
+          <w:tab w:val="right" w:leader="dot" w:pos="9072"/>
+        </w:tabs>
+        <w:ind w:left="200"/>
+      </w:pPr>
+      <w:r>
+        <w:fldChar w:fldCharType="begin" w:fldLock="0" w:dirty="0"/>
+      </w:r>
+      <w:r>
+        <w:instrText xml:space="preserve"> HYPERLINK \l "section-10-2" </w:instrText>
+      </w:r>
+      <w:r>
+        <w:fldChar w:fldCharType="separate" w:fldLock="0" w:dirty="0"/>
+      </w:r>
+      <w:r>
+        <w:rPr>
+          <w:rFonts w:hint="eastAsia"/>
+        </w:rPr>
+        <w:t>附录 B　复现说明</w:t>
+      </w:r>
+      <w:r>
+        <w:fldChar w:fldCharType="end" w:fldLock="0" w:dirty="0"/>
+      </w:r>
+      <w:r>
+        <w:tab/>
+      </w:r>
+      <w:r>
+        <w:fldChar w:fldCharType="begin" w:fldLock="0" w:dirty="0"/>
+      </w:r>
+      <w:r>
+        <w:instrText xml:space="preserve"> PAGEREF section-10-2 \h </w:instrText>
+      </w:r>
+      <w:r>
+        <w:fldChar w:fldCharType="separate" w:fldLock="0" w:dirty="0"/>
+      </w:r>
+      <w:r>
+        <w:t>1</w:t>
+      </w:r>
+      <w:r>
+        <w:fldChar w:fldCharType="end" w:fldLock="0" w:dirty="0"/>
+      </w:r>
+    </w:p>
+    <w:p>
+      <w:pPr>
+        <w:pStyle w:val="000004"/>
+        <w:tabs>
+          <w:tab w:val="right" w:leader="dot" w:pos="9072"/>
+        </w:tabs>
+        <w:ind w:left="200"/>
+      </w:pPr>
+      <w:r>
+        <w:fldChar w:fldCharType="begin" w:fldLock="0" w:dirty="0"/>
+      </w:r>
+      <w:r>
+        <w:instrText xml:space="preserve"> HYPERLINK \l "section-10-3" </w:instrText>
+      </w:r>
+      <w:r>
+        <w:fldChar w:fldCharType="separate" w:fldLock="0" w:dirty="0"/>
+      </w:r>
+      <w:r>
+        <w:rPr>
+          <w:rFonts w:hint="eastAsia"/>
+        </w:rPr>
+        <w:t>附录 C　主要代码片段</w:t>
+      </w:r>
+      <w:r>
+        <w:fldChar w:fldCharType="end" w:fldLock="0" w:dirty="0"/>
+      </w:r>
+      <w:r>
+        <w:tab/>
+      </w:r>
+      <w:r>
+        <w:fldChar w:fldCharType="begin" w:fldLock="0" w:dirty="0"/>
+      </w:r>
+      <w:r>
+        <w:instrText xml:space="preserve"> PAGEREF section-10-3 \h </w:instrText>
       </w:r>
       <w:r>
         <w:fldChar w:fldCharType="separate" w:fldLock="0" w:dirty="0"/>
@@ -1564,7 +1834,58 @@
           <w:color w:val="1f2430"/>
           <w:sz w:val="24"/>
         </w:rPr>
-        <w:t>电力负荷的短期预测是电网调度的基础输入。本项目以某城市 2017 年全年的电力负荷监测数据为对象，包含三个计量区域的负荷与温度、湿度、风速等气象观测，10 分钟采样、52,416 条记录、全年无缺失。研究按"清洗 → 探索性分析 → 建模预测 → 误差归因"的流程展开：探索性分析发现三个区域共享"凌晨低谷—午间平台—晚间高峰"的日周期结构（峰谷比 1.89–2.23），温度是唯一在三区稳定正相关的气象因子；预测任务定义为提前 1 小时（6 个采样步），按时间顺序 70%/15%/15% 划分数据，比较历史同期基线、线性回归与梯度提升树三种模型，并以特征消融检验天气信息的增益。测试集结果显示：三区域合并口径下历史同期基线的 MAE/RMSE 最低（1050.68/1643.67），两个学习模型整体不敌基线，主因是日周期极强且测试期负荷水平较训练期下移；天气特征在六个模型×区域组合中的五个降低误差（最多 −34.6%），增益排序与温度相关性排序一致；高峰时段误差约为普通时段的 2.5 倍且系统性低估峰值。基于上述结果，给出了短期调度中基线兜底、高峰留裕度等建议。</w:t>
+        <w:t>电力负荷的短期预测是电网调度的基础输入。本项目以某城市 2017 年 1 月 1 日至 12 月 30 日的电力负荷监测数据为对象（共 364 天、52,416 条记录、10 分钟采样、已记录时段内无缺失），包含三个计量区域的负荷与温度、湿度、风速等气象观测。研究按"清洗 → 探索性分析 → 建模预测 → 误差归因"的流程展开：探索性分析发现三个区域共享"凌晨低谷—午间平台—晚间高峰"的日周期结构（峰谷比 1.89–2.23），温度是唯一在三区稳定正相关的气象因子；预测任务定义为提前 1 小时（6 个采样步），按时间顺序 70%/15%/15% 划分数据（并对子集边界做 purge 处理），比较历史同期基线、线性回归与梯度提升树三种模型，并以特征消融检验天气信息的增益。</w:t>
+      </w:r>
+    </w:p>
+    <w:p>
+      <w:pPr>
+        <w:spacing w:before="120" w:after="120" w:line="432"/>
+        <w:ind w:left="120" w:right="120" w:firstLine="480"/>
+        <w:rPr>
+          <w:color w:val="1f2430"/>
+        </w:rPr>
+      </w:pPr>
+      <w:r>
+        <w:rPr>
+          <w:rFonts w:hint="eastAsia" w:ascii="SimSun" w:hAnsi="SimSun" w:eastAsia="SimSun" w:cs="SimSun"/>
+          <w:color w:val="1f2430"/>
+          <w:sz w:val="24"/>
+        </w:rPr>
+        <w:t>测试集结果显示：</w:t>
+      </w:r>
+      <w:r>
+        <w:rPr>
+          <w:rFonts w:hint="eastAsia" w:ascii="SimSun" w:hAnsi="SimSun" w:eastAsia="SimSun" w:cs="SimSun"/>
+          <w:b w:val="1"/>
+          <w:color w:val="1f2430"/>
+          <w:sz w:val="24"/>
+        </w:rPr>
+        <w:t>在最初的特征集下，历史同期基线最优</w:t>
+      </w:r>
+      <w:r>
+        <w:rPr>
+          <w:rFonts w:hint="eastAsia" w:ascii="SimSun" w:hAnsi="SimSun" w:eastAsia="SimSun" w:cs="SimSun"/>
+          <w:color w:val="1f2430"/>
+          <w:sz w:val="24"/>
+        </w:rPr>
+        <w:t>（三区合并 MAE/RMSE 1050.68/1643.67），两个学习模型均不敌基线。进一步的归因实验给出了原因——不是模型不合适，而是特征集缺少与预测目标对齐的周同期值：基线用的是 y(t−1002)，而学习模型只拿到 y(t−1008)，比目标时刻早一小时。补上这一特征后，线性回归的合并 MAE/RMSE 降至 514.09/767.16（相对基线 −51.1%/−53.3%），梯度提升树降至 930.62/1258.73（−11.4%/−23.4%），</w:t>
+      </w:r>
+      <w:r>
+        <w:rPr>
+          <w:rFonts w:hint="eastAsia" w:ascii="SimSun" w:hAnsi="SimSun" w:eastAsia="SimSun" w:cs="SimSun"/>
+          <w:b w:val="1"/>
+          <w:color w:val="1f2430"/>
+          <w:sz w:val="24"/>
+        </w:rPr>
+        <w:t>两个学习模型转为全面优于基线</w:t>
+      </w:r>
+      <w:r>
+        <w:rPr>
+          <w:rFonts w:hint="eastAsia" w:ascii="SimSun" w:hAnsi="SimSun" w:eastAsia="SimSun" w:cs="SimSun"/>
+          <w:color w:val="1f2430"/>
+          <w:sz w:val="24"/>
+        </w:rPr>
+        <w:t>。天气特征消融在新特征集上重做：六个组合中三个误差下降，梯度提升树三个区域全部下降（−0.4% 至 −17.9%），线性回归在区域 2、3 略升（+5.1%、+1.0%）。高峰时段误差仍约为普通时段的 2.1 倍且系统性低估峰值。基于上述结果，给出了短期调度中优先使用带周同期特征的线性模型、高峰留裕度等建议。</w:t>
       </w:r>
     </w:p>
     <w:p>
@@ -1597,7 +1918,7 @@
           <w:color w:val="1f2430"/>
           <w:sz w:val="24"/>
         </w:rPr>
-        <w:t>电力负荷预测；时间序列；特征消融；历史同期基线；梯度提升树</w:t>
+        <w:t>** 电力负荷预测；时间序列；特征消融；历史同期基线；梯度提升树</w:t>
       </w:r>
     </w:p>
     <w:p>
@@ -1725,7 +2046,24 @@
           <w:color w:val="1f2430"/>
           <w:sz w:val="24"/>
         </w:rPr>
-        <w:t>本项目使用课程提供的城市电力负荷监测数据，文件为单个 CSV，共 52,416 条记录、9 个字段，覆盖 2017 年 1 月 1 日 0 时至 12 月 30 日 23 时 50 分，采样间隔 10 分钟，全年无中断。</w:t>
+        <w:t>（本章取自 report_draft_A.md 第 2 章，数字对应 EXP-20261020-04 及 data_audit.md。）</w:t>
+      </w:r>
+    </w:p>
+    <w:p>
+      <w:pPr>
+        <w:spacing w:before="120" w:after="120" w:line="432"/>
+        <w:ind w:left="120" w:right="120" w:firstLine="480"/>
+        <w:rPr>
+          <w:color w:val="1f2430"/>
+        </w:rPr>
+      </w:pPr>
+      <w:r>
+        <w:rPr>
+          <w:rFonts w:hint="eastAsia" w:ascii="SimSun" w:hAnsi="SimSun" w:eastAsia="SimSun" w:cs="SimSun"/>
+          <w:color w:val="1f2430"/>
+          <w:sz w:val="24"/>
+        </w:rPr>
+        <w:t>本项目使用课程提供的城市电力负荷监测数据，文件为单个 CSV，共 52,416 条记录、9 个字段，覆盖 2017 年 1 月 1 日 0 时至 12 月 30 日 23 时 50 分，采样间隔 10 分钟，已记录时段内无中断（数据止于 12 月 30 日，共 364 天，缺 12 月 31 日）。</w:t>
       </w:r>
     </w:p>
     <w:p>
@@ -4951,7 +5289,7 @@
           <w:color w:val="4b5563"/>
           <w:sz w:val="19"/>
         </w:rPr>
-        <w:t>注：统计范围为 2017 年全年 52,416 条记录。温度与湿度按数值量纲判断为 ℃ 和 %；风速、两项辐射量与负荷的单位原始数据未注明，本表不做推断。</w:t>
+        <w:t>注：统计范围为 2017 年 1 月 1 日至 12 月 30 日共 364 天的 52,416 条记录。温度与湿度按数值量纲判断为 ℃ 和 %；风速、两项辐射量与负荷的单位原始数据未注明，本表不做推断。</w:t>
       </w:r>
     </w:p>
     <w:p>
@@ -4983,6 +5321,23 @@
     </w:p>
     <w:p>
       <w:pPr>
+        <w:spacing w:before="120" w:after="120" w:line="432"/>
+        <w:ind w:left="120" w:right="120" w:firstLine="480"/>
+        <w:rPr>
+          <w:color w:val="1f2430"/>
+        </w:rPr>
+      </w:pPr>
+      <w:r>
+        <w:rPr>
+          <w:rFonts w:hint="eastAsia" w:ascii="SimSun" w:hAnsi="SimSun" w:eastAsia="SimSun" w:cs="SimSun"/>
+          <w:color w:val="1f2430"/>
+          <w:sz w:val="24"/>
+        </w:rPr>
+        <w:t>（本章取自 report_draft_A.md 第 3 章，对应 A1/A2 交付。）</w:t>
+      </w:r>
+    </w:p>
+    <w:p>
+      <w:pPr>
         <w:pStyle w:val="000006"/>
         <w:keepNext w:val="1"/>
         <w:keepLines w:val="1"/>
@@ -5141,7 +5496,24 @@
           <w:color w:val="1f2430"/>
           <w:sz w:val="24"/>
         </w:rPr>
-        <w:t>对这些点逐类核对后，决定只标记、不删除、不替换。diffuse_flows 的极端点集中在 9 时至 16 时以及 2 月和 5 月，正是日照最强的时段和月份，反映的是气象变量的真实波动，删除会削掉白天的信息；zone3_power 的 18 个点集中在 7 月的 19 时至 20 时，对应夏季晚高峰，属于业务上需要重点关注的时段，尤其不能删。清洗阶段另有一项判断：负荷出现负值应视为错误，检查结果为 0 条。标记结果单独写入 anomaly_flags.csv，仅用于说明，不作为模型输入。</w:t>
+        <w:t>对这些点逐类核对后，决定</w:t>
+      </w:r>
+      <w:r>
+        <w:rPr>
+          <w:rFonts w:hint="eastAsia" w:ascii="SimSun" w:hAnsi="SimSun" w:eastAsia="SimSun" w:cs="SimSun"/>
+          <w:b w:val="1"/>
+          <w:color w:val="1f2430"/>
+          <w:sz w:val="24"/>
+        </w:rPr>
+        <w:t>只标记、不删除、不替换</w:t>
+      </w:r>
+      <w:r>
+        <w:rPr>
+          <w:rFonts w:hint="eastAsia" w:ascii="SimSun" w:hAnsi="SimSun" w:eastAsia="SimSun" w:cs="SimSun"/>
+          <w:color w:val="1f2430"/>
+          <w:sz w:val="24"/>
+        </w:rPr>
+        <w:t>。diffuse_flows 的极端点集中在 9 时至 16 时以及 2 月和 5 月，正是日照最强的时段和月份，反映的是气象变量的真实波动，删除会削掉白天的信息；zone3_power 的 18 个点集中在 7 月的 19 时至 20 时，对应夏季晚高峰，属于业务上需要重点关注的时段，尤其不能删。清洗阶段另有一项判断：负荷出现负值应视为错误，检查结果为 0 条。标记结果单独写入 anomaly_flags.csv，仅用于说明，不作为模型输入。</w:t>
       </w:r>
     </w:p>
     <w:p>
@@ -5184,7 +5556,7 @@
           <w:color w:val="1f2430"/>
           <w:sz w:val="24"/>
         </w:rPr>
-        <w:t>清洗后的数据固定输出 9 列，行按时间升序排列、索引重置，写入 data/processed/power_load_clean.csv，列名与类型在项目接口文档中固定下来。后续的特征工程、模型训练和误差分析统一从这个文件读取，避免各人按不同假设重复读取原始数据。清洗结果的质量指标汇总在表 2。</w:t>
+        <w:t>清洗后的数据固定输出 9 列，行按时间升序排列、索引重置，写入 data/processed/power_load_clean.csv，列名与类型在 docs/data_interface.md 中固定下来。后续的特征工程、模型训练和误差分析统一从这个文件读取，避免各人按不同假设重复读取原始数据。清洗结果的质量指标汇总在表 2。</w:t>
       </w:r>
     </w:p>
     <w:p>
@@ -6968,6 +7340,23 @@
     </w:p>
     <w:p>
       <w:pPr>
+        <w:spacing w:before="120" w:after="120" w:line="432"/>
+        <w:ind w:left="120" w:right="120" w:firstLine="480"/>
+        <w:rPr>
+          <w:color w:val="1f2430"/>
+        </w:rPr>
+      </w:pPr>
+      <w:r>
+        <w:rPr>
+          <w:rFonts w:hint="eastAsia" w:ascii="SimSun" w:hAnsi="SimSun" w:eastAsia="SimSun" w:cs="SimSun"/>
+          <w:color w:val="1f2430"/>
+          <w:sz w:val="24"/>
+        </w:rPr>
+        <w:t>（本章取自 report_draft_A.md 第 4 章，对应图 1–4 与 eda_findings.md。）</w:t>
+      </w:r>
+    </w:p>
+    <w:p>
+      <w:pPr>
         <w:pStyle w:val="000006"/>
         <w:keepNext w:val="1"/>
         <w:keepLines w:val="1"/>
@@ -6988,7 +7377,7 @@
           <w:color w:val="1f2430"/>
           <w:sz w:val="28"/>
         </w:rPr>
-        <w:t>4.1　全年走势</w:t>
+        <w:t>4.1　年内走势</w:t>
       </w:r>
       <w:bookmarkEnd w:id="10"/>
     </w:p>
@@ -7006,7 +7395,7 @@
           <w:color w:val="1f2430"/>
           <w:sz w:val="24"/>
         </w:rPr>
-        <w:t>三个区域的负荷水平差距明显。全年日均值分别为 32,345、21,043 和 17,835，区域 1 约为区域 3 的 1.8 倍，且这一量级关系全年稳定（图 1）。季节形态则三个区各不相同：区域 1 最平缓，最高月比最低月高约两成半；区域 2 在 7、8 月形成夏季峰，11、12 月又出现一个高于春季的次高峰；区域 3 起伏最剧烈，7 月达到 28,200，12 月降至 11,000，最高月是最低月的 2.6 倍。按季节平均，区域 3 夏季负荷是冬季的 1.59 倍，区域 1 和区域 2 分别只有 1.17 和 1.12 倍。</w:t>
+        <w:t>三个区域的负荷水平差距明显。年内日均值分别为 32,345、21,043 和 17,835，区域 1 约为区域 3 的 1.8 倍，且这一量级关系在年内稳定（图 1）。季节形态则三个区各不相同：区域 1 最平缓，最高月比最低月高约两成半；区域 2 在 7、8 月形成夏季峰，11、12 月又出现一个高于春季的次高峰；区域 3 起伏最剧烈，7 月达到 28,200，12 月降至 11,000，最高月是最低月的 2.6 倍。按季节平均，区域 3 夏季负荷是冬季的 1.59 倍，区域 1 和区域 2 分别只有 1.17 和 1.12 倍。</w:t>
       </w:r>
     </w:p>
     <w:p>
@@ -7243,7 +7632,7 @@
           <w:color w:val="4b5563"/>
           <w:sz w:val="19"/>
         </w:rPr>
-        <w:t>2017 年全年观测按小时取均值，实线为工作日，虚线为周末；三个子图的纵轴范围各自独立，不宜直接比较幅度。</w:t>
+        <w:t>已记录时段内观测按小时取均值，实线为工作日，虚线为周末；三个子图的纵轴范围各自独立，不宜直接比较幅度。</w:t>
       </w:r>
     </w:p>
     <w:p>
@@ -7366,7 +7755,7 @@
           <w:color w:val="4b5563"/>
           <w:sz w:val="19"/>
         </w:rPr>
-        <w:t>2017 年全年观测按星期取均值；三个子图纵轴范围独立，跨区域比较请参见第 4.5 节汇总表。</w:t>
+        <w:t>已记录时段内观测按星期取均值；三个子图纵轴范围独立，跨区域比较请参见第 4.5 节汇总表。</w:t>
       </w:r>
     </w:p>
     <w:p>
@@ -7489,7 +7878,7 @@
           <w:color w:val="4b5563"/>
           <w:sz w:val="19"/>
         </w:rPr>
-        <w:t>2017 年全年 10 分钟观测按月份绘制的箱线图，箱体为四分位区间，横线为中位数，须线延伸至 1.5 倍四分位距，离群点已隐去；三个子图纵轴范围独立。</w:t>
+        <w:t>已记录时段内 10 分钟观测按月份绘制的箱线图，箱体为四分位区间，横线为中位数，须线延伸至 1.5 倍四分位距，离群点已隐去；三个子图纵轴范围独立。</w:t>
       </w:r>
     </w:p>
     <w:p>
@@ -7517,23 +7906,6 @@
         <w:t>4.5　分区对比</w:t>
       </w:r>
       <w:bookmarkEnd w:id="14"/>
-    </w:p>
-    <w:p>
-      <w:pPr>
-        <w:spacing w:before="120" w:after="120" w:line="432"/>
-        <w:ind w:left="120" w:right="120" w:firstLine="480"/>
-        <w:rPr>
-          <w:color w:val="1f2430"/>
-        </w:rPr>
-      </w:pPr>
-      <w:r>
-        <w:rPr>
-          <w:rFonts w:hint="eastAsia" w:ascii="SimSun" w:hAnsi="SimSun" w:eastAsia="SimSun" w:cs="SimSun"/>
-          <w:color w:val="1f2430"/>
-          <w:sz w:val="24"/>
-        </w:rPr>
-        <w:t>三个区共享同一套时间结构，差别集中在幅度上。</w:t>
-      </w:r>
     </w:p>
     <w:tbl>
       <w:tblPr>
@@ -7742,7 +8114,7 @@
                 <w:color w:val="1f2430"/>
                 <w:sz w:val="21"/>
               </w:rPr>
-              <w:t>全年日均</w:t>
+              <w:t>年内日均</w:t>
             </w:r>
           </w:p>
         </w:tc>
@@ -8426,7 +8798,7 @@
           <w:color w:val="1f2430"/>
           <w:sz w:val="24"/>
         </w:rPr>
-        <w:t>区域 1 量级最大、曲线最平稳；区域 2 星期效应最强且冬季有次高峰；区域 3 量级最小，季节性和日内波动都最强。建模时应当区别对待，而不是对三个区套用同一组特征。</w:t>
+        <w:t>三个区共享同一套时间结构，差别集中在幅度上：区域 1 量级最大、曲线最平稳；区域 2 星期效应最强且冬季有次高峰；区域 3 量级最小，季节性和日内波动都最强。建模时应当区别对待，而不是对三个区套用同一组特征。</w:t>
       </w:r>
     </w:p>
     <w:p>
@@ -8458,6 +8830,23 @@
     </w:p>
     <w:p>
       <w:pPr>
+        <w:spacing w:before="120" w:after="120" w:line="432"/>
+        <w:ind w:left="120" w:right="120" w:firstLine="480"/>
+        <w:rPr>
+          <w:color w:val="1f2430"/>
+        </w:rPr>
+      </w:pPr>
+      <w:r>
+        <w:rPr>
+          <w:rFonts w:hint="eastAsia" w:ascii="SimSun" w:hAnsi="SimSun" w:eastAsia="SimSun" w:cs="SimSun"/>
+          <w:color w:val="1f2430"/>
+          <w:sz w:val="24"/>
+        </w:rPr>
+        <w:t>（本章取自 report_draft_A.md 第 5 章，对应图 5–6 与 weather_findings.md。）</w:t>
+      </w:r>
+    </w:p>
+    <w:p>
+      <w:pPr>
         <w:pStyle w:val="000006"/>
         <w:keepNext w:val="1"/>
         <w:keepLines w:val="1"/>
@@ -8496,7 +8885,7 @@
           <w:color w:val="1f2430"/>
           <w:sz w:val="24"/>
         </w:rPr>
-        <w:t>三个区域的负荷与五个气象因子的相关系数见图 5 与下表（括号外为 Pearson 线性相关，括号内为 Spearman 秩相关）。</w:t>
+        <w:t>三个区域的负荷与五个气象因子的相关系数见图 5 与下表（括号外 Pearson，括号内 Spearman）。</w:t>
       </w:r>
     </w:p>
     <w:tbl>
@@ -9464,7 +9853,7 @@
           <w:color w:val="4b5563"/>
           <w:sz w:val="19"/>
         </w:rPr>
-        <w:t>2017 年全年 52,416 条观测计算的 Pearson 相关系数；色标固定为 −1 至 1，对角线为变量自身相关，数值恒为 1。</w:t>
+        <w:t>已记录时段内 52,416 条观测计算的 Pearson 相关系数；色标固定为 −1 至 1，对角线为变量自身相关，数值恒为 1。</w:t>
       </w:r>
     </w:p>
     <w:p>
@@ -9507,7 +9896,24 @@
           <w:color w:val="1f2430"/>
           <w:sz w:val="24"/>
         </w:rPr>
-        <w:t>分箱均值显示（图 6）：6 ℃ 至 33 ℃ 区间负荷随温度单调上升，33 ℃ 以上进入平台。温度从 6.5 ℃ 升到 33.5 ℃ 时，区域 1、2 的分箱均值各上升 69%，区域 3 上升 158%，与它夏冬比 1.59、峰谷比 2.23 的结论一致。数据中没有观察到典型的 U 形：3 ℃ 至 5 ℃ 的负荷并不高于 20 ℃ 附近，说明这三个区域的用电对低温不敏感，温度特征在冬季的作用有限。</w:t>
+        <w:t>分箱均值显示（图 6）：6 ℃ 至 33 ℃ 区间负荷随温度单调上升，33 ℃ 以上进入平台。温度从 6.5 ℃ 升到 33.5 ℃ 时，区域 1、2 的分箱均值各上升 69%，区域 3 上升 158%，与它夏冬比 1.59、峰谷比 2.23 的结论一致。数据中</w:t>
+      </w:r>
+      <w:r>
+        <w:rPr>
+          <w:rFonts w:hint="eastAsia" w:ascii="SimSun" w:hAnsi="SimSun" w:eastAsia="SimSun" w:cs="SimSun"/>
+          <w:b w:val="1"/>
+          <w:color w:val="1f2430"/>
+          <w:sz w:val="24"/>
+        </w:rPr>
+        <w:t>没有观察到典型的 U 形</w:t>
+      </w:r>
+      <w:r>
+        <w:rPr>
+          <w:rFonts w:hint="eastAsia" w:ascii="SimSun" w:hAnsi="SimSun" w:eastAsia="SimSun" w:cs="SimSun"/>
+          <w:color w:val="1f2430"/>
+          <w:sz w:val="24"/>
+        </w:rPr>
+        <w:t>：3 ℃ 至 5 ℃ 的负荷并不高于 20 ℃ 附近，说明这三个区域的用电对低温不敏感，温度特征在冬季的作用有限。</w:t>
       </w:r>
     </w:p>
     <w:p>
@@ -9587,7 +9993,7 @@
           <w:color w:val="4b5563"/>
           <w:sz w:val="19"/>
         </w:rPr>
-        <w:t>灰点为从全年观测中随机抽样的 8,000 条记录，折线为按 1 ℃ 分箱后的负荷均值，仅保留样本量不少于 50 的区间；三个子图纵轴范围独立。</w:t>
+        <w:t>灰点为从已记录时段观测中随机抽样的 8,000 条记录，折线为按 1 ℃ 分箱后的负荷均值，仅保留样本量不少于 50 的区间；三个子图纵轴范围独立。</w:t>
       </w:r>
     </w:p>
     <w:p>
@@ -9630,7 +10036,7 @@
           <w:color w:val="1f2430"/>
           <w:sz w:val="24"/>
         </w:rPr>
-        <w:t>第 6 章的消融实验显示，线性回归加入天气特征后，区域 3 的测试集 RMSE 下降 34.6%，是三个区里降幅最大的；区域 2 只下降 4.1%。这一排序与本节的相关性排序一致：温度相关性最高的区域，天气特征带来的收益也最大。两条独立证据互相印证。</w:t>
+        <w:t>第 6 章的消融实验显示，在原始特征集上，线性回归加入天气特征后区域 3 的测试集 RMSE 下降 34.6%，是三个区里降幅最大的；区域 2 只下降 4.1%。这一排序与本节的相关性排序一致：温度相关性最高的区域，天气特征带来的收益也最大。两条独立证据互相印证。需要说明的是，这一增益是在模型尚未获得目标对齐周同期特征时测得的；补上该特征后天气的边际增益明显缩小（详见 6.5），本节的结论应理解为"温度与负荷的统计关联确实存在"，而非"天气特征在任何特征集下都有同等增益"。</w:t>
       </w:r>
     </w:p>
     <w:p>
@@ -9655,7 +10061,7 @@
           <w:color w:val="1f2430"/>
           <w:sz w:val="28"/>
         </w:rPr>
-        <w:t>5.4　本节结论的局限</w:t>
+        <w:t>5.4　局限</w:t>
       </w:r>
       <w:bookmarkEnd w:id="19"/>
     </w:p>
@@ -9679,7 +10085,7 @@
           <w:color w:val="1f2430"/>
           <w:sz w:val="24"/>
         </w:rPr>
-        <w:t>以上只描述统计共变，不构成因果判断。未对节假日建模，未区分昼夜，相关系数未做去趋势处理（全年负荷下移会使系数略微偏低）。</w:t>
+        <w:t>以上只描述统计共变，不构成因果判断。未对节假日建模，未区分昼夜，相关系数未做去趋势处理（年内负荷下移会使系数略微偏低）。</w:t>
       </w:r>
     </w:p>
     <w:p>
@@ -9749,7 +10155,50 @@
           <w:color w:val="1f2430"/>
           <w:sz w:val="24"/>
         </w:rPr>
-        <w:t>预测任务定义为提前 1 小时预测：对预测起点 t，目标是其后第 6 个时间步（t+6）的负荷。三个区域分别建样本、分别训练、分别评价。数据按预测起点的时间顺序划分为训练/验证/测试三部分，比例 70%/15%/15%，实际边界为：训练集至 2017-09-14 20:40（35,981 个起点），验证集至 11-07 09:40（7,710 个），测试集至 12-30 22:50（7,711 个），三区域共用同一套切分。</w:t>
+        <w:t>预测任务定义为</w:t>
+      </w:r>
+      <w:r>
+        <w:rPr>
+          <w:rFonts w:hint="eastAsia" w:ascii="SimSun" w:hAnsi="SimSun" w:eastAsia="SimSun" w:cs="SimSun"/>
+          <w:b w:val="1"/>
+          <w:color w:val="1f2430"/>
+          <w:sz w:val="24"/>
+        </w:rPr>
+        <w:t>提前 1 小时</w:t>
+      </w:r>
+      <w:r>
+        <w:rPr>
+          <w:rFonts w:hint="eastAsia" w:ascii="SimSun" w:hAnsi="SimSun" w:eastAsia="SimSun" w:cs="SimSun"/>
+          <w:color w:val="1f2430"/>
+          <w:sz w:val="24"/>
+        </w:rPr>
+        <w:t>预测：对预测起点 t，目标是其后第 6 个时间步（t+6）的负荷。三个区域分别建样本、分别训练、分别评价。数据按预测起点的时间顺序划分为训练/验证/测试三部分，比例 70%/15%/15%，实际边界为：训练集至 2017-09-14 19:40（35,975 个起点），验证集至 11-07 08:40（7,704 个），测试集至 12-30 22:50（7,711 个），三区域共用同一套切分。</w:t>
+      </w:r>
+    </w:p>
+    <w:p>
+      <w:pPr>
+        <w:spacing w:before="120" w:after="120" w:line="432"/>
+        <w:ind w:left="120" w:right="120" w:firstLine="480"/>
+        <w:rPr>
+          <w:color w:val="1f2430"/>
+        </w:rPr>
+      </w:pPr>
+      <w:r>
+        <w:rPr>
+          <w:rFonts w:hint="eastAsia" w:ascii="SimSun" w:hAnsi="SimSun" w:eastAsia="SimSun" w:cs="SimSun"/>
+          <w:b w:val="1"/>
+          <w:color w:val="1f2430"/>
+          <w:sz w:val="24"/>
+        </w:rPr>
+        <w:t>边界 purge。</w:t>
+      </w:r>
+      <w:r>
+        <w:rPr>
+          <w:rFonts w:hint="eastAsia" w:ascii="SimSun" w:hAnsi="SimSun" w:eastAsia="SimSun" w:cs="SimSun"/>
+          <w:color w:val="1f2430"/>
+          <w:sz w:val="24"/>
+        </w:rPr>
+        <w:t xml:space="preserve"> 目标在起点之后一小时，如果只按起点切分，子集末尾若干起点的标签时刻会落到下一个子集的起点区间内——训练集末尾的标签会被验证集"看到"，验证集末尾同理。为此训练集与验证集末尾各剔除 6 个起点（共 12 个样本不进入任何子集）。剔除后：训练末起点的目标时刻（09-14 20:40）早于验证集首起点（09-14 20:50），验证末起点的目标时刻（11-07 09:40）早于测试集首起点（11-07 09:50），任一子集的标签区间与下一子集的起点区间不再重叠。该断言已写入 verify_against_plan() 与自动化检查。测试集区间不受影响，历史同期基线的指标与剔除前完全一致。</w:t>
       </w:r>
     </w:p>
     <w:p>
@@ -9809,7 +10258,7 @@
           <w:color w:val="1f2430"/>
           <w:sz w:val="24"/>
         </w:rPr>
-        <w:t>特征分三组。历史负荷组：当前负荷、1 小时前、24 小时前同期、7 天前同期；时间组：小时、星期、月份及其周期编码；天气组：起点时刻的温度、湿度、风速与两项辐射。历史同期基线不消费特征，直接取目标时刻的上一周同期值 y(t+6−1008)。</w:t>
+        <w:t>特征分三组。历史负荷组：当前负荷、1 小时前、24 小时前同期、7 天前同期（load_lag_0/6/144/1008）；时间组：小时、星期、月份及其周期编码；天气组：起点时刻的温度、湿度、风速与两项辐射。历史同期基线不消费特征，直接取目标时刻的上一周同期值 y(t+6−1008)。</w:t>
       </w:r>
     </w:p>
     <w:p>
@@ -9826,7 +10275,135 @@
           <w:color w:val="1f2430"/>
           <w:sz w:val="24"/>
         </w:rPr>
-        <w:t>三个模型：历史同期基线（无训练、无超参）；线性回归（标准化 + 最小二乘，无超参）；梯度提升树（scikit-learn HistGradientBoostingRegressor，在验证集上对小规模参数网格选优，随机种子 42）。评价指标为 MAE 与 RMSE，按（模型 × 区域）在测试集上分别计算。</w:t>
+        <w:t>这里埋着一个容易被忽略的口径差异：基线取的是 y(t−1002)，即</w:t>
+      </w:r>
+      <w:r>
+        <w:rPr>
+          <w:rFonts w:hint="eastAsia" w:ascii="SimSun" w:hAnsi="SimSun" w:eastAsia="SimSun" w:cs="SimSun"/>
+          <w:b w:val="1"/>
+          <w:color w:val="1f2430"/>
+          <w:sz w:val="24"/>
+        </w:rPr>
+        <w:t>目标时刻</w:t>
+      </w:r>
+      <w:r>
+        <w:rPr>
+          <w:rFonts w:hint="eastAsia" w:ascii="SimSun" w:hAnsi="SimSun" w:eastAsia="SimSun" w:cs="SimSun"/>
+          <w:color w:val="1f2430"/>
+          <w:sz w:val="24"/>
+        </w:rPr>
+        <w:t>往前一周；而特征组里的 load_lag_1008 是起点往前一周，比目标时刻再早一小时。两个学习模型因此没有直接拿到基线所使用的那条记录。6.4 节专门检验这一点，并在 6.5 节之后改用修正后的特征集。</w:t>
+      </w:r>
+    </w:p>
+    <w:p>
+      <w:pPr>
+        <w:spacing w:before="120" w:after="120" w:line="432"/>
+        <w:ind w:left="120" w:right="120" w:firstLine="480"/>
+        <w:rPr>
+          <w:color w:val="1f2430"/>
+        </w:rPr>
+      </w:pPr>
+      <w:r>
+        <w:rPr>
+          <w:rFonts w:hint="eastAsia" w:ascii="SimSun" w:hAnsi="SimSun" w:eastAsia="SimSun" w:cs="SimSun"/>
+          <w:color w:val="1f2430"/>
+          <w:sz w:val="24"/>
+        </w:rPr>
+        <w:t>三个模型：</w:t>
+      </w:r>
+      <w:r>
+        <w:rPr>
+          <w:rFonts w:hint="eastAsia" w:ascii="SimSun" w:hAnsi="SimSun" w:eastAsia="SimSun" w:cs="SimSun"/>
+          <w:b w:val="1"/>
+          <w:color w:val="1f2430"/>
+          <w:sz w:val="24"/>
+        </w:rPr>
+        <w:t>历史同期基线</w:t>
+      </w:r>
+      <w:r>
+        <w:rPr>
+          <w:rFonts w:hint="eastAsia" w:ascii="SimSun" w:hAnsi="SimSun" w:eastAsia="SimSun" w:cs="SimSun"/>
+          <w:color w:val="1f2430"/>
+          <w:sz w:val="24"/>
+        </w:rPr>
+        <w:t>（无训练、无超参）；</w:t>
+      </w:r>
+      <w:r>
+        <w:rPr>
+          <w:rFonts w:hint="eastAsia" w:ascii="SimSun" w:hAnsi="SimSun" w:eastAsia="SimSun" w:cs="SimSun"/>
+          <w:b w:val="1"/>
+          <w:color w:val="1f2430"/>
+          <w:sz w:val="24"/>
+        </w:rPr>
+        <w:t>线性回归</w:t>
+      </w:r>
+      <w:r>
+        <w:rPr>
+          <w:rFonts w:hint="eastAsia" w:ascii="SimSun" w:hAnsi="SimSun" w:eastAsia="SimSun" w:cs="SimSun"/>
+          <w:color w:val="1f2430"/>
+          <w:sz w:val="24"/>
+        </w:rPr>
+        <w:t>（标准化 + 最小二乘，无超参）；</w:t>
+      </w:r>
+      <w:r>
+        <w:rPr>
+          <w:rFonts w:hint="eastAsia" w:ascii="SimSun" w:hAnsi="SimSun" w:eastAsia="SimSun" w:cs="SimSun"/>
+          <w:b w:val="1"/>
+          <w:color w:val="1f2430"/>
+          <w:sz w:val="24"/>
+        </w:rPr>
+        <w:t>梯度提升树</w:t>
+      </w:r>
+      <w:r>
+        <w:rPr>
+          <w:rFonts w:hint="eastAsia" w:ascii="SimSun" w:hAnsi="SimSun" w:eastAsia="SimSun" w:cs="SimSun"/>
+          <w:color w:val="1f2430"/>
+          <w:sz w:val="24"/>
+        </w:rPr>
+        <w:t>（scikit-learn HistGradientBoostingRegressor，在验证集上对小规模参数网格选优，随机种子 42）。评价指标为 MAE / RMSE / MSE，按（模型 × 区域）在测试集上分别计算，并给出三区合并口径。</w:t>
+      </w:r>
+    </w:p>
+    <w:p>
+      <w:pPr>
+        <w:spacing w:before="120" w:after="120" w:line="432"/>
+        <w:ind w:left="120" w:right="120" w:firstLine="480"/>
+        <w:rPr>
+          <w:color w:val="1f2430"/>
+        </w:rPr>
+      </w:pPr>
+      <w:r>
+        <w:rPr>
+          <w:rFonts w:hint="eastAsia" w:ascii="SimSun" w:hAnsi="SimSun" w:eastAsia="SimSun" w:cs="SimSun"/>
+          <w:b w:val="1"/>
+          <w:color w:val="1f2430"/>
+          <w:sz w:val="24"/>
+        </w:rPr>
+        <w:t>版本一致性。</w:t>
+      </w:r>
+      <w:r>
+        <w:rPr>
+          <w:rFonts w:hint="eastAsia" w:ascii="SimSun" w:hAnsi="SimSun" w:eastAsia="SimSun" w:cs="SimSun"/>
+          <w:color w:val="1f2430"/>
+          <w:sz w:val="24"/>
+        </w:rPr>
+        <w:t xml:space="preserve"> 梯度提升树的数值结果会随 scikit-learn 版本发生微小漂移。全组统一锁定 scikit-learn==1.6.1 后，消融实验中"含天气"组的指标与主实验</w:t>
+      </w:r>
+      <w:r>
+        <w:rPr>
+          <w:rFonts w:hint="eastAsia" w:ascii="SimSun" w:hAnsi="SimSun" w:eastAsia="SimSun" w:cs="SimSun"/>
+          <w:b w:val="1"/>
+          <w:color w:val="1f2430"/>
+          <w:sz w:val="24"/>
+        </w:rPr>
+        <w:t>逐值一致</w:t>
+      </w:r>
+      <w:r>
+        <w:rPr>
+          <w:rFonts w:hint="eastAsia" w:ascii="SimSun" w:hAnsi="SimSun" w:eastAsia="SimSun" w:cs="SimSun"/>
+          <w:color w:val="1f2430"/>
+          <w:sz w:val="24"/>
+        </w:rPr>
+        <w:t>（线性回归本就确定性可复现）；此前记录的 0.3%–3.1% 偏差系版本不同所致，已随本次重跑消除。</w:t>
       </w:r>
     </w:p>
     <w:p>
@@ -9851,7 +10428,7 @@
           <w:color w:val="1f2430"/>
           <w:sz w:val="28"/>
         </w:rPr>
-        <w:t>6.3　模型比较</w:t>
+        <w:t>6.3　模型比较（表 3、图 7）</w:t>
       </w:r>
       <w:bookmarkEnd w:id="23"/>
     </w:p>
@@ -9870,7 +10447,7 @@
           <w:color w:val="1f2430"/>
           <w:sz w:val="21"/>
         </w:rPr>
-        <w:t>表 3　三个模型在测试集上的对比</w:t>
+        <w:t>表 3　三个模型在测试集上的对比（原特征集）</w:t>
       </w:r>
     </w:p>
     <w:p>
@@ -9886,7 +10463,7 @@
           <w:color w:val="4b5563"/>
           <w:sz w:val="19"/>
         </w:rPr>
-        <w:t>注：测试集为 2017-11-07 09:50 至 2017-12-30 22:50，每区域 7,711 个样本，分别计算 MAE 与 RMSE；加粗为同区域最优。</w:t>
+        <w:t>注：测试集为 2017-11-07 09:50 至 2017-12-30 22:50，每区域 7,711 个样本；加粗为同区域最优；MSE 由 RMSE 平方得到，与逐点计算等价。</w:t>
       </w:r>
     </w:p>
     <w:tbl>
@@ -9902,11 +10479,12 @@
         </w:tblCellMar>
       </w:tblPr>
       <w:tblGrid>
-        <w:gridCol w:w="1661"/>
-        <w:gridCol w:w="1661"/>
-        <w:gridCol w:w="1661"/>
-        <w:gridCol w:w="1661"/>
-        <w:gridCol w:w="1661"/>
+        <w:gridCol w:w="1384"/>
+        <w:gridCol w:w="1384"/>
+        <w:gridCol w:w="1384"/>
+        <w:gridCol w:w="1384"/>
+        <w:gridCol w:w="1384"/>
+        <w:gridCol w:w="1384"/>
       </w:tblGrid>
       <w:tr>
         <w:trPr>
@@ -9914,7 +10492,7 @@
         </w:trPr>
         <w:tc>
           <w:tcPr>
-            <w:tcW w:w="1661" w:type="dxa"/>
+            <w:tcW w:w="1384" w:type="dxa"/>
             <w:tcBorders>
               <w:top w:val="single" w:color="c9ced6" w:sz="6"/>
               <w:left w:val="single" w:color="c9ced6" w:sz="6"/>
@@ -9952,7 +10530,7 @@
         </w:tc>
         <w:tc>
           <w:tcPr>
-            <w:tcW w:w="1661" w:type="dxa"/>
+            <w:tcW w:w="1384" w:type="dxa"/>
             <w:tcBorders>
               <w:top w:val="single" w:color="c9ced6" w:sz="6"/>
               <w:left w:val="single" w:color="c9ced6" w:sz="6"/>
@@ -9990,7 +10568,7 @@
         </w:tc>
         <w:tc>
           <w:tcPr>
-            <w:tcW w:w="1661" w:type="dxa"/>
+            <w:tcW w:w="1384" w:type="dxa"/>
             <w:tcBorders>
               <w:top w:val="single" w:color="c9ced6" w:sz="6"/>
               <w:left w:val="single" w:color="c9ced6" w:sz="6"/>
@@ -10028,7 +10606,7 @@
         </w:tc>
         <w:tc>
           <w:tcPr>
-            <w:tcW w:w="1661" w:type="dxa"/>
+            <w:tcW w:w="1384" w:type="dxa"/>
             <w:tcBorders>
               <w:top w:val="single" w:color="c9ced6" w:sz="6"/>
               <w:left w:val="single" w:color="c9ced6" w:sz="6"/>
@@ -10066,7 +10644,7 @@
         </w:tc>
         <w:tc>
           <w:tcPr>
-            <w:tcW w:w="1661" w:type="dxa"/>
+            <w:tcW w:w="1384" w:type="dxa"/>
             <w:tcBorders>
               <w:top w:val="single" w:color="c9ced6" w:sz="6"/>
               <w:left w:val="single" w:color="c9ced6" w:sz="6"/>
@@ -10099,6 +10677,44 @@
                 <w:sz w:val="21"/>
               </w:rPr>
               <w:t>合并 MAE/RMSE</w:t>
+            </w:r>
+          </w:p>
+        </w:tc>
+        <w:tc>
+          <w:tcPr>
+            <w:tcW w:w="1384" w:type="dxa"/>
+            <w:tcBorders>
+              <w:top w:val="single" w:color="c9ced6" w:sz="6"/>
+              <w:left w:val="single" w:color="c9ced6" w:sz="6"/>
+              <w:bottom w:val="single" w:color="c9ced6" w:sz="6"/>
+              <w:right w:val="single" w:color="c9ced6" w:sz="6"/>
+            </w:tcBorders>
+            <w:shd w:val="clear" w:fill="eef1f5"/>
+            <w:tcMar>
+              <w:top w:w="100" w:type="dxa"/>
+              <w:left w:w="140" w:type="dxa"/>
+              <w:bottom w:w="100" w:type="dxa"/>
+              <w:right w:w="140" w:type="dxa"/>
+            </w:tcMar>
+            <w:vAlign w:val="center"/>
+          </w:tcPr>
+          <w:p>
+            <w:pPr>
+              <w:jc w:val="center"/>
+              <w:rPr>
+                <w:b w:val="1"/>
+                <w:bCs w:val="1"/>
+                <w:color w:val="1f2430"/>
+              </w:rPr>
+            </w:pPr>
+            <w:r>
+              <w:rPr>
+                <w:rFonts w:hint="eastAsia" w:ascii="SimSun" w:hAnsi="SimSun" w:eastAsia="SimSun" w:cs="SimSun"/>
+                <w:b w:val="1"/>
+                <w:color w:val="1f2430"/>
+                <w:sz w:val="21"/>
+              </w:rPr>
+              <w:t>合并 MSE</w:t>
             </w:r>
           </w:p>
         </w:tc>
@@ -10107,7 +10723,7 @@
         <w:trPr/>
         <w:tc>
           <w:tcPr>
-            <w:tcW w:w="1661" w:type="dxa"/>
+            <w:tcW w:w="1384" w:type="dxa"/>
             <w:tcBorders>
               <w:top w:val="single" w:color="c9ced6" w:sz="6"/>
               <w:left w:val="single" w:color="c9ced6" w:sz="6"/>
@@ -10141,7 +10757,7 @@
         </w:tc>
         <w:tc>
           <w:tcPr>
-            <w:tcW w:w="1661" w:type="dxa"/>
+            <w:tcW w:w="1384" w:type="dxa"/>
             <w:tcBorders>
               <w:top w:val="single" w:color="c9ced6" w:sz="6"/>
               <w:left w:val="single" w:color="c9ced6" w:sz="6"/>
@@ -10175,7 +10791,7 @@
         </w:tc>
         <w:tc>
           <w:tcPr>
-            <w:tcW w:w="1661" w:type="dxa"/>
+            <w:tcW w:w="1384" w:type="dxa"/>
             <w:tcBorders>
               <w:top w:val="single" w:color="c9ced6" w:sz="6"/>
               <w:left w:val="single" w:color="c9ced6" w:sz="6"/>
@@ -10209,7 +10825,7 @@
         </w:tc>
         <w:tc>
           <w:tcPr>
-            <w:tcW w:w="1661" w:type="dxa"/>
+            <w:tcW w:w="1384" w:type="dxa"/>
             <w:tcBorders>
               <w:top w:val="single" w:color="c9ced6" w:sz="6"/>
               <w:left w:val="single" w:color="c9ced6" w:sz="6"/>
@@ -10243,7 +10859,7 @@
         </w:tc>
         <w:tc>
           <w:tcPr>
-            <w:tcW w:w="1661" w:type="dxa"/>
+            <w:tcW w:w="1384" w:type="dxa"/>
             <w:tcBorders>
               <w:top w:val="single" w:color="c9ced6" w:sz="6"/>
               <w:left w:val="single" w:color="c9ced6" w:sz="6"/>
@@ -10273,6 +10889,41 @@
                 <w:sz w:val="21"/>
               </w:rPr>
               <w:t>1050.68 / 1643.67</w:t>
+            </w:r>
+          </w:p>
+        </w:tc>
+        <w:tc>
+          <w:tcPr>
+            <w:tcW w:w="1384" w:type="dxa"/>
+            <w:tcBorders>
+              <w:top w:val="single" w:color="c9ced6" w:sz="6"/>
+              <w:left w:val="single" w:color="c9ced6" w:sz="6"/>
+              <w:bottom w:val="single" w:color="c9ced6" w:sz="6"/>
+              <w:right w:val="single" w:color="c9ced6" w:sz="6"/>
+            </w:tcBorders>
+            <w:tcMar>
+              <w:top w:w="100" w:type="dxa"/>
+              <w:left w:w="140" w:type="dxa"/>
+              <w:bottom w:w="100" w:type="dxa"/>
+              <w:right w:w="140" w:type="dxa"/>
+            </w:tcMar>
+            <w:vAlign w:val="center"/>
+          </w:tcPr>
+          <w:p>
+            <w:pPr>
+              <w:jc w:val="center"/>
+              <w:rPr>
+                <w:color w:val="1f2430"/>
+              </w:rPr>
+            </w:pPr>
+            <w:r>
+              <w:rPr>
+                <w:rFonts w:ascii="SimSun" w:hAnsi="SimSun" w:eastAsia="SimSun" w:cs="SimSun"/>
+                <w:b w:val="1"/>
+                <w:color w:val="1f2430"/>
+                <w:sz w:val="21"/>
+              </w:rPr>
+              <w:t>2,701,655</w:t>
             </w:r>
           </w:p>
         </w:tc>
@@ -10281,7 +10932,7 @@
         <w:trPr/>
         <w:tc>
           <w:tcPr>
-            <w:tcW w:w="1661" w:type="dxa"/>
+            <w:tcW w:w="1384" w:type="dxa"/>
             <w:tcBorders>
               <w:top w:val="single" w:color="c9ced6" w:sz="6"/>
               <w:left w:val="single" w:color="c9ced6" w:sz="6"/>
@@ -10315,7 +10966,7 @@
         </w:tc>
         <w:tc>
           <w:tcPr>
-            <w:tcW w:w="1661" w:type="dxa"/>
+            <w:tcW w:w="1384" w:type="dxa"/>
             <w:tcBorders>
               <w:top w:val="single" w:color="c9ced6" w:sz="6"/>
               <w:left w:val="single" w:color="c9ced6" w:sz="6"/>
@@ -10343,13 +10994,13 @@
                 <w:color w:val="1f2430"/>
                 <w:sz w:val="21"/>
               </w:rPr>
-              <w:t>2143.94 / 2513.42</w:t>
-            </w:r>
-          </w:p>
-        </w:tc>
-        <w:tc>
-          <w:tcPr>
-            <w:tcW w:w="1661" w:type="dxa"/>
+              <w:t>2143.03 / 2512.61</w:t>
+            </w:r>
+          </w:p>
+        </w:tc>
+        <w:tc>
+          <w:tcPr>
+            <w:tcW w:w="1384" w:type="dxa"/>
             <w:tcBorders>
               <w:top w:val="single" w:color="c9ced6" w:sz="6"/>
               <w:left w:val="single" w:color="c9ced6" w:sz="6"/>
@@ -10377,13 +11028,13 @@
                 <w:color w:val="1f2430"/>
                 <w:sz w:val="21"/>
               </w:rPr>
-              <w:t>1017.97 / 1551.77</w:t>
-            </w:r>
-          </w:p>
-        </w:tc>
-        <w:tc>
-          <w:tcPr>
-            <w:tcW w:w="1661" w:type="dxa"/>
+              <w:t>1016.45 / 1550.16</w:t>
+            </w:r>
+          </w:p>
+        </w:tc>
+        <w:tc>
+          <w:tcPr>
+            <w:tcW w:w="1384" w:type="dxa"/>
             <w:tcBorders>
               <w:top w:val="single" w:color="c9ced6" w:sz="6"/>
               <w:left w:val="single" w:color="c9ced6" w:sz="6"/>
@@ -10412,13 +11063,13 @@
                 <w:color w:val="1f2430"/>
                 <w:sz w:val="21"/>
               </w:rPr>
-              <w:t>1318.20 / 1663.91</w:t>
-            </w:r>
-          </w:p>
-        </w:tc>
-        <w:tc>
-          <w:tcPr>
-            <w:tcW w:w="1661" w:type="dxa"/>
+              <w:t>1321.49 / 1666.97</w:t>
+            </w:r>
+          </w:p>
+        </w:tc>
+        <w:tc>
+          <w:tcPr>
+            <w:tcW w:w="1384" w:type="dxa"/>
             <w:tcBorders>
               <w:top w:val="single" w:color="c9ced6" w:sz="6"/>
               <w:left w:val="single" w:color="c9ced6" w:sz="6"/>
@@ -10446,7 +11097,41 @@
                 <w:color w:val="1f2430"/>
                 <w:sz w:val="21"/>
               </w:rPr>
-              <w:t>1493.37 / 1957.37</w:t>
+              <w:t>1493.66 / 1957.47</w:t>
+            </w:r>
+          </w:p>
+        </w:tc>
+        <w:tc>
+          <w:tcPr>
+            <w:tcW w:w="1384" w:type="dxa"/>
+            <w:tcBorders>
+              <w:top w:val="single" w:color="c9ced6" w:sz="6"/>
+              <w:left w:val="single" w:color="c9ced6" w:sz="6"/>
+              <w:bottom w:val="single" w:color="c9ced6" w:sz="6"/>
+              <w:right w:val="single" w:color="c9ced6" w:sz="6"/>
+            </w:tcBorders>
+            <w:tcMar>
+              <w:top w:w="100" w:type="dxa"/>
+              <w:left w:w="140" w:type="dxa"/>
+              <w:bottom w:w="100" w:type="dxa"/>
+              <w:right w:w="140" w:type="dxa"/>
+            </w:tcMar>
+            <w:vAlign w:val="center"/>
+          </w:tcPr>
+          <w:p>
+            <w:pPr>
+              <w:jc w:val="center"/>
+              <w:rPr>
+                <w:color w:val="1f2430"/>
+              </w:rPr>
+            </w:pPr>
+            <w:r>
+              <w:rPr>
+                <w:rFonts w:ascii="SimSun" w:hAnsi="SimSun" w:eastAsia="SimSun" w:cs="SimSun"/>
+                <w:color w:val="1f2430"/>
+                <w:sz w:val="21"/>
+              </w:rPr>
+              <w:t>3,831,677</w:t>
             </w:r>
           </w:p>
         </w:tc>
@@ -10455,7 +11140,7 @@
         <w:trPr/>
         <w:tc>
           <w:tcPr>
-            <w:tcW w:w="1661" w:type="dxa"/>
+            <w:tcW w:w="1384" w:type="dxa"/>
             <w:tcBorders>
               <w:top w:val="single" w:color="c9ced6" w:sz="6"/>
               <w:left w:val="single" w:color="c9ced6" w:sz="6"/>
@@ -10489,7 +11174,7 @@
         </w:tc>
         <w:tc>
           <w:tcPr>
-            <w:tcW w:w="1661" w:type="dxa"/>
+            <w:tcW w:w="1384" w:type="dxa"/>
             <w:tcBorders>
               <w:top w:val="single" w:color="c9ced6" w:sz="6"/>
               <w:left w:val="single" w:color="c9ced6" w:sz="6"/>
@@ -10517,13 +11202,13 @@
                 <w:color w:val="1f2430"/>
                 <w:sz w:val="21"/>
               </w:rPr>
-              <w:t>1629.97 / 2244.42</w:t>
-            </w:r>
-          </w:p>
-        </w:tc>
-        <w:tc>
-          <w:tcPr>
-            <w:tcW w:w="1661" w:type="dxa"/>
+              <w:t>1596.96 / 2255.25</w:t>
+            </w:r>
+          </w:p>
+        </w:tc>
+        <w:tc>
+          <w:tcPr>
+            <w:tcW w:w="1384" w:type="dxa"/>
             <w:tcBorders>
               <w:top w:val="single" w:color="c9ced6" w:sz="6"/>
               <w:left w:val="single" w:color="c9ced6" w:sz="6"/>
@@ -10551,13 +11236,13 @@
                 <w:color w:val="1f2430"/>
                 <w:sz w:val="21"/>
               </w:rPr>
-              <w:t>1037.39 / 1681.75</w:t>
-            </w:r>
-          </w:p>
-        </w:tc>
-        <w:tc>
-          <w:tcPr>
-            <w:tcW w:w="1661" w:type="dxa"/>
+              <w:t>1091.57 / 1728.73</w:t>
+            </w:r>
+          </w:p>
+        </w:tc>
+        <w:tc>
+          <w:tcPr>
+            <w:tcW w:w="1384" w:type="dxa"/>
             <w:tcBorders>
               <w:top w:val="single" w:color="c9ced6" w:sz="6"/>
               <w:left w:val="single" w:color="c9ced6" w:sz="6"/>
@@ -10585,13 +11270,13 @@
                 <w:color w:val="1f2430"/>
                 <w:sz w:val="21"/>
               </w:rPr>
-              <w:t>1997.36 / 2386.99</w:t>
-            </w:r>
-          </w:p>
-        </w:tc>
-        <w:tc>
-          <w:tcPr>
-            <w:tcW w:w="1661" w:type="dxa"/>
+              <w:t>1840.15 / 2233.54</w:t>
+            </w:r>
+          </w:p>
+        </w:tc>
+        <w:tc>
+          <w:tcPr>
+            <w:tcW w:w="1384" w:type="dxa"/>
             <w:tcBorders>
               <w:top w:val="single" w:color="c9ced6" w:sz="6"/>
               <w:left w:val="single" w:color="c9ced6" w:sz="6"/>
@@ -10619,7 +11304,41 @@
                 <w:color w:val="1f2430"/>
                 <w:sz w:val="21"/>
               </w:rPr>
-              <w:t>1554.91 / 2126.30</w:t>
+              <w:t>1509.56 / 2086.73</w:t>
+            </w:r>
+          </w:p>
+        </w:tc>
+        <w:tc>
+          <w:tcPr>
+            <w:tcW w:w="1384" w:type="dxa"/>
+            <w:tcBorders>
+              <w:top w:val="single" w:color="c9ced6" w:sz="6"/>
+              <w:left w:val="single" w:color="c9ced6" w:sz="6"/>
+              <w:bottom w:val="single" w:color="c9ced6" w:sz="6"/>
+              <w:right w:val="single" w:color="c9ced6" w:sz="6"/>
+            </w:tcBorders>
+            <w:tcMar>
+              <w:top w:w="100" w:type="dxa"/>
+              <w:left w:w="140" w:type="dxa"/>
+              <w:bottom w:w="100" w:type="dxa"/>
+              <w:right w:w="140" w:type="dxa"/>
+            </w:tcMar>
+            <w:vAlign w:val="center"/>
+          </w:tcPr>
+          <w:p>
+            <w:pPr>
+              <w:jc w:val="center"/>
+              <w:rPr>
+                <w:color w:val="1f2430"/>
+              </w:rPr>
+            </w:pPr>
+            <w:r>
+              <w:rPr>
+                <w:rFonts w:ascii="SimSun" w:hAnsi="SimSun" w:eastAsia="SimSun" w:cs="SimSun"/>
+                <w:color w:val="1f2430"/>
+                <w:sz w:val="21"/>
+              </w:rPr>
+              <w:t>4,354,460</w:t>
             </w:r>
           </w:p>
         </w:tc>
@@ -10719,7 +11438,41 @@
           <w:color w:val="1f2430"/>
           <w:sz w:val="24"/>
         </w:rPr>
-        <w:t>十二个（模型 × 区域 × 指标）组合中，仅线性回归在区域 3 的 MAE 与 RMSE 同时优于基线（−2.69% 与 −24.93%），其余十项基线占优。基线占优的原因有二：其一，日周期极稳定（97% 以上的日子峰值落在 18–21 时），"上周同一时刻"本身就是很强的预测量；其二，测试期负荷水平较训练期下移（区域 1 日均 33,065→29,056，区域 3 20,052→11,949），学习模型外推训练期水平产生系统性偏差，而基线锚定上周同期值，天然免疫这种漂移。这不说明学习模型无用，而说明在负荷水平非平稳、日周周期极强的数据上，简单基线是很难击败的对照。</w:t>
+        <w:t>MSE 由 RMSE 平方得到，与逐点计算等价；逐区 MSE 见 outputs/metrics/report_table3.csv。三个指标各有侧重：MAE 反映平均绝对偏差，RMSE 与 MSE 对大误差更敏感（平方项放大极端值），三者排序一致时结论更稳健。</w:t>
+      </w:r>
+    </w:p>
+    <w:p>
+      <w:pPr>
+        <w:spacing w:before="120" w:after="120" w:line="432"/>
+        <w:ind w:left="120" w:right="120" w:firstLine="480"/>
+        <w:rPr>
+          <w:color w:val="1f2430"/>
+        </w:rPr>
+      </w:pPr>
+      <w:r>
+        <w:rPr>
+          <w:rFonts w:hint="eastAsia" w:ascii="SimSun" w:hAnsi="SimSun" w:eastAsia="SimSun" w:cs="SimSun"/>
+          <w:color w:val="1f2430"/>
+          <w:sz w:val="24"/>
+        </w:rPr>
+        <w:t>十二个（模型 × 区域 × 指标）组合中，仅线性回归在区域 3 的 MAE 与 RMSE 同时优于基线（−2.45% 与 −24.79%），其余十项基线占优。基线占优的原因有二：其一，日周期极稳定（97% 以上的日子峰值落在 18–21 时），"上周同一时刻"本身就是很强的预测量；其二，测试期负荷水平较训练期下移（区域 1 日均 33,065→29,056，区域 3 20,052→11,949），学习模型外推训练期水平产生系统性偏差，而基线锚定上周同期值，天然免疫这种漂移。</w:t>
+      </w:r>
+    </w:p>
+    <w:p>
+      <w:pPr>
+        <w:spacing w:before="120" w:after="120" w:line="432"/>
+        <w:ind w:left="120" w:right="120" w:firstLine="480"/>
+        <w:rPr>
+          <w:color w:val="1f2430"/>
+        </w:rPr>
+      </w:pPr>
+      <w:r>
+        <w:rPr>
+          <w:rFonts w:hint="eastAsia" w:ascii="SimSun" w:hAnsi="SimSun" w:eastAsia="SimSun" w:cs="SimSun"/>
+          <w:color w:val="1f2430"/>
+          <w:sz w:val="24"/>
+        </w:rPr>
+        <w:t>但这还不能下结论说"学习模型不适合这个任务"。因为两个学习模型手里的周特征与基线并不同源（见 6.2）：基线看的是目标时刻的上一周，它们看的是起点的上一周。下一节专门检验这一点。</w:t>
       </w:r>
     </w:p>
     <w:p>
@@ -10744,7 +11497,7 @@
           <w:color w:val="1f2430"/>
           <w:sz w:val="28"/>
         </w:rPr>
-        <w:t>6.4　天气特征消融</w:t>
+        <w:t>6.4　归因实验：补上目标时刻对齐的周同期特征</w:t>
       </w:r>
       <w:bookmarkEnd w:id="24"/>
     </w:p>
@@ -10762,7 +11515,7 @@
           <w:color w:val="1f2430"/>
           <w:sz w:val="24"/>
         </w:rPr>
-        <w:t>消融对照：A 组 = 历史 + 时间特征，B 组 = 历史 + 时间 + 天气特征，除天气开关外样本、切分、模型、参数完全一致。测试集 RMSE 变化（B 组相对 A 组）如下表。</w:t>
+        <w:t>在特征集中新增一项 load_lag_target_week = y(t−1002)，即历史同期基线所用的那条记录。该值在预测起点时已经是历史观测（t−1002 远早于 t），不构成未来信息；原有的 load_lag_1008 保留，样本、切分、模型配置、评价指标全部不变，因此差异只能归因到这一项特征。</w:t>
       </w:r>
     </w:p>
     <w:p>
@@ -10780,7 +11533,7 @@
           <w:color w:val="1f2430"/>
           <w:sz w:val="21"/>
         </w:rPr>
-        <w:t>表 4　天气特征消融结果</w:t>
+        <w:t>表 4　归因实验：补上目标对齐周同期特征后的测试集指标</w:t>
       </w:r>
     </w:p>
     <w:p>
@@ -10796,7 +11549,7 @@
           <w:color w:val="4b5563"/>
           <w:sz w:val="19"/>
         </w:rPr>
-        <w:t>注：数值为含天气特征组相对不含天气特征组的测试集 RMSE 变化，负值表示误差下降；唯一的正值（梯度提升树 · 区域 3）为如实报告。</w:t>
+        <w:t>注：样本、切分、模型配置与评价指标与主实验完全一致，唯一差别是新增一项 load_lag_target_week = y(t−1002)；MSE 为三区合并口径。</w:t>
       </w:r>
     </w:p>
     <w:tbl>
@@ -10812,10 +11565,12 @@
         </w:tblCellMar>
       </w:tblPr>
       <w:tblGrid>
-        <w:gridCol w:w="2076"/>
-        <w:gridCol w:w="2076"/>
-        <w:gridCol w:w="2076"/>
-        <w:gridCol w:w="2076"/>
+        <w:gridCol w:w="1384"/>
+        <w:gridCol w:w="1384"/>
+        <w:gridCol w:w="1384"/>
+        <w:gridCol w:w="1384"/>
+        <w:gridCol w:w="1384"/>
+        <w:gridCol w:w="1384"/>
       </w:tblGrid>
       <w:tr>
         <w:trPr>
@@ -10823,7 +11578,7 @@
         </w:trPr>
         <w:tc>
           <w:tcPr>
-            <w:tcW w:w="2076" w:type="dxa"/>
+            <w:tcW w:w="1384" w:type="dxa"/>
             <w:tcBorders>
               <w:top w:val="single" w:color="c9ced6" w:sz="6"/>
               <w:left w:val="single" w:color="c9ced6" w:sz="6"/>
@@ -10861,7 +11616,7 @@
         </w:tc>
         <w:tc>
           <w:tcPr>
-            <w:tcW w:w="2076" w:type="dxa"/>
+            <w:tcW w:w="1384" w:type="dxa"/>
             <w:tcBorders>
               <w:top w:val="single" w:color="c9ced6" w:sz="6"/>
               <w:left w:val="single" w:color="c9ced6" w:sz="6"/>
@@ -10888,18 +11643,132 @@
             </w:pPr>
             <w:r>
               <w:rPr>
+                <w:rFonts w:ascii="SimSun" w:hAnsi="SimSun" w:eastAsia="SimSun" w:cs="SimSun"/>
+                <w:b w:val="1"/>
+                <w:color w:val="1f2430"/>
+                <w:sz w:val="21"/>
+              </w:rPr>
+              <w:t>Z1 MAE/RMSE</w:t>
+            </w:r>
+          </w:p>
+        </w:tc>
+        <w:tc>
+          <w:tcPr>
+            <w:tcW w:w="1384" w:type="dxa"/>
+            <w:tcBorders>
+              <w:top w:val="single" w:color="c9ced6" w:sz="6"/>
+              <w:left w:val="single" w:color="c9ced6" w:sz="6"/>
+              <w:bottom w:val="single" w:color="c9ced6" w:sz="6"/>
+              <w:right w:val="single" w:color="c9ced6" w:sz="6"/>
+            </w:tcBorders>
+            <w:shd w:val="clear" w:fill="eef1f5"/>
+            <w:tcMar>
+              <w:top w:w="100" w:type="dxa"/>
+              <w:left w:w="140" w:type="dxa"/>
+              <w:bottom w:w="100" w:type="dxa"/>
+              <w:right w:w="140" w:type="dxa"/>
+            </w:tcMar>
+            <w:vAlign w:val="center"/>
+          </w:tcPr>
+          <w:p>
+            <w:pPr>
+              <w:jc w:val="center"/>
+              <w:rPr>
+                <w:b w:val="1"/>
+                <w:bCs w:val="1"/>
+                <w:color w:val="1f2430"/>
+              </w:rPr>
+            </w:pPr>
+            <w:r>
+              <w:rPr>
+                <w:rFonts w:ascii="SimSun" w:hAnsi="SimSun" w:eastAsia="SimSun" w:cs="SimSun"/>
+                <w:b w:val="1"/>
+                <w:color w:val="1f2430"/>
+                <w:sz w:val="21"/>
+              </w:rPr>
+              <w:t>Z2 MAE/RMSE</w:t>
+            </w:r>
+          </w:p>
+        </w:tc>
+        <w:tc>
+          <w:tcPr>
+            <w:tcW w:w="1384" w:type="dxa"/>
+            <w:tcBorders>
+              <w:top w:val="single" w:color="c9ced6" w:sz="6"/>
+              <w:left w:val="single" w:color="c9ced6" w:sz="6"/>
+              <w:bottom w:val="single" w:color="c9ced6" w:sz="6"/>
+              <w:right w:val="single" w:color="c9ced6" w:sz="6"/>
+            </w:tcBorders>
+            <w:shd w:val="clear" w:fill="eef1f5"/>
+            <w:tcMar>
+              <w:top w:w="100" w:type="dxa"/>
+              <w:left w:w="140" w:type="dxa"/>
+              <w:bottom w:w="100" w:type="dxa"/>
+              <w:right w:w="140" w:type="dxa"/>
+            </w:tcMar>
+            <w:vAlign w:val="center"/>
+          </w:tcPr>
+          <w:p>
+            <w:pPr>
+              <w:jc w:val="center"/>
+              <w:rPr>
+                <w:b w:val="1"/>
+                <w:bCs w:val="1"/>
+                <w:color w:val="1f2430"/>
+              </w:rPr>
+            </w:pPr>
+            <w:r>
+              <w:rPr>
+                <w:rFonts w:ascii="SimSun" w:hAnsi="SimSun" w:eastAsia="SimSun" w:cs="SimSun"/>
+                <w:b w:val="1"/>
+                <w:color w:val="1f2430"/>
+                <w:sz w:val="21"/>
+              </w:rPr>
+              <w:t>Z3 MAE/RMSE</w:t>
+            </w:r>
+          </w:p>
+        </w:tc>
+        <w:tc>
+          <w:tcPr>
+            <w:tcW w:w="1384" w:type="dxa"/>
+            <w:tcBorders>
+              <w:top w:val="single" w:color="c9ced6" w:sz="6"/>
+              <w:left w:val="single" w:color="c9ced6" w:sz="6"/>
+              <w:bottom w:val="single" w:color="c9ced6" w:sz="6"/>
+              <w:right w:val="single" w:color="c9ced6" w:sz="6"/>
+            </w:tcBorders>
+            <w:shd w:val="clear" w:fill="eef1f5"/>
+            <w:tcMar>
+              <w:top w:w="100" w:type="dxa"/>
+              <w:left w:w="140" w:type="dxa"/>
+              <w:bottom w:w="100" w:type="dxa"/>
+              <w:right w:w="140" w:type="dxa"/>
+            </w:tcMar>
+            <w:vAlign w:val="center"/>
+          </w:tcPr>
+          <w:p>
+            <w:pPr>
+              <w:jc w:val="center"/>
+              <w:rPr>
+                <w:b w:val="1"/>
+                <w:bCs w:val="1"/>
+                <w:color w:val="1f2430"/>
+              </w:rPr>
+            </w:pPr>
+            <w:r>
+              <w:rPr>
                 <w:rFonts w:hint="eastAsia" w:ascii="SimSun" w:hAnsi="SimSun" w:eastAsia="SimSun" w:cs="SimSun"/>
                 <w:b w:val="1"/>
                 <w:color w:val="1f2430"/>
                 <w:sz w:val="21"/>
               </w:rPr>
-              <w:t>区域 1</w:t>
-            </w:r>
-          </w:p>
-        </w:tc>
-        <w:tc>
-          <w:tcPr>
-            <w:tcW w:w="2076" w:type="dxa"/>
+              <w:t>合并 MAE/RMSE</w:t>
+            </w:r>
+          </w:p>
+        </w:tc>
+        <w:tc>
+          <w:tcPr>
+            <w:tcW w:w="1384" w:type="dxa"/>
             <w:tcBorders>
               <w:top w:val="single" w:color="c9ced6" w:sz="6"/>
               <w:left w:val="single" w:color="c9ced6" w:sz="6"/>
@@ -10931,45 +11800,7 @@
                 <w:color w:val="1f2430"/>
                 <w:sz w:val="21"/>
               </w:rPr>
-              <w:t>区域 2</w:t>
-            </w:r>
-          </w:p>
-        </w:tc>
-        <w:tc>
-          <w:tcPr>
-            <w:tcW w:w="2076" w:type="dxa"/>
-            <w:tcBorders>
-              <w:top w:val="single" w:color="c9ced6" w:sz="6"/>
-              <w:left w:val="single" w:color="c9ced6" w:sz="6"/>
-              <w:bottom w:val="single" w:color="c9ced6" w:sz="6"/>
-              <w:right w:val="single" w:color="c9ced6" w:sz="6"/>
-            </w:tcBorders>
-            <w:shd w:val="clear" w:fill="eef1f5"/>
-            <w:tcMar>
-              <w:top w:w="100" w:type="dxa"/>
-              <w:left w:w="140" w:type="dxa"/>
-              <w:bottom w:w="100" w:type="dxa"/>
-              <w:right w:w="140" w:type="dxa"/>
-            </w:tcMar>
-            <w:vAlign w:val="center"/>
-          </w:tcPr>
-          <w:p>
-            <w:pPr>
-              <w:jc w:val="center"/>
-              <w:rPr>
-                <w:b w:val="1"/>
-                <w:bCs w:val="1"/>
-                <w:color w:val="1f2430"/>
-              </w:rPr>
-            </w:pPr>
-            <w:r>
-              <w:rPr>
-                <w:rFonts w:hint="eastAsia" w:ascii="SimSun" w:hAnsi="SimSun" w:eastAsia="SimSun" w:cs="SimSun"/>
-                <w:b w:val="1"/>
-                <w:color w:val="1f2430"/>
-                <w:sz w:val="21"/>
-              </w:rPr>
-              <w:t>区域 3</w:t>
+              <w:t>合并 MSE</w:t>
             </w:r>
           </w:p>
         </w:tc>
@@ -10978,7 +11809,7 @@
         <w:trPr/>
         <w:tc>
           <w:tcPr>
-            <w:tcW w:w="2076" w:type="dxa"/>
+            <w:tcW w:w="1384" w:type="dxa"/>
             <w:tcBorders>
               <w:top w:val="single" w:color="c9ced6" w:sz="6"/>
               <w:left w:val="single" w:color="c9ced6" w:sz="6"/>
@@ -11006,13 +11837,13 @@
                 <w:color w:val="1f2430"/>
                 <w:sz w:val="21"/>
               </w:rPr>
-              <w:t>线性回归</w:t>
-            </w:r>
-          </w:p>
-        </w:tc>
-        <w:tc>
-          <w:tcPr>
-            <w:tcW w:w="2076" w:type="dxa"/>
+              <w:t>历史同期基线</w:t>
+            </w:r>
+          </w:p>
+        </w:tc>
+        <w:tc>
+          <w:tcPr>
+            <w:tcW w:w="1384" w:type="dxa"/>
             <w:tcBorders>
               <w:top w:val="single" w:color="c9ced6" w:sz="6"/>
               <w:left w:val="single" w:color="c9ced6" w:sz="6"/>
@@ -11040,13 +11871,13 @@
                 <w:color w:val="1f2430"/>
                 <w:sz w:val="21"/>
               </w:rPr>
-              <w:t>−23.28%</w:t>
-            </w:r>
-          </w:p>
-        </w:tc>
-        <w:tc>
-          <w:tcPr>
-            <w:tcW w:w="2076" w:type="dxa"/>
+              <w:t>831.04 / 1151.45</w:t>
+            </w:r>
+          </w:p>
+        </w:tc>
+        <w:tc>
+          <w:tcPr>
+            <w:tcW w:w="1384" w:type="dxa"/>
             <w:tcBorders>
               <w:top w:val="single" w:color="c9ced6" w:sz="6"/>
               <w:left w:val="single" w:color="c9ced6" w:sz="6"/>
@@ -11074,13 +11905,13 @@
                 <w:color w:val="1f2430"/>
                 <w:sz w:val="21"/>
               </w:rPr>
-              <w:t>−4.12%</w:t>
-            </w:r>
-          </w:p>
-        </w:tc>
-        <w:tc>
-          <w:tcPr>
-            <w:tcW w:w="2076" w:type="dxa"/>
+              <w:t>966.29 / 1366.37</w:t>
+            </w:r>
+          </w:p>
+        </w:tc>
+        <w:tc>
+          <w:tcPr>
+            <w:tcW w:w="1384" w:type="dxa"/>
             <w:tcBorders>
               <w:top w:val="single" w:color="c9ced6" w:sz="6"/>
               <w:left w:val="single" w:color="c9ced6" w:sz="6"/>
@@ -11105,11 +11936,78 @@
             <w:r>
               <w:rPr>
                 <w:rFonts w:ascii="SimSun" w:hAnsi="SimSun" w:eastAsia="SimSun" w:cs="SimSun"/>
-                <w:b w:val="1"/>
-                <w:color w:val="1f2430"/>
-                <w:sz w:val="21"/>
-              </w:rPr>
-              <w:t>−34.61%</w:t>
+                <w:color w:val="1f2430"/>
+                <w:sz w:val="21"/>
+              </w:rPr>
+              <w:t>1354.70 / 2216.34</w:t>
+            </w:r>
+          </w:p>
+        </w:tc>
+        <w:tc>
+          <w:tcPr>
+            <w:tcW w:w="1384" w:type="dxa"/>
+            <w:tcBorders>
+              <w:top w:val="single" w:color="c9ced6" w:sz="6"/>
+              <w:left w:val="single" w:color="c9ced6" w:sz="6"/>
+              <w:bottom w:val="single" w:color="c9ced6" w:sz="6"/>
+              <w:right w:val="single" w:color="c9ced6" w:sz="6"/>
+            </w:tcBorders>
+            <w:tcMar>
+              <w:top w:w="100" w:type="dxa"/>
+              <w:left w:w="140" w:type="dxa"/>
+              <w:bottom w:w="100" w:type="dxa"/>
+              <w:right w:w="140" w:type="dxa"/>
+            </w:tcMar>
+            <w:vAlign w:val="center"/>
+          </w:tcPr>
+          <w:p>
+            <w:pPr>
+              <w:jc w:val="center"/>
+              <w:rPr>
+                <w:color w:val="1f2430"/>
+              </w:rPr>
+            </w:pPr>
+            <w:r>
+              <w:rPr>
+                <w:rFonts w:ascii="SimSun" w:hAnsi="SimSun" w:eastAsia="SimSun" w:cs="SimSun"/>
+                <w:color w:val="1f2430"/>
+                <w:sz w:val="21"/>
+              </w:rPr>
+              <w:t>1050.68 / 1643.67</w:t>
+            </w:r>
+          </w:p>
+        </w:tc>
+        <w:tc>
+          <w:tcPr>
+            <w:tcW w:w="1384" w:type="dxa"/>
+            <w:tcBorders>
+              <w:top w:val="single" w:color="c9ced6" w:sz="6"/>
+              <w:left w:val="single" w:color="c9ced6" w:sz="6"/>
+              <w:bottom w:val="single" w:color="c9ced6" w:sz="6"/>
+              <w:right w:val="single" w:color="c9ced6" w:sz="6"/>
+            </w:tcBorders>
+            <w:tcMar>
+              <w:top w:w="100" w:type="dxa"/>
+              <w:left w:w="140" w:type="dxa"/>
+              <w:bottom w:w="100" w:type="dxa"/>
+              <w:right w:w="140" w:type="dxa"/>
+            </w:tcMar>
+            <w:vAlign w:val="center"/>
+          </w:tcPr>
+          <w:p>
+            <w:pPr>
+              <w:jc w:val="center"/>
+              <w:rPr>
+                <w:color w:val="1f2430"/>
+              </w:rPr>
+            </w:pPr>
+            <w:r>
+              <w:rPr>
+                <w:rFonts w:ascii="SimSun" w:hAnsi="SimSun" w:eastAsia="SimSun" w:cs="SimSun"/>
+                <w:color w:val="1f2430"/>
+                <w:sz w:val="21"/>
+              </w:rPr>
+              <w:t>2,701,655</w:t>
             </w:r>
           </w:p>
         </w:tc>
@@ -11118,7 +12016,7 @@
         <w:trPr/>
         <w:tc>
           <w:tcPr>
-            <w:tcW w:w="2076" w:type="dxa"/>
+            <w:tcW w:w="1384" w:type="dxa"/>
             <w:tcBorders>
               <w:top w:val="single" w:color="c9ced6" w:sz="6"/>
               <w:left w:val="single" w:color="c9ced6" w:sz="6"/>
@@ -11146,81 +12044,13 @@
                 <w:color w:val="1f2430"/>
                 <w:sz w:val="21"/>
               </w:rPr>
-              <w:t>梯度提升树</w:t>
-            </w:r>
-          </w:p>
-        </w:tc>
-        <w:tc>
-          <w:tcPr>
-            <w:tcW w:w="2076" w:type="dxa"/>
-            <w:tcBorders>
-              <w:top w:val="single" w:color="c9ced6" w:sz="6"/>
-              <w:left w:val="single" w:color="c9ced6" w:sz="6"/>
-              <w:bottom w:val="single" w:color="c9ced6" w:sz="6"/>
-              <w:right w:val="single" w:color="c9ced6" w:sz="6"/>
-            </w:tcBorders>
-            <w:tcMar>
-              <w:top w:w="100" w:type="dxa"/>
-              <w:left w:w="140" w:type="dxa"/>
-              <w:bottom w:w="100" w:type="dxa"/>
-              <w:right w:w="140" w:type="dxa"/>
-            </w:tcMar>
-            <w:vAlign w:val="center"/>
-          </w:tcPr>
-          <w:p>
-            <w:pPr>
-              <w:jc w:val="center"/>
-              <w:rPr>
-                <w:color w:val="1f2430"/>
-              </w:rPr>
-            </w:pPr>
-            <w:r>
-              <w:rPr>
-                <w:rFonts w:ascii="SimSun" w:hAnsi="SimSun" w:eastAsia="SimSun" w:cs="SimSun"/>
-                <w:color w:val="1f2430"/>
-                <w:sz w:val="21"/>
-              </w:rPr>
-              <w:t>−22.01%</w:t>
-            </w:r>
-          </w:p>
-        </w:tc>
-        <w:tc>
-          <w:tcPr>
-            <w:tcW w:w="2076" w:type="dxa"/>
-            <w:tcBorders>
-              <w:top w:val="single" w:color="c9ced6" w:sz="6"/>
-              <w:left w:val="single" w:color="c9ced6" w:sz="6"/>
-              <w:bottom w:val="single" w:color="c9ced6" w:sz="6"/>
-              <w:right w:val="single" w:color="c9ced6" w:sz="6"/>
-            </w:tcBorders>
-            <w:tcMar>
-              <w:top w:w="100" w:type="dxa"/>
-              <w:left w:w="140" w:type="dxa"/>
-              <w:bottom w:w="100" w:type="dxa"/>
-              <w:right w:w="140" w:type="dxa"/>
-            </w:tcMar>
-            <w:vAlign w:val="center"/>
-          </w:tcPr>
-          <w:p>
-            <w:pPr>
-              <w:jc w:val="center"/>
-              <w:rPr>
-                <w:color w:val="1f2430"/>
-              </w:rPr>
-            </w:pPr>
-            <w:r>
-              <w:rPr>
-                <w:rFonts w:ascii="SimSun" w:hAnsi="SimSun" w:eastAsia="SimSun" w:cs="SimSun"/>
-                <w:color w:val="1f2430"/>
-                <w:sz w:val="21"/>
-              </w:rPr>
-              <w:t>−7.83%</w:t>
-            </w:r>
-          </w:p>
-        </w:tc>
-        <w:tc>
-          <w:tcPr>
-            <w:tcW w:w="2076" w:type="dxa"/>
+              <w:t>线性回归（+ 周同期）</w:t>
+            </w:r>
+          </w:p>
+        </w:tc>
+        <w:tc>
+          <w:tcPr>
+            <w:tcW w:w="1384" w:type="dxa"/>
             <w:tcBorders>
               <w:top w:val="single" w:color="c9ced6" w:sz="6"/>
               <w:left w:val="single" w:color="c9ced6" w:sz="6"/>
@@ -11249,7 +12079,872 @@
                 <w:color w:val="1f2430"/>
                 <w:sz w:val="21"/>
               </w:rPr>
-              <w:t>+3.24%</w:t>
+              <w:t>547.15 / 777.86</w:t>
+            </w:r>
+          </w:p>
+        </w:tc>
+        <w:tc>
+          <w:tcPr>
+            <w:tcW w:w="1384" w:type="dxa"/>
+            <w:tcBorders>
+              <w:top w:val="single" w:color="c9ced6" w:sz="6"/>
+              <w:left w:val="single" w:color="c9ced6" w:sz="6"/>
+              <w:bottom w:val="single" w:color="c9ced6" w:sz="6"/>
+              <w:right w:val="single" w:color="c9ced6" w:sz="6"/>
+            </w:tcBorders>
+            <w:tcMar>
+              <w:top w:w="100" w:type="dxa"/>
+              <w:left w:w="140" w:type="dxa"/>
+              <w:bottom w:w="100" w:type="dxa"/>
+              <w:right w:w="140" w:type="dxa"/>
+            </w:tcMar>
+            <w:vAlign w:val="center"/>
+          </w:tcPr>
+          <w:p>
+            <w:pPr>
+              <w:jc w:val="center"/>
+              <w:rPr>
+                <w:color w:val="1f2430"/>
+              </w:rPr>
+            </w:pPr>
+            <w:r>
+              <w:rPr>
+                <w:rFonts w:ascii="SimSun" w:hAnsi="SimSun" w:eastAsia="SimSun" w:cs="SimSun"/>
+                <w:b w:val="1"/>
+                <w:color w:val="1f2430"/>
+                <w:sz w:val="21"/>
+              </w:rPr>
+              <w:t>513.58 / 729.94</w:t>
+            </w:r>
+          </w:p>
+        </w:tc>
+        <w:tc>
+          <w:tcPr>
+            <w:tcW w:w="1384" w:type="dxa"/>
+            <w:tcBorders>
+              <w:top w:val="single" w:color="c9ced6" w:sz="6"/>
+              <w:left w:val="single" w:color="c9ced6" w:sz="6"/>
+              <w:bottom w:val="single" w:color="c9ced6" w:sz="6"/>
+              <w:right w:val="single" w:color="c9ced6" w:sz="6"/>
+            </w:tcBorders>
+            <w:tcMar>
+              <w:top w:w="100" w:type="dxa"/>
+              <w:left w:w="140" w:type="dxa"/>
+              <w:bottom w:w="100" w:type="dxa"/>
+              <w:right w:w="140" w:type="dxa"/>
+            </w:tcMar>
+            <w:vAlign w:val="center"/>
+          </w:tcPr>
+          <w:p>
+            <w:pPr>
+              <w:jc w:val="center"/>
+              <w:rPr>
+                <w:color w:val="1f2430"/>
+              </w:rPr>
+            </w:pPr>
+            <w:r>
+              <w:rPr>
+                <w:rFonts w:ascii="SimSun" w:hAnsi="SimSun" w:eastAsia="SimSun" w:cs="SimSun"/>
+                <w:b w:val="1"/>
+                <w:color w:val="1f2430"/>
+                <w:sz w:val="21"/>
+              </w:rPr>
+              <w:t>481.52 / 792.29</w:t>
+            </w:r>
+          </w:p>
+        </w:tc>
+        <w:tc>
+          <w:tcPr>
+            <w:tcW w:w="1384" w:type="dxa"/>
+            <w:tcBorders>
+              <w:top w:val="single" w:color="c9ced6" w:sz="6"/>
+              <w:left w:val="single" w:color="c9ced6" w:sz="6"/>
+              <w:bottom w:val="single" w:color="c9ced6" w:sz="6"/>
+              <w:right w:val="single" w:color="c9ced6" w:sz="6"/>
+            </w:tcBorders>
+            <w:tcMar>
+              <w:top w:w="100" w:type="dxa"/>
+              <w:left w:w="140" w:type="dxa"/>
+              <w:bottom w:w="100" w:type="dxa"/>
+              <w:right w:w="140" w:type="dxa"/>
+            </w:tcMar>
+            <w:vAlign w:val="center"/>
+          </w:tcPr>
+          <w:p>
+            <w:pPr>
+              <w:jc w:val="center"/>
+              <w:rPr>
+                <w:color w:val="1f2430"/>
+              </w:rPr>
+            </w:pPr>
+            <w:r>
+              <w:rPr>
+                <w:rFonts w:ascii="SimSun" w:hAnsi="SimSun" w:eastAsia="SimSun" w:cs="SimSun"/>
+                <w:b w:val="1"/>
+                <w:color w:val="1f2430"/>
+                <w:sz w:val="21"/>
+              </w:rPr>
+              <w:t>514.09 / 767.16</w:t>
+            </w:r>
+          </w:p>
+        </w:tc>
+        <w:tc>
+          <w:tcPr>
+            <w:tcW w:w="1384" w:type="dxa"/>
+            <w:tcBorders>
+              <w:top w:val="single" w:color="c9ced6" w:sz="6"/>
+              <w:left w:val="single" w:color="c9ced6" w:sz="6"/>
+              <w:bottom w:val="single" w:color="c9ced6" w:sz="6"/>
+              <w:right w:val="single" w:color="c9ced6" w:sz="6"/>
+            </w:tcBorders>
+            <w:tcMar>
+              <w:top w:w="100" w:type="dxa"/>
+              <w:left w:w="140" w:type="dxa"/>
+              <w:bottom w:w="100" w:type="dxa"/>
+              <w:right w:w="140" w:type="dxa"/>
+            </w:tcMar>
+            <w:vAlign w:val="center"/>
+          </w:tcPr>
+          <w:p>
+            <w:pPr>
+              <w:jc w:val="center"/>
+              <w:rPr>
+                <w:color w:val="1f2430"/>
+              </w:rPr>
+            </w:pPr>
+            <w:r>
+              <w:rPr>
+                <w:rFonts w:ascii="SimSun" w:hAnsi="SimSun" w:eastAsia="SimSun" w:cs="SimSun"/>
+                <w:b w:val="1"/>
+                <w:color w:val="1f2430"/>
+                <w:sz w:val="21"/>
+              </w:rPr>
+              <w:t>588,534</w:t>
+            </w:r>
+          </w:p>
+        </w:tc>
+      </w:tr>
+      <w:tr>
+        <w:trPr/>
+        <w:tc>
+          <w:tcPr>
+            <w:tcW w:w="1384" w:type="dxa"/>
+            <w:tcBorders>
+              <w:top w:val="single" w:color="c9ced6" w:sz="6"/>
+              <w:left w:val="single" w:color="c9ced6" w:sz="6"/>
+              <w:bottom w:val="single" w:color="c9ced6" w:sz="6"/>
+              <w:right w:val="single" w:color="c9ced6" w:sz="6"/>
+            </w:tcBorders>
+            <w:tcMar>
+              <w:top w:w="100" w:type="dxa"/>
+              <w:left w:w="140" w:type="dxa"/>
+              <w:bottom w:w="100" w:type="dxa"/>
+              <w:right w:w="140" w:type="dxa"/>
+            </w:tcMar>
+            <w:vAlign w:val="center"/>
+          </w:tcPr>
+          <w:p>
+            <w:pPr>
+              <w:jc w:val="center"/>
+              <w:rPr>
+                <w:color w:val="1f2430"/>
+              </w:rPr>
+            </w:pPr>
+            <w:r>
+              <w:rPr>
+                <w:rFonts w:hint="eastAsia" w:ascii="SimSun" w:hAnsi="SimSun" w:eastAsia="SimSun" w:cs="SimSun"/>
+                <w:color w:val="1f2430"/>
+                <w:sz w:val="21"/>
+              </w:rPr>
+              <w:t>梯度提升树（+ 周同期）</w:t>
+            </w:r>
+          </w:p>
+        </w:tc>
+        <w:tc>
+          <w:tcPr>
+            <w:tcW w:w="1384" w:type="dxa"/>
+            <w:tcBorders>
+              <w:top w:val="single" w:color="c9ced6" w:sz="6"/>
+              <w:left w:val="single" w:color="c9ced6" w:sz="6"/>
+              <w:bottom w:val="single" w:color="c9ced6" w:sz="6"/>
+              <w:right w:val="single" w:color="c9ced6" w:sz="6"/>
+            </w:tcBorders>
+            <w:tcMar>
+              <w:top w:w="100" w:type="dxa"/>
+              <w:left w:w="140" w:type="dxa"/>
+              <w:bottom w:w="100" w:type="dxa"/>
+              <w:right w:w="140" w:type="dxa"/>
+            </w:tcMar>
+            <w:vAlign w:val="center"/>
+          </w:tcPr>
+          <w:p>
+            <w:pPr>
+              <w:jc w:val="center"/>
+              <w:rPr>
+                <w:color w:val="1f2430"/>
+              </w:rPr>
+            </w:pPr>
+            <w:r>
+              <w:rPr>
+                <w:rFonts w:ascii="SimSun" w:hAnsi="SimSun" w:eastAsia="SimSun" w:cs="SimSun"/>
+                <w:color w:val="1f2430"/>
+                <w:sz w:val="21"/>
+              </w:rPr>
+              <w:t>925.93 / 1201.90</w:t>
+            </w:r>
+          </w:p>
+        </w:tc>
+        <w:tc>
+          <w:tcPr>
+            <w:tcW w:w="1384" w:type="dxa"/>
+            <w:tcBorders>
+              <w:top w:val="single" w:color="c9ced6" w:sz="6"/>
+              <w:left w:val="single" w:color="c9ced6" w:sz="6"/>
+              <w:bottom w:val="single" w:color="c9ced6" w:sz="6"/>
+              <w:right w:val="single" w:color="c9ced6" w:sz="6"/>
+            </w:tcBorders>
+            <w:tcMar>
+              <w:top w:w="100" w:type="dxa"/>
+              <w:left w:w="140" w:type="dxa"/>
+              <w:bottom w:w="100" w:type="dxa"/>
+              <w:right w:w="140" w:type="dxa"/>
+            </w:tcMar>
+            <w:vAlign w:val="center"/>
+          </w:tcPr>
+          <w:p>
+            <w:pPr>
+              <w:jc w:val="center"/>
+              <w:rPr>
+                <w:color w:val="1f2430"/>
+              </w:rPr>
+            </w:pPr>
+            <w:r>
+              <w:rPr>
+                <w:rFonts w:ascii="SimSun" w:hAnsi="SimSun" w:eastAsia="SimSun" w:cs="SimSun"/>
+                <w:color w:val="1f2430"/>
+                <w:sz w:val="21"/>
+              </w:rPr>
+              <w:t>762.60 / 1118.37</w:t>
+            </w:r>
+          </w:p>
+        </w:tc>
+        <w:tc>
+          <w:tcPr>
+            <w:tcW w:w="1384" w:type="dxa"/>
+            <w:tcBorders>
+              <w:top w:val="single" w:color="c9ced6" w:sz="6"/>
+              <w:left w:val="single" w:color="c9ced6" w:sz="6"/>
+              <w:bottom w:val="single" w:color="c9ced6" w:sz="6"/>
+              <w:right w:val="single" w:color="c9ced6" w:sz="6"/>
+            </w:tcBorders>
+            <w:tcMar>
+              <w:top w:w="100" w:type="dxa"/>
+              <w:left w:w="140" w:type="dxa"/>
+              <w:bottom w:w="100" w:type="dxa"/>
+              <w:right w:w="140" w:type="dxa"/>
+            </w:tcMar>
+            <w:vAlign w:val="center"/>
+          </w:tcPr>
+          <w:p>
+            <w:pPr>
+              <w:jc w:val="center"/>
+              <w:rPr>
+                <w:color w:val="1f2430"/>
+              </w:rPr>
+            </w:pPr>
+            <w:r>
+              <w:rPr>
+                <w:rFonts w:ascii="SimSun" w:hAnsi="SimSun" w:eastAsia="SimSun" w:cs="SimSun"/>
+                <w:color w:val="1f2430"/>
+                <w:sz w:val="21"/>
+              </w:rPr>
+              <w:t>1103.33 / 1434.54</w:t>
+            </w:r>
+          </w:p>
+        </w:tc>
+        <w:tc>
+          <w:tcPr>
+            <w:tcW w:w="1384" w:type="dxa"/>
+            <w:tcBorders>
+              <w:top w:val="single" w:color="c9ced6" w:sz="6"/>
+              <w:left w:val="single" w:color="c9ced6" w:sz="6"/>
+              <w:bottom w:val="single" w:color="c9ced6" w:sz="6"/>
+              <w:right w:val="single" w:color="c9ced6" w:sz="6"/>
+            </w:tcBorders>
+            <w:tcMar>
+              <w:top w:w="100" w:type="dxa"/>
+              <w:left w:w="140" w:type="dxa"/>
+              <w:bottom w:w="100" w:type="dxa"/>
+              <w:right w:w="140" w:type="dxa"/>
+            </w:tcMar>
+            <w:vAlign w:val="center"/>
+          </w:tcPr>
+          <w:p>
+            <w:pPr>
+              <w:jc w:val="center"/>
+              <w:rPr>
+                <w:color w:val="1f2430"/>
+              </w:rPr>
+            </w:pPr>
+            <w:r>
+              <w:rPr>
+                <w:rFonts w:ascii="SimSun" w:hAnsi="SimSun" w:eastAsia="SimSun" w:cs="SimSun"/>
+                <w:color w:val="1f2430"/>
+                <w:sz w:val="21"/>
+              </w:rPr>
+              <w:t>930.62 / 1258.73</w:t>
+            </w:r>
+          </w:p>
+        </w:tc>
+        <w:tc>
+          <w:tcPr>
+            <w:tcW w:w="1384" w:type="dxa"/>
+            <w:tcBorders>
+              <w:top w:val="single" w:color="c9ced6" w:sz="6"/>
+              <w:left w:val="single" w:color="c9ced6" w:sz="6"/>
+              <w:bottom w:val="single" w:color="c9ced6" w:sz="6"/>
+              <w:right w:val="single" w:color="c9ced6" w:sz="6"/>
+            </w:tcBorders>
+            <w:tcMar>
+              <w:top w:w="100" w:type="dxa"/>
+              <w:left w:w="140" w:type="dxa"/>
+              <w:bottom w:w="100" w:type="dxa"/>
+              <w:right w:w="140" w:type="dxa"/>
+            </w:tcMar>
+            <w:vAlign w:val="center"/>
+          </w:tcPr>
+          <w:p>
+            <w:pPr>
+              <w:jc w:val="center"/>
+              <w:rPr>
+                <w:color w:val="1f2430"/>
+              </w:rPr>
+            </w:pPr>
+            <w:r>
+              <w:rPr>
+                <w:rFonts w:ascii="SimSun" w:hAnsi="SimSun" w:eastAsia="SimSun" w:cs="SimSun"/>
+                <w:color w:val="1f2430"/>
+                <w:sz w:val="21"/>
+              </w:rPr>
+              <w:t>1,584,400</w:t>
+            </w:r>
+          </w:p>
+        </w:tc>
+      </w:tr>
+    </w:tbl>
+    <w:p>
+      <w:pPr>
+        <w:spacing w:before="120" w:after="120" w:line="432"/>
+        <w:ind w:left="120" w:right="120" w:firstLine="480"/>
+        <w:rPr>
+          <w:color w:val="1f2430"/>
+        </w:rPr>
+      </w:pPr>
+      <w:r>
+        <w:rPr>
+          <w:rFonts w:hint="eastAsia" w:ascii="SimSun" w:hAnsi="SimSun" w:eastAsia="SimSun" w:cs="SimSun"/>
+          <w:color w:val="1f2430"/>
+          <w:sz w:val="24"/>
+        </w:rPr>
+        <w:t>括号内的相对变化均为相对历史同期基线；MSE 为合并口径。</w:t>
+      </w:r>
+    </w:p>
+    <w:p>
+      <w:pPr>
+        <w:spacing w:before="120" w:after="120" w:line="432"/>
+        <w:ind w:left="120" w:right="120" w:firstLine="480"/>
+        <w:rPr>
+          <w:color w:val="1f2430"/>
+        </w:rPr>
+      </w:pPr>
+      <w:r>
+        <w:rPr>
+          <w:rFonts w:hint="eastAsia" w:ascii="SimSun" w:hAnsi="SimSun" w:eastAsia="SimSun" w:cs="SimSun"/>
+          <w:color w:val="1f2430"/>
+          <w:sz w:val="24"/>
+        </w:rPr>
+        <w:t>结果远超预期：加入该特征后，线性回归在三区的测试集 RMSE 相对原特征集下降 52.5%–69.0%，相对基线下降 32.4%–64.3%，合并口径 MAE/RMSE 由 1493.66/1957.47 降至 514.09/767.16（−51.1%/−53.3%）；梯度提升树相对基线除区域 1 略高（+4.4%）外，区域 2、3 分别下降 18.2% 和 35.3%，合并口径 −11.4%/−23.4%。</w:t>
+      </w:r>
+      <w:r>
+        <w:rPr>
+          <w:rFonts w:hint="eastAsia" w:ascii="SimSun" w:hAnsi="SimSun" w:eastAsia="SimSun" w:cs="SimSun"/>
+          <w:b w:val="1"/>
+          <w:color w:val="1f2430"/>
+          <w:sz w:val="24"/>
+        </w:rPr>
+        <w:t>两个学习模型转为全面优于基线</w:t>
+      </w:r>
+      <w:r>
+        <w:rPr>
+          <w:rFonts w:hint="eastAsia" w:ascii="SimSun" w:hAnsi="SimSun" w:eastAsia="SimSun" w:cs="SimSun"/>
+          <w:color w:val="1f2430"/>
+          <w:sz w:val="24"/>
+        </w:rPr>
+        <w:t>。</w:t>
+      </w:r>
+    </w:p>
+    <w:p>
+      <w:pPr>
+        <w:spacing w:before="120" w:after="120" w:line="432"/>
+        <w:ind w:left="120" w:right="120" w:firstLine="480"/>
+        <w:rPr>
+          <w:color w:val="1f2430"/>
+        </w:rPr>
+      </w:pPr>
+      <w:r>
+        <w:rPr>
+          <w:rFonts w:hint="eastAsia" w:ascii="SimSun" w:hAnsi="SimSun" w:eastAsia="SimSun" w:cs="SimSun"/>
+          <w:color w:val="1f2430"/>
+          <w:sz w:val="24"/>
+        </w:rPr>
+        <w:t>这说明 6.3 的结论需要修正：此前"学习模型不敌基线"并不是模型不合适，而是特征集没有把最重要的周期性信息交给模型——基线之所以强，恰恰因为它直接复制了目标时刻的上一周同期值。修正特征口径后，学习模型既能利用这条信息，又能用天气、小时等其他特征做修正，因此超过了只会照抄的基线。这一结果也提示：在日周周期极强的数据上做模型比较时，必须先确认基线和学习模型拿到的信息是否同源，否则容易得出"简单基线不可战胜"的误判。</w:t>
+      </w:r>
+    </w:p>
+    <w:p>
+      <w:pPr>
+        <w:pStyle w:val="000006"/>
+        <w:keepNext w:val="1"/>
+        <w:keepLines w:val="1"/>
+        <w:spacing w:before="280" w:beforeAutospacing="1" w:after="280" w:afterAutospacing="1"/>
+        <w:ind w:left="280" w:right="280"/>
+        <w:outlineLvl w:val="1"/>
+        <w:rPr>
+          <w:color w:val="1f2430"/>
+          <w:sz w:val="32"/>
+          <w:szCs w:val="32"/>
+        </w:rPr>
+      </w:pPr>
+      <w:bookmarkStart w:id="25" w:name="section-7-5"/>
+      <w:r>
+        <w:rPr>
+          <w:rFonts w:hint="eastAsia" w:ascii="SimHei" w:hAnsi="SimHei" w:eastAsia="SimHei" w:cs="SimHei"/>
+          <w:b w:val="1"/>
+          <w:color w:val="1f2430"/>
+          <w:sz w:val="28"/>
+        </w:rPr>
+        <w:t>6.5　天气特征消融（表 5、图 9）</w:t>
+      </w:r>
+      <w:bookmarkEnd w:id="25"/>
+    </w:p>
+    <w:p>
+      <w:pPr>
+        <w:spacing w:before="120" w:after="120" w:line="432"/>
+        <w:ind w:left="120" w:right="120" w:firstLine="480"/>
+        <w:rPr>
+          <w:color w:val="1f2430"/>
+        </w:rPr>
+      </w:pPr>
+      <w:r>
+        <w:rPr>
+          <w:rFonts w:hint="eastAsia" w:ascii="SimSun" w:hAnsi="SimSun" w:eastAsia="SimSun" w:cs="SimSun"/>
+          <w:color w:val="1f2430"/>
+          <w:sz w:val="24"/>
+        </w:rPr>
+        <w:t>由于 6.4 已确认应改用含目标对齐周特征的特征集，消融随之在新特征集上重做：A 组 = 历史（含周同期）+ 时间特征，B 组 = A 组 + 天气特征，除天气开关外样本、切分、模型、参数完全一致。</w:t>
+      </w:r>
+    </w:p>
+    <w:p>
+      <w:pPr>
+        <w:spacing w:before="240" w:after="240" w:line="432"/>
+        <w:ind w:left="240" w:right="240"/>
+        <w:jc w:val="center"/>
+        <w:rPr>
+          <w:color w:val="1f2430"/>
+        </w:rPr>
+      </w:pPr>
+      <w:r>
+        <w:rPr>
+          <w:rFonts w:hint="eastAsia" w:ascii="SimHei" w:hAnsi="SimHei" w:eastAsia="SimHei" w:cs="SimHei"/>
+          <w:color w:val="1f2430"/>
+          <w:sz w:val="21"/>
+        </w:rPr>
+        <w:t>表 5　天气特征消融结果（含周同期特征的新特征集）</w:t>
+      </w:r>
+    </w:p>
+    <w:p>
+      <w:pPr>
+        <w:spacing w:line="432"/>
+        <w:rPr>
+          <w:color w:val="4b5563"/>
+        </w:rPr>
+      </w:pPr>
+      <w:r>
+        <w:rPr>
+          <w:rFonts w:hint="eastAsia" w:ascii="KaiTi" w:hAnsi="KaiTi" w:eastAsia="KaiTi" w:cs="KaiTi"/>
+          <w:color w:val="4b5563"/>
+          <w:sz w:val="19"/>
+        </w:rPr>
+        <w:t>注：数值为含天气特征组（B 组）相对不含天气特征组（A 组）的测试集 RMSE 变化，负值表示误差下降；加粗的三个组合误差反而上升，为如实报告。</w:t>
+      </w:r>
+    </w:p>
+    <w:tbl>
+      <w:tblPr>
+        <w:tblW w:w="8306" w:type="dxa"/>
+        <w:shd w:color="1f2430"/>
+        <w:tblLayout w:type="autofit"/>
+        <w:tblCellMar>
+          <w:top w:w="15" w:type="dxa"/>
+          <w:left w:w="15" w:type="dxa"/>
+          <w:bottom w:w="15" w:type="dxa"/>
+          <w:right w:w="15" w:type="dxa"/>
+        </w:tblCellMar>
+      </w:tblPr>
+      <w:tblGrid>
+        <w:gridCol w:w="2768"/>
+        <w:gridCol w:w="2768"/>
+        <w:gridCol w:w="2768"/>
+      </w:tblGrid>
+      <w:tr>
+        <w:trPr>
+          <w:tblHeader w:val="1"/>
+        </w:trPr>
+        <w:tc>
+          <w:tcPr>
+            <w:tcW w:w="2768" w:type="dxa"/>
+            <w:tcBorders>
+              <w:top w:val="single" w:color="c9ced6" w:sz="6"/>
+              <w:left w:val="single" w:color="c9ced6" w:sz="6"/>
+              <w:bottom w:val="single" w:color="c9ced6" w:sz="6"/>
+              <w:right w:val="single" w:color="c9ced6" w:sz="6"/>
+            </w:tcBorders>
+            <w:shd w:val="clear" w:fill="eef1f5"/>
+            <w:tcMar>
+              <w:top w:w="100" w:type="dxa"/>
+              <w:left w:w="140" w:type="dxa"/>
+              <w:bottom w:w="100" w:type="dxa"/>
+              <w:right w:w="140" w:type="dxa"/>
+            </w:tcMar>
+            <w:vAlign w:val="center"/>
+          </w:tcPr>
+          <w:p>
+            <w:pPr>
+              <w:jc w:val="center"/>
+              <w:rPr>
+                <w:b w:val="1"/>
+                <w:bCs w:val="1"/>
+                <w:color w:val="1f2430"/>
+              </w:rPr>
+            </w:pPr>
+            <w:r>
+              <w:rPr>
+                <w:rFonts w:hint="eastAsia" w:ascii="SimSun" w:hAnsi="SimSun" w:eastAsia="SimSun" w:cs="SimSun"/>
+                <w:b w:val="1"/>
+                <w:color w:val="1f2430"/>
+                <w:sz w:val="21"/>
+              </w:rPr>
+              <w:t>模型</w:t>
+            </w:r>
+          </w:p>
+        </w:tc>
+        <w:tc>
+          <w:tcPr>
+            <w:tcW w:w="2768" w:type="dxa"/>
+            <w:tcBorders>
+              <w:top w:val="single" w:color="c9ced6" w:sz="6"/>
+              <w:left w:val="single" w:color="c9ced6" w:sz="6"/>
+              <w:bottom w:val="single" w:color="c9ced6" w:sz="6"/>
+              <w:right w:val="single" w:color="c9ced6" w:sz="6"/>
+            </w:tcBorders>
+            <w:shd w:val="clear" w:fill="eef1f5"/>
+            <w:tcMar>
+              <w:top w:w="100" w:type="dxa"/>
+              <w:left w:w="140" w:type="dxa"/>
+              <w:bottom w:w="100" w:type="dxa"/>
+              <w:right w:w="140" w:type="dxa"/>
+            </w:tcMar>
+            <w:vAlign w:val="center"/>
+          </w:tcPr>
+          <w:p>
+            <w:pPr>
+              <w:jc w:val="center"/>
+              <w:rPr>
+                <w:b w:val="1"/>
+                <w:bCs w:val="1"/>
+                <w:color w:val="1f2430"/>
+              </w:rPr>
+            </w:pPr>
+            <w:r>
+              <w:rPr>
+                <w:rFonts w:hint="eastAsia" w:ascii="SimSun" w:hAnsi="SimSun" w:eastAsia="SimSun" w:cs="SimSun"/>
+                <w:b w:val="1"/>
+                <w:color w:val="1f2430"/>
+                <w:sz w:val="21"/>
+              </w:rPr>
+              <w:t>区域</w:t>
+            </w:r>
+          </w:p>
+        </w:tc>
+        <w:tc>
+          <w:tcPr>
+            <w:tcW w:w="2768" w:type="dxa"/>
+            <w:tcBorders>
+              <w:top w:val="single" w:color="c9ced6" w:sz="6"/>
+              <w:left w:val="single" w:color="c9ced6" w:sz="6"/>
+              <w:bottom w:val="single" w:color="c9ced6" w:sz="6"/>
+              <w:right w:val="single" w:color="c9ced6" w:sz="6"/>
+            </w:tcBorders>
+            <w:shd w:val="clear" w:fill="eef1f5"/>
+            <w:tcMar>
+              <w:top w:w="100" w:type="dxa"/>
+              <w:left w:w="140" w:type="dxa"/>
+              <w:bottom w:w="100" w:type="dxa"/>
+              <w:right w:w="140" w:type="dxa"/>
+            </w:tcMar>
+            <w:vAlign w:val="center"/>
+          </w:tcPr>
+          <w:p>
+            <w:pPr>
+              <w:jc w:val="center"/>
+              <w:rPr>
+                <w:b w:val="1"/>
+                <w:bCs w:val="1"/>
+                <w:color w:val="1f2430"/>
+              </w:rPr>
+            </w:pPr>
+            <w:r>
+              <w:rPr>
+                <w:rFonts w:hint="eastAsia" w:ascii="SimSun" w:hAnsi="SimSun" w:eastAsia="SimSun" w:cs="SimSun"/>
+                <w:b w:val="1"/>
+                <w:color w:val="1f2430"/>
+                <w:sz w:val="21"/>
+              </w:rPr>
+              <w:t>测试集 RMSE 变化</w:t>
+            </w:r>
+          </w:p>
+        </w:tc>
+      </w:tr>
+      <w:tr>
+        <w:trPr/>
+        <w:tc>
+          <w:tcPr>
+            <w:tcW w:w="2768" w:type="dxa"/>
+            <w:tcBorders>
+              <w:top w:val="single" w:color="c9ced6" w:sz="6"/>
+              <w:left w:val="single" w:color="c9ced6" w:sz="6"/>
+              <w:bottom w:val="single" w:color="c9ced6" w:sz="6"/>
+              <w:right w:val="single" w:color="c9ced6" w:sz="6"/>
+            </w:tcBorders>
+            <w:tcMar>
+              <w:top w:w="100" w:type="dxa"/>
+              <w:left w:w="140" w:type="dxa"/>
+              <w:bottom w:w="100" w:type="dxa"/>
+              <w:right w:w="140" w:type="dxa"/>
+            </w:tcMar>
+            <w:vAlign w:val="center"/>
+          </w:tcPr>
+          <w:p>
+            <w:pPr>
+              <w:jc w:val="center"/>
+              <w:rPr>
+                <w:color w:val="1f2430"/>
+              </w:rPr>
+            </w:pPr>
+            <w:r>
+              <w:rPr>
+                <w:rFonts w:hint="eastAsia" w:ascii="SimSun" w:hAnsi="SimSun" w:eastAsia="SimSun" w:cs="SimSun"/>
+                <w:color w:val="1f2430"/>
+                <w:sz w:val="21"/>
+              </w:rPr>
+              <w:t>线性回归</w:t>
+            </w:r>
+          </w:p>
+        </w:tc>
+        <w:tc>
+          <w:tcPr>
+            <w:tcW w:w="2768" w:type="dxa"/>
+            <w:tcBorders>
+              <w:top w:val="single" w:color="c9ced6" w:sz="6"/>
+              <w:left w:val="single" w:color="c9ced6" w:sz="6"/>
+              <w:bottom w:val="single" w:color="c9ced6" w:sz="6"/>
+              <w:right w:val="single" w:color="c9ced6" w:sz="6"/>
+            </w:tcBorders>
+            <w:tcMar>
+              <w:top w:w="100" w:type="dxa"/>
+              <w:left w:w="140" w:type="dxa"/>
+              <w:bottom w:w="100" w:type="dxa"/>
+              <w:right w:w="140" w:type="dxa"/>
+            </w:tcMar>
+            <w:vAlign w:val="center"/>
+          </w:tcPr>
+          <w:p>
+            <w:pPr>
+              <w:jc w:val="center"/>
+              <w:rPr>
+                <w:color w:val="1f2430"/>
+              </w:rPr>
+            </w:pPr>
+            <w:r>
+              <w:rPr>
+                <w:rFonts w:ascii="SimSun" w:hAnsi="SimSun" w:eastAsia="SimSun" w:cs="SimSun"/>
+                <w:color w:val="1f2430"/>
+                <w:sz w:val="21"/>
+              </w:rPr>
+              <w:t>Z1 / Z2 / Z3</w:t>
+            </w:r>
+          </w:p>
+        </w:tc>
+        <w:tc>
+          <w:tcPr>
+            <w:tcW w:w="2768" w:type="dxa"/>
+            <w:tcBorders>
+              <w:top w:val="single" w:color="c9ced6" w:sz="6"/>
+              <w:left w:val="single" w:color="c9ced6" w:sz="6"/>
+              <w:bottom w:val="single" w:color="c9ced6" w:sz="6"/>
+              <w:right w:val="single" w:color="c9ced6" w:sz="6"/>
+            </w:tcBorders>
+            <w:tcMar>
+              <w:top w:w="100" w:type="dxa"/>
+              <w:left w:w="140" w:type="dxa"/>
+              <w:bottom w:w="100" w:type="dxa"/>
+              <w:right w:w="140" w:type="dxa"/>
+            </w:tcMar>
+            <w:vAlign w:val="center"/>
+          </w:tcPr>
+          <w:p>
+            <w:pPr>
+              <w:jc w:val="center"/>
+              <w:rPr>
+                <w:color w:val="1f2430"/>
+              </w:rPr>
+            </w:pPr>
+            <w:r>
+              <w:rPr>
+                <w:rFonts w:ascii="SimSun" w:hAnsi="SimSun" w:eastAsia="SimSun" w:cs="SimSun"/>
+                <w:color w:val="1f2430"/>
+                <w:sz w:val="21"/>
+              </w:rPr>
+              <w:t xml:space="preserve">−10.99% / </w:t>
+            </w:r>
+            <w:r>
+              <w:rPr>
+                <w:rFonts w:ascii="SimSun" w:hAnsi="SimSun" w:eastAsia="SimSun" w:cs="SimSun"/>
+                <w:b w:val="1"/>
+                <w:color w:val="1f2430"/>
+                <w:sz w:val="21"/>
+              </w:rPr>
+              <w:t>+5.08%</w:t>
+            </w:r>
+            <w:r>
+              <w:rPr>
+                <w:rFonts w:ascii="SimSun" w:hAnsi="SimSun" w:eastAsia="SimSun" w:cs="SimSun"/>
+                <w:color w:val="1f2430"/>
+                <w:sz w:val="21"/>
+              </w:rPr>
+              <w:t xml:space="preserve"> / </w:t>
+            </w:r>
+            <w:r>
+              <w:rPr>
+                <w:rFonts w:ascii="SimSun" w:hAnsi="SimSun" w:eastAsia="SimSun" w:cs="SimSun"/>
+                <w:b w:val="1"/>
+                <w:color w:val="1f2430"/>
+                <w:sz w:val="21"/>
+              </w:rPr>
+              <w:t>+0.98%</w:t>
+            </w:r>
+          </w:p>
+        </w:tc>
+      </w:tr>
+      <w:tr>
+        <w:trPr/>
+        <w:tc>
+          <w:tcPr>
+            <w:tcW w:w="2768" w:type="dxa"/>
+            <w:tcBorders>
+              <w:top w:val="single" w:color="c9ced6" w:sz="6"/>
+              <w:left w:val="single" w:color="c9ced6" w:sz="6"/>
+              <w:bottom w:val="single" w:color="c9ced6" w:sz="6"/>
+              <w:right w:val="single" w:color="c9ced6" w:sz="6"/>
+            </w:tcBorders>
+            <w:tcMar>
+              <w:top w:w="100" w:type="dxa"/>
+              <w:left w:w="140" w:type="dxa"/>
+              <w:bottom w:w="100" w:type="dxa"/>
+              <w:right w:w="140" w:type="dxa"/>
+            </w:tcMar>
+            <w:vAlign w:val="center"/>
+          </w:tcPr>
+          <w:p>
+            <w:pPr>
+              <w:jc w:val="center"/>
+              <w:rPr>
+                <w:color w:val="1f2430"/>
+              </w:rPr>
+            </w:pPr>
+            <w:r>
+              <w:rPr>
+                <w:rFonts w:hint="eastAsia" w:ascii="SimSun" w:hAnsi="SimSun" w:eastAsia="SimSun" w:cs="SimSun"/>
+                <w:color w:val="1f2430"/>
+                <w:sz w:val="21"/>
+              </w:rPr>
+              <w:t>梯度提升树</w:t>
+            </w:r>
+          </w:p>
+        </w:tc>
+        <w:tc>
+          <w:tcPr>
+            <w:tcW w:w="2768" w:type="dxa"/>
+            <w:tcBorders>
+              <w:top w:val="single" w:color="c9ced6" w:sz="6"/>
+              <w:left w:val="single" w:color="c9ced6" w:sz="6"/>
+              <w:bottom w:val="single" w:color="c9ced6" w:sz="6"/>
+              <w:right w:val="single" w:color="c9ced6" w:sz="6"/>
+            </w:tcBorders>
+            <w:tcMar>
+              <w:top w:w="100" w:type="dxa"/>
+              <w:left w:w="140" w:type="dxa"/>
+              <w:bottom w:w="100" w:type="dxa"/>
+              <w:right w:w="140" w:type="dxa"/>
+            </w:tcMar>
+            <w:vAlign w:val="center"/>
+          </w:tcPr>
+          <w:p>
+            <w:pPr>
+              <w:jc w:val="center"/>
+              <w:rPr>
+                <w:color w:val="1f2430"/>
+              </w:rPr>
+            </w:pPr>
+            <w:r>
+              <w:rPr>
+                <w:rFonts w:ascii="SimSun" w:hAnsi="SimSun" w:eastAsia="SimSun" w:cs="SimSun"/>
+                <w:color w:val="1f2430"/>
+                <w:sz w:val="21"/>
+              </w:rPr>
+              <w:t>Z1 / Z2 / Z3</w:t>
+            </w:r>
+          </w:p>
+        </w:tc>
+        <w:tc>
+          <w:tcPr>
+            <w:tcW w:w="2768" w:type="dxa"/>
+            <w:tcBorders>
+              <w:top w:val="single" w:color="c9ced6" w:sz="6"/>
+              <w:left w:val="single" w:color="c9ced6" w:sz="6"/>
+              <w:bottom w:val="single" w:color="c9ced6" w:sz="6"/>
+              <w:right w:val="single" w:color="c9ced6" w:sz="6"/>
+            </w:tcBorders>
+            <w:tcMar>
+              <w:top w:w="100" w:type="dxa"/>
+              <w:left w:w="140" w:type="dxa"/>
+              <w:bottom w:w="100" w:type="dxa"/>
+              <w:right w:w="140" w:type="dxa"/>
+            </w:tcMar>
+            <w:vAlign w:val="center"/>
+          </w:tcPr>
+          <w:p>
+            <w:pPr>
+              <w:jc w:val="center"/>
+              <w:rPr>
+                <w:color w:val="1f2430"/>
+              </w:rPr>
+            </w:pPr>
+            <w:r>
+              <w:rPr>
+                <w:rFonts w:ascii="SimSun" w:hAnsi="SimSun" w:eastAsia="SimSun" w:cs="SimSun"/>
+                <w:color w:val="1f2430"/>
+                <w:sz w:val="21"/>
+              </w:rPr>
+              <w:t>−17.85% / −5.94% / −0.43%</w:t>
             </w:r>
           </w:p>
         </w:tc>
@@ -11316,7 +13011,7 @@
           <w:color w:val="1f2430"/>
           <w:sz w:val="21"/>
         </w:rPr>
-        <w:t>图 9　天气特征消融：测试集 RMSE 对照</w:t>
+        <w:t>图 9（a）　天气特征消融：原特征集下的测试集 RMSE 对照</w:t>
       </w:r>
     </w:p>
     <w:p>
@@ -11337,83 +13032,6 @@
     </w:p>
     <w:p>
       <w:pPr>
-        <w:spacing w:before="120" w:after="120" w:line="432"/>
-        <w:ind w:left="120" w:right="120" w:firstLine="480"/>
-        <w:rPr>
-          <w:color w:val="1f2430"/>
-        </w:rPr>
-      </w:pPr>
-      <w:r>
-        <w:rPr>
-          <w:rFonts w:hint="eastAsia" w:ascii="SimSun" w:hAnsi="SimSun" w:eastAsia="SimSun" w:cs="SimSun"/>
-          <w:color w:val="1f2430"/>
-          <w:sz w:val="24"/>
-        </w:rPr>
-        <w:t>六个组合中五个加入天气后误差下降，增益排序与第 5 章的温度相关性排序一致（区域 3 相关性最高、增益最大；区域 2 最低、增益最小）。唯一例外是梯度提升树在区域 3 变差（+3.24%），如实报告。结论：天气特征对短期负荷预测有实际增益，但增益因区域和模型而异，不能一概而论；天气仅用预测起点的同步观测，实际部署时应替换为天气预报，届时增益预计会打折。</w:t>
-      </w:r>
-    </w:p>
-    <w:p>
-      <w:pPr>
-        <w:pStyle w:val="000006"/>
-        <w:keepNext w:val="1"/>
-        <w:keepLines w:val="1"/>
-        <w:spacing w:before="280" w:beforeAutospacing="1" w:after="280" w:afterAutospacing="1"/>
-        <w:ind w:left="280" w:right="280"/>
-        <w:outlineLvl w:val="1"/>
-        <w:rPr>
-          <w:color w:val="1f2430"/>
-          <w:sz w:val="32"/>
-          <w:szCs w:val="32"/>
-        </w:rPr>
-      </w:pPr>
-      <w:bookmarkStart w:id="25" w:name="section-7-5"/>
-      <w:r>
-        <w:rPr>
-          <w:rFonts w:hint="eastAsia" w:ascii="SimHei" w:hAnsi="SimHei" w:eastAsia="SimHei" w:cs="SimHei"/>
-          <w:b w:val="1"/>
-          <w:color w:val="1f2430"/>
-          <w:sz w:val="28"/>
-        </w:rPr>
-        <w:t>6.5　分区域与高峰时段误差分析</w:t>
-      </w:r>
-      <w:bookmarkEnd w:id="25"/>
-    </w:p>
-    <w:p>
-      <w:pPr>
-        <w:spacing w:before="120" w:after="120" w:line="432"/>
-        <w:ind w:left="120" w:right="120" w:firstLine="480"/>
-        <w:rPr>
-          <w:color w:val="1f2430"/>
-        </w:rPr>
-      </w:pPr>
-      <w:r>
-        <w:rPr>
-          <w:rFonts w:hint="eastAsia" w:ascii="SimSun" w:hAnsi="SimSun" w:eastAsia="SimSun" w:cs="SimSun"/>
-          <w:color w:val="1f2430"/>
-          <w:sz w:val="24"/>
-        </w:rPr>
-        <w:t>消除量级差异后按 nRMSE 比较：区域 1 为 3.96%–8.65%，区域 2 为 5.81%–7.15%，区域 3 高达 13.92%–19.98%。区域 3 对三个模型都最难，与第 4 章的发现一致（日峰值变异系数 27.7%）。</w:t>
-      </w:r>
-    </w:p>
-    <w:p>
-      <w:pPr>
-        <w:spacing w:before="120" w:after="120" w:line="432"/>
-        <w:ind w:left="120" w:right="120" w:firstLine="480"/>
-        <w:rPr>
-          <w:color w:val="1f2430"/>
-        </w:rPr>
-      </w:pPr>
-      <w:r>
-        <w:rPr>
-          <w:rFonts w:hint="eastAsia" w:ascii="SimSun" w:hAnsi="SimSun" w:eastAsia="SimSun" w:cs="SimSun"/>
-          <w:color w:val="1f2430"/>
-          <w:sz w:val="24"/>
-        </w:rPr>
-        <w:t>高峰时段（阈值取训练集负荷分布 Q90）分析：区域 2 高峰时段梯度提升树 RMSE 为 2761，是普通时段（1125）的 2.5 倍，且偏差由 −271 转为 −1330——模型在高峰时段系统性低估峰值，这是对电网调度最不安全的误差方向。区域 1 测试期高峰样本仅 9 条、区域 3 为 0 条（测试期负荷整体下移），这两个区域的高峰表现无法从本次数据确认。残差分析（图 8）显示梯度提升树在区域 1、3 整体高估（bias +1020 / +1670），与负荷漂移方向一致。</w:t>
-      </w:r>
-    </w:p>
-    <w:p>
-      <w:pPr>
         <w:spacing w:before="240" w:after="240"/>
         <w:ind w:left="240" w:right="240"/>
         <w:jc w:val="center"/>
@@ -11424,7 +13042,7 @@
       <w:r>
         <w:drawing>
           <wp:inline>
-            <wp:extent cx="5274310" cy="1622864"/>
+            <wp:extent cx="5274310" cy="2013827"/>
             <wp:docPr id="26" name=""/>
             <wp:cNvGraphicFramePr>
               <a:graphicFrameLocks noChangeAspect="1"/>
@@ -11445,7 +13063,7 @@
                   <pic:spPr>
                     <a:xfrm>
                       <a:off x="0" y="0"/>
-                      <a:ext cx="5274310" cy="1622864"/>
+                      <a:ext cx="5274310" cy="2013827"/>
                     </a:xfrm>
                     <a:prstGeom prst="rect">
                       <a:avLst/>
@@ -11473,7 +13091,7 @@
           <w:color w:val="1f2430"/>
           <w:sz w:val="21"/>
         </w:rPr>
-        <w:t>图 8（a）　分小时预测误差（测试集）</w:t>
+        <w:t>图 9（b）　天气特征消融：含周同期特征的新特征集下的测试集 RMSE 对照</w:t>
       </w:r>
     </w:p>
     <w:p>
@@ -11489,7 +13107,169 @@
           <w:color w:val="4b5563"/>
           <w:sz w:val="19"/>
         </w:rPr>
-        <w:t>按目标时刻的小时统计 MAE，三个区域各一子图。</w:t>
+        <w:t>与（a）同一消融在新增 load_lag_target_week 后重跑的结果；两图纵轴刻度不同，比较幅度请见表 5。</w:t>
+      </w:r>
+    </w:p>
+    <w:p>
+      <w:pPr>
+        <w:spacing w:before="120" w:after="120" w:line="432"/>
+        <w:ind w:left="120" w:right="120" w:firstLine="480"/>
+        <w:rPr>
+          <w:color w:val="1f2430"/>
+        </w:rPr>
+      </w:pPr>
+      <w:r>
+        <w:rPr>
+          <w:rFonts w:hint="eastAsia" w:ascii="SimSun" w:hAnsi="SimSun" w:eastAsia="SimSun" w:cs="SimSun"/>
+          <w:color w:val="1f2430"/>
+          <w:sz w:val="24"/>
+        </w:rPr>
+        <w:t>作为对照，在原特征集（不含周同期）上同一消融的结果是：线性回归 −23.30% / −4.24% / −34.56%，梯度提升树 −23.18% / −10.54% / −5.22%，六个组合中五个下降。</w:t>
+      </w:r>
+    </w:p>
+    <w:p>
+      <w:pPr>
+        <w:spacing w:before="120" w:after="120" w:line="432"/>
+        <w:ind w:left="120" w:right="120" w:firstLine="480"/>
+        <w:rPr>
+          <w:color w:val="1f2430"/>
+        </w:rPr>
+      </w:pPr>
+      <w:r>
+        <w:rPr>
+          <w:rFonts w:hint="eastAsia" w:ascii="SimSun" w:hAnsi="SimSun" w:eastAsia="SimSun" w:cs="SimSun"/>
+          <w:color w:val="1f2430"/>
+          <w:sz w:val="24"/>
+        </w:rPr>
+        <w:t>两组结果放在一起看，结论要谨慎：</w:t>
+      </w:r>
+      <w:r>
+        <w:rPr>
+          <w:rFonts w:hint="eastAsia" w:ascii="SimSun" w:hAnsi="SimSun" w:eastAsia="SimSun" w:cs="SimSun"/>
+          <w:b w:val="1"/>
+          <w:color w:val="1f2430"/>
+          <w:sz w:val="24"/>
+        </w:rPr>
+        <w:t>天气特征的增益依赖于模型已经掌握了多少周期性信息</w:t>
+      </w:r>
+      <w:r>
+        <w:rPr>
+          <w:rFonts w:hint="eastAsia" w:ascii="SimSun" w:hAnsi="SimSun" w:eastAsia="SimSun" w:cs="SimSun"/>
+          <w:color w:val="1f2430"/>
+          <w:sz w:val="24"/>
+        </w:rPr>
+        <w:t>。在原本的模型上，天气特征填补了缺失的周期信息，因而显得很有用（最多 −34.6%）；一旦把周同期特征直接交给模型，天气带来的边际增益就大幅缩小，六个组合中三个下降（梯度提升树三个区域全部下降，−0.4% 至 −17.9%），线性回归在区域 2、3 反而略升（+5.1%、+1.0%）。因此本报告的结论是：天气特征确实有增益，但</w:t>
+      </w:r>
+      <w:r>
+        <w:rPr>
+          <w:rFonts w:hint="eastAsia" w:ascii="SimSun" w:hAnsi="SimSun" w:eastAsia="SimSun" w:cs="SimSun"/>
+          <w:b w:val="1"/>
+          <w:color w:val="1f2430"/>
+          <w:sz w:val="24"/>
+        </w:rPr>
+        <w:t>在周同期特征已存在的前提下增益有限，且因区域和模型而异</w:t>
+      </w:r>
+      <w:r>
+        <w:rPr>
+          <w:rFonts w:hint="eastAsia" w:ascii="SimSun" w:hAnsi="SimSun" w:eastAsia="SimSun" w:cs="SimSun"/>
+          <w:color w:val="1f2430"/>
+          <w:sz w:val="24"/>
+        </w:rPr>
+        <w:t>，不宜概括为"天气特征显著改善预测"。天气仅用预测起点的同步观测，实际部署时应替换为天气预报，届时增益预计进一步打折。</w:t>
+      </w:r>
+    </w:p>
+    <w:p>
+      <w:pPr>
+        <w:pStyle w:val="000006"/>
+        <w:keepNext w:val="1"/>
+        <w:keepLines w:val="1"/>
+        <w:spacing w:before="280" w:beforeAutospacing="1" w:after="280" w:afterAutospacing="1"/>
+        <w:ind w:left="280" w:right="280"/>
+        <w:outlineLvl w:val="1"/>
+        <w:rPr>
+          <w:color w:val="1f2430"/>
+          <w:sz w:val="32"/>
+          <w:szCs w:val="32"/>
+        </w:rPr>
+      </w:pPr>
+      <w:bookmarkStart w:id="26" w:name="section-7-6"/>
+      <w:r>
+        <w:rPr>
+          <w:rFonts w:hint="eastAsia" w:ascii="SimHei" w:hAnsi="SimHei" w:eastAsia="SimHei" w:cs="SimHei"/>
+          <w:b w:val="1"/>
+          <w:color w:val="1f2430"/>
+          <w:sz w:val="28"/>
+        </w:rPr>
+        <w:t>6.6　分区域与高峰时段误差分析（图 8）</w:t>
+      </w:r>
+      <w:bookmarkEnd w:id="26"/>
+    </w:p>
+    <w:p>
+      <w:pPr>
+        <w:spacing w:before="120" w:after="120" w:line="432"/>
+        <w:ind w:left="120" w:right="120" w:firstLine="480"/>
+        <w:rPr>
+          <w:color w:val="1f2430"/>
+        </w:rPr>
+      </w:pPr>
+      <w:r>
+        <w:rPr>
+          <w:rFonts w:hint="eastAsia" w:ascii="SimSun" w:hAnsi="SimSun" w:eastAsia="SimSun" w:cs="SimSun"/>
+          <w:color w:val="1f2430"/>
+          <w:sz w:val="24"/>
+        </w:rPr>
+        <w:t>以下分析基于 6.4 之后的推荐模型（含周同期特征）。消除量级差异后按 nRMSE 比较：线性回归为 2.68% / 3.10% / 6.63%，梯度提升树为 4.14% / 4.75% / 12.01%，历史同期基线为 3.96% / 5.81% / 18.55%。区域 3 对三个模型都最难，与第 4 章的发现一致（日峰值变异系数 27.7%）；线性回归在三区都是最优，且把区域 3 的相对误差从基线的 18.55% 压到 6.63%。</w:t>
+      </w:r>
+    </w:p>
+    <w:p>
+      <w:pPr>
+        <w:spacing w:before="120" w:after="120" w:line="432"/>
+        <w:ind w:left="120" w:right="120" w:firstLine="480"/>
+        <w:rPr>
+          <w:color w:val="1f2430"/>
+        </w:rPr>
+      </w:pPr>
+      <w:r>
+        <w:rPr>
+          <w:rFonts w:hint="eastAsia" w:ascii="SimSun" w:hAnsi="SimSun" w:eastAsia="SimSun" w:cs="SimSun"/>
+          <w:color w:val="1f2430"/>
+          <w:sz w:val="24"/>
+        </w:rPr>
+        <w:t>系统性偏差（bias = 预测 − 实际）方向不一：线性回归为 +86 / −223 / −173，梯度提升树为 +522 / −271 / +549，基线为 −17 / −109 / +108。加入周同期特征后，此前学习模型在区域 1、3 的严重高估（+1020 / +1670）已大幅收敛。</w:t>
+      </w:r>
+    </w:p>
+    <w:p>
+      <w:pPr>
+        <w:spacing w:before="120" w:after="120" w:line="432"/>
+        <w:ind w:left="120" w:right="120" w:firstLine="480"/>
+        <w:rPr>
+          <w:color w:val="1f2430"/>
+        </w:rPr>
+      </w:pPr>
+      <w:r>
+        <w:rPr>
+          <w:rFonts w:hint="eastAsia" w:ascii="SimSun" w:hAnsi="SimSun" w:eastAsia="SimSun" w:cs="SimSun"/>
+          <w:color w:val="1f2430"/>
+          <w:sz w:val="24"/>
+        </w:rPr>
+        <w:t>高峰时段（阈值取训练集负荷分布 Q90）分析：区域 2 高峰时段梯度提升树 RMSE 为 1732，是普通时段（825）的 2.1 倍，且偏差由 −100 转为 −793——模型在高峰时段系统性低估峰值，这是对电网调度最不安全的误差方向，这一结论在特征修正后</w:t>
+      </w:r>
+      <w:r>
+        <w:rPr>
+          <w:rFonts w:hint="eastAsia" w:ascii="SimSun" w:hAnsi="SimSun" w:eastAsia="SimSun" w:cs="SimSun"/>
+          <w:b w:val="1"/>
+          <w:color w:val="1f2430"/>
+          <w:sz w:val="24"/>
+        </w:rPr>
+        <w:t>依然成立</w:t>
+      </w:r>
+      <w:r>
+        <w:rPr>
+          <w:rFonts w:hint="eastAsia" w:ascii="SimSun" w:hAnsi="SimSun" w:eastAsia="SimSun" w:cs="SimSun"/>
+          <w:color w:val="1f2430"/>
+          <w:sz w:val="24"/>
+        </w:rPr>
+        <w:t>。区域 1 测试期高峰样本仅 9 条、区域 3 为 0 条（测试期负荷整体下移），这两个区域的高峰表现无法从本次数据确认。</w:t>
       </w:r>
     </w:p>
     <w:p>
@@ -11553,7 +13333,7 @@
           <w:color w:val="1f2430"/>
           <w:sz w:val="21"/>
         </w:rPr>
-        <w:t>图 8（b）　残差分布（梯度提升树）</w:t>
+        <w:t>图 8（a）　分小时预测误差（测试集）</w:t>
       </w:r>
     </w:p>
     <w:p>
@@ -11569,7 +13349,7 @@
           <w:color w:val="4b5563"/>
           <w:sz w:val="19"/>
         </w:rPr>
-        <w:t>残差 = 预测 − 实际，横轴为残差，纵轴为频数；三个区域各一子图。</w:t>
+        <w:t>按目标时刻的小时统计 MAE，三个区域各一子图；基于含周同期特征的推荐模型。</w:t>
       </w:r>
     </w:p>
     <w:p>
@@ -11584,7 +13364,7 @@
       <w:r>
         <w:drawing>
           <wp:inline>
-            <wp:extent cx="5274310" cy="3835861"/>
+            <wp:extent cx="5274310" cy="1622864"/>
             <wp:docPr id="32" name=""/>
             <wp:cNvGraphicFramePr>
               <a:graphicFrameLocks noChangeAspect="1"/>
@@ -11605,6 +13385,86 @@
                   <pic:spPr>
                     <a:xfrm>
                       <a:off x="0" y="0"/>
+                      <a:ext cx="5274310" cy="1622864"/>
+                    </a:xfrm>
+                    <a:prstGeom prst="rect">
+                      <a:avLst/>
+                    </a:prstGeom>
+                  </pic:spPr>
+                </pic:pic>
+              </a:graphicData>
+            </a:graphic>
+          </wp:inline>
+        </w:drawing>
+      </w:r>
+    </w:p>
+    <w:p>
+      <w:pPr>
+        <w:spacing w:before="120" w:after="120" w:line="432"/>
+        <w:ind w:left="120" w:right="120"/>
+        <w:jc w:val="center"/>
+        <w:rPr>
+          <w:color w:val="1f2430"/>
+        </w:rPr>
+      </w:pPr>
+      <w:r>
+        <w:rPr>
+          <w:rFonts w:hint="eastAsia" w:ascii="SimHei" w:hAnsi="SimHei" w:eastAsia="SimHei" w:cs="SimHei"/>
+          <w:color w:val="1f2430"/>
+          <w:sz w:val="21"/>
+        </w:rPr>
+        <w:t>图 8（b）　残差分布（梯度提升树）</w:t>
+      </w:r>
+    </w:p>
+    <w:p>
+      <w:pPr>
+        <w:spacing w:line="432"/>
+        <w:rPr>
+          <w:color w:val="4b5563"/>
+        </w:rPr>
+      </w:pPr>
+      <w:r>
+        <w:rPr>
+          <w:rFonts w:hint="eastAsia" w:ascii="KaiTi" w:hAnsi="KaiTi" w:eastAsia="KaiTi" w:cs="KaiTi"/>
+          <w:color w:val="4b5563"/>
+          <w:sz w:val="19"/>
+        </w:rPr>
+        <w:t>残差 = 预测 − 实际，横轴为残差，纵轴为频数；三个区域各一子图。</w:t>
+      </w:r>
+    </w:p>
+    <w:p>
+      <w:pPr>
+        <w:spacing w:before="240" w:after="240"/>
+        <w:ind w:left="240" w:right="240"/>
+        <w:jc w:val="center"/>
+        <w:rPr>
+          <w:color w:val="1f2430"/>
+        </w:rPr>
+      </w:pPr>
+      <w:r>
+        <w:drawing>
+          <wp:inline>
+            <wp:extent cx="5274310" cy="3835861"/>
+            <wp:docPr id="35" name=""/>
+            <wp:cNvGraphicFramePr>
+              <a:graphicFrameLocks noChangeAspect="1"/>
+            </wp:cNvGraphicFramePr>
+            <a:graphic>
+              <a:graphicData uri="http://schemas.openxmlformats.org/drawingml/2006/picture">
+                <pic:pic>
+                  <pic:nvPicPr>
+                    <pic:cNvPr id="36" name=""/>
+                    <pic:cNvPicPr/>
+                  </pic:nvPicPr>
+                  <pic:blipFill>
+                    <a:blip r:embed="rId16"/>
+                    <a:stretch>
+                      <a:fillRect/>
+                    </a:stretch>
+                  </pic:blipFill>
+                  <pic:spPr>
+                    <a:xfrm>
+                      <a:off x="0" y="0"/>
                       <a:ext cx="5274310" cy="3835861"/>
                     </a:xfrm>
                     <a:prstGeom prst="rect">
@@ -11673,7 +13533,7 @@
           <w:szCs w:val="44"/>
         </w:rPr>
       </w:pPr>
-      <w:bookmarkStart w:id="26" w:name="section-8"/>
+      <w:bookmarkStart w:id="27" w:name="section-8"/>
       <w:r>
         <w:rPr>
           <w:rFonts w:hint="eastAsia" w:ascii="SimHei" w:hAnsi="SimHei" w:eastAsia="SimHei" w:cs="SimHei"/>
@@ -11683,7 +13543,7 @@
         </w:rPr>
         <w:t>7　总结与结论</w:t>
       </w:r>
-      <w:bookmarkEnd w:id="26"/>
+      <w:bookmarkEnd w:id="27"/>
     </w:p>
     <w:p>
       <w:pPr>
@@ -11699,7 +13559,7 @@
           <w:szCs w:val="32"/>
         </w:rPr>
       </w:pPr>
-      <w:bookmarkStart w:id="27" w:name="section-8-1"/>
+      <w:bookmarkStart w:id="28" w:name="section-8-1"/>
       <w:r>
         <w:rPr>
           <w:rFonts w:hint="eastAsia" w:ascii="SimHei" w:hAnsi="SimHei" w:eastAsia="SimHei" w:cs="SimHei"/>
@@ -11709,7 +13569,7 @@
         </w:rPr>
         <w:t>7.1　主要发现</w:t>
       </w:r>
-      <w:bookmarkEnd w:id="27"/>
+      <w:bookmarkEnd w:id="28"/>
     </w:p>
     <w:p>
       <w:pPr>
@@ -11721,62 +13581,96 @@
       </w:pPr>
       <w:r>
         <w:rPr>
+          <w:rFonts w:ascii="SimSun" w:hAnsi="SimSun" w:eastAsia="SimSun" w:cs="SimSun"/>
+          <w:color w:val="1f2430"/>
+          <w:sz w:val="24"/>
+        </w:rPr>
+        <w:t xml:space="preserve">1. </w:t>
+      </w:r>
+      <w:r>
+        <w:rPr>
           <w:rFonts w:hint="eastAsia" w:ascii="SimSun" w:hAnsi="SimSun" w:eastAsia="SimSun" w:cs="SimSun"/>
+          <w:b w:val="1"/>
           <w:color w:val="1f2430"/>
           <w:sz w:val="24"/>
         </w:rPr>
-        <w:t>第一，历史同期基线整体最优。测试集合并口径 MAE/RMSE 为 1050.68/1643.67，两个学习模型均不敌基线；仅线性回归在区域 3 两项指标同时占优。基线强源于日周期极稳定与负荷水平漂移，学习模型的外推偏差在非平稳数据上代价高昂。</w:t>
-      </w:r>
-    </w:p>
-    <w:p>
-      <w:pPr>
-        <w:spacing w:before="120" w:after="120" w:line="432"/>
-        <w:ind w:left="120" w:right="120" w:firstLine="480"/>
-        <w:rPr>
-          <w:color w:val="1f2430"/>
-        </w:rPr>
-      </w:pPr>
+        <w:t>"学习模型不敌基线"是特征口径问题，不是模型问题。</w:t>
+      </w:r>
       <w:r>
         <w:rPr>
           <w:rFonts w:hint="eastAsia" w:ascii="SimSun" w:hAnsi="SimSun" w:eastAsia="SimSun" w:cs="SimSun"/>
           <w:color w:val="1f2430"/>
           <w:sz w:val="24"/>
         </w:rPr>
-        <w:t>第二，三个区域的预测难度差异主要来自数据本身。区域 3 的 nRMSE 对所有模型都最高（13.9%–20.0%），与其日峰值变异系数 27.7% 一致；区域间比较必须使用相对指标。</w:t>
-      </w:r>
-    </w:p>
-    <w:p>
-      <w:pPr>
-        <w:spacing w:before="120" w:after="120" w:line="432"/>
-        <w:ind w:left="120" w:right="120" w:firstLine="480"/>
-        <w:rPr>
-          <w:color w:val="1f2430"/>
-        </w:rPr>
-      </w:pPr>
+        <w:t xml:space="preserve"> 在原始特征集下基线最优（合并 MAE/RMSE 1050.68/1643.67），但基线用的 y(t−1002) 与学习模型手里的 y(t−1008) 并不同源。补上目标时刻对齐的周同期特征后，线性回归降至 514.09/767.16（−51.1%/−53.3%）、梯度提升树降至 930.62/1258.73（−11.4%/−23.4%），两个学习模型全面反超基线。这是本项目最重要的一条结论：</w:t>
+      </w:r>
       <w:r>
         <w:rPr>
           <w:rFonts w:hint="eastAsia" w:ascii="SimSun" w:hAnsi="SimSun" w:eastAsia="SimSun" w:cs="SimSun"/>
+          <w:b w:val="1"/>
           <w:color w:val="1f2430"/>
           <w:sz w:val="24"/>
         </w:rPr>
-        <w:t>第三，天气特征有实际增益但不稳定。5/6 组合误差下降（−4.1% 至 −34.6%），增益排序与温度相关性排序一致；梯度提升树在区域 3 例外变差（+3.24%）。</w:t>
-      </w:r>
-    </w:p>
-    <w:p>
-      <w:pPr>
-        <w:spacing w:before="120" w:after="120" w:line="432"/>
-        <w:ind w:left="120" w:right="120" w:firstLine="480"/>
-        <w:rPr>
-          <w:color w:val="1f2430"/>
-        </w:rPr>
-      </w:pPr>
+        <w:t>做模型比较前必须先确认基线和学习模型拿到的信息是否同源。</w:t>
+      </w:r>
+      <w:r>
+        <w:rPr>
+          <w:rFonts w:ascii="SimSun" w:hAnsi="SimSun" w:eastAsia="SimSun" w:cs="SimSun"/>
+          <w:color w:val="1f2430"/>
+          <w:sz w:val="24"/>
+        </w:rPr>
+        <w:t xml:space="preserve"> 2. </w:t>
+      </w:r>
       <w:r>
         <w:rPr>
           <w:rFonts w:hint="eastAsia" w:ascii="SimSun" w:hAnsi="SimSun" w:eastAsia="SimSun" w:cs="SimSun"/>
+          <w:b w:val="1"/>
           <w:color w:val="1f2430"/>
           <w:sz w:val="24"/>
         </w:rPr>
-        <w:t>第四，高峰时段更难预测且方向不利。区域 2 高峰误差为普通时段 2.5 倍，且系统性低估峰值；区域 1、3 因样本不足无法确认。</w:t>
+        <w:t>三个区域的预测难度差异主要来自数据本身。</w:t>
+      </w:r>
+      <w:r>
+        <w:rPr>
+          <w:rFonts w:hint="eastAsia" w:ascii="SimSun" w:hAnsi="SimSun" w:eastAsia="SimSun" w:cs="SimSun"/>
+          <w:color w:val="1f2430"/>
+          <w:sz w:val="24"/>
+        </w:rPr>
+        <w:t xml:space="preserve"> 改进后区域 3 的 nRMSE 仍最高（线性回归 6.63%，基线 18.55%），与其日峰值变异系数 27.7% 一致；区域间比较必须使用相对指标。 3. </w:t>
+      </w:r>
+      <w:r>
+        <w:rPr>
+          <w:rFonts w:hint="eastAsia" w:ascii="SimSun" w:hAnsi="SimSun" w:eastAsia="SimSun" w:cs="SimSun"/>
+          <w:b w:val="1"/>
+          <w:color w:val="1f2430"/>
+          <w:sz w:val="24"/>
+        </w:rPr>
+        <w:t>天气特征的增益依赖模型已掌握多少周期信息。</w:t>
+      </w:r>
+      <w:r>
+        <w:rPr>
+          <w:rFonts w:hint="eastAsia" w:ascii="SimSun" w:hAnsi="SimSun" w:eastAsia="SimSun" w:cs="SimSun"/>
+          <w:color w:val="1f2430"/>
+          <w:sz w:val="24"/>
+        </w:rPr>
+        <w:t xml:space="preserve"> 原特征集上 5/6 组合下降（最多 −34.6%），补上周同期特征后仅 3/6 下降（梯度提升树三区全降 −0.4% 至 −17.9%，线性回归在区域 2、3 略升）。不宜概括为"天气特征显著改善预测"。 4. </w:t>
+      </w:r>
+      <w:r>
+        <w:rPr>
+          <w:rFonts w:hint="eastAsia" w:ascii="SimSun" w:hAnsi="SimSun" w:eastAsia="SimSun" w:cs="SimSun"/>
+          <w:b w:val="1"/>
+          <w:color w:val="1f2430"/>
+          <w:sz w:val="24"/>
+        </w:rPr>
+        <w:t>高峰时段更难预测且方向不利。</w:t>
+      </w:r>
+      <w:r>
+        <w:rPr>
+          <w:rFonts w:hint="eastAsia" w:ascii="SimSun" w:hAnsi="SimSun" w:eastAsia="SimSun" w:cs="SimSun"/>
+          <w:color w:val="1f2430"/>
+          <w:sz w:val="24"/>
+        </w:rPr>
+        <w:t xml:space="preserve"> 区域 2 高峰误差为普通时段 2.1 倍，且系统性低估峰值（bias 由 −100 转为 −793），这一结论在特征修正后依然成立；区域 1、3 因样本不足无法确认。</w:t>
       </w:r>
     </w:p>
     <w:p>
@@ -11793,7 +13687,7 @@
           <w:szCs w:val="32"/>
         </w:rPr>
       </w:pPr>
-      <w:bookmarkStart w:id="28" w:name="section-8-2"/>
+      <w:bookmarkStart w:id="29" w:name="section-8-2"/>
       <w:r>
         <w:rPr>
           <w:rFonts w:hint="eastAsia" w:ascii="SimHei" w:hAnsi="SimHei" w:eastAsia="SimHei" w:cs="SimHei"/>
@@ -11803,7 +13697,7 @@
         </w:rPr>
         <w:t>7.2　对电网调度的建议</w:t>
       </w:r>
-      <w:bookmarkEnd w:id="28"/>
+      <w:bookmarkEnd w:id="29"/>
     </w:p>
     <w:p>
       <w:pPr>
@@ -11819,7 +13713,24 @@
           <w:color w:val="1f2430"/>
           <w:sz w:val="24"/>
         </w:rPr>
-        <w:t>小时级调度可用历史同期基线作兜底，其测试期合并 MAE 最低且偏差最小；高峰时段（18–21 时）模型倾向低估，调度裕度应向高估方向留，尤其区域 2；区域 3 波动最大、预测最难，建议单独监控并保留更大备用容量；引入天气预报替换同步观测时，可先在区域 3 试点（其天气增益证据最充分）。</w:t>
+        <w:t>- 小时级调度优先使用</w:t>
+      </w:r>
+      <w:r>
+        <w:rPr>
+          <w:rFonts w:hint="eastAsia" w:ascii="SimSun" w:hAnsi="SimSun" w:eastAsia="SimSun" w:cs="SimSun"/>
+          <w:b w:val="1"/>
+          <w:color w:val="1f2430"/>
+          <w:sz w:val="24"/>
+        </w:rPr>
+        <w:t>带目标对齐周同期特征的线性回归</w:t>
+      </w:r>
+      <w:r>
+        <w:rPr>
+          <w:rFonts w:hint="eastAsia" w:ascii="SimSun" w:hAnsi="SimSun" w:eastAsia="SimSun" w:cs="SimSun"/>
+          <w:color w:val="1f2430"/>
+          <w:sz w:val="24"/>
+        </w:rPr>
+        <w:t>：测试集三区合并 MAE/RMSE 最低，且三区 nRMSE 均为三者最小； - 历史同期基线可作为无训练、无维护成本的兜底方案，但精度比改进后的线性模型低一半以上； - 高峰时段（18–21 时）模型倾向低估，调度裕度应向高估方向留，尤其区域 2； - 区域 3 波动最大、预测最难，建议单独监控并保留更大备用容量； - 引入天气预报替换同步观测时收益有限，建议先把周同期特征与实时负荷接入做扎实，再评估天气投入。</w:t>
       </w:r>
     </w:p>
     <w:p>
@@ -11836,7 +13747,7 @@
           <w:szCs w:val="32"/>
         </w:rPr>
       </w:pPr>
-      <w:bookmarkStart w:id="29" w:name="section-8-3"/>
+      <w:bookmarkStart w:id="30" w:name="section-8-3"/>
       <w:r>
         <w:rPr>
           <w:rFonts w:hint="eastAsia" w:ascii="SimHei" w:hAnsi="SimHei" w:eastAsia="SimHei" w:cs="SimHei"/>
@@ -11846,7 +13757,24 @@
         </w:rPr>
         <w:t>7.3　局限</w:t>
       </w:r>
-      <w:bookmarkEnd w:id="29"/>
+      <w:bookmarkEnd w:id="30"/>
+    </w:p>
+    <w:p>
+      <w:pPr>
+        <w:spacing w:before="120" w:after="120" w:line="432"/>
+        <w:ind w:left="120" w:right="120" w:firstLine="480"/>
+        <w:rPr>
+          <w:color w:val="1f2430"/>
+        </w:rPr>
+      </w:pPr>
+      <w:r>
+        <w:rPr>
+          <w:rFonts w:hint="eastAsia" w:ascii="SimSun" w:hAnsi="SimSun" w:eastAsia="SimSun" w:cs="SimSun"/>
+          <w:color w:val="1f2430"/>
+          <w:sz w:val="24"/>
+        </w:rPr>
+        <w:t>本数据仅覆盖一个城市、一年（364 天，缺 12 月 31 日），以下结论不能外推：跨城市、跨年度的一般规律；跨年度季节性断言（区域 3 的 9–12 月下滑含趋势成分，无法与季节性分离）；采暖季模型有效性（未观察到低温 U 形回升）；节假日与极端天气下的表现（样本极少）。全部对比仅报数值与相对变化，未做显著性检验，不使用"显著"一类措辞。</w:t>
+      </w:r>
     </w:p>
     <w:p>
       <w:pPr>
@@ -11868,7 +13796,24 @@
           <w:color w:val="1f2430"/>
           <w:sz w:val="24"/>
         </w:rPr>
-        <w:t>本数据仅覆盖一个城市、一年（364 天，缺 12 月 31 日），以下结论不能外推：跨城市、跨年度的一般规律；跨年度季节性断言（区域 3 的 9–12 月下滑含趋势成分，无法与季节性分离）；采暖季模型有效性（未观察到低温 U 形回升）；节假日与极端天气下的表现（样本极少）。全部对比仅报数值与相对变化，未做显著性检验，不使用"显著"一类措辞。</w:t>
+        <w:t>另有两点方法上的限定需要说明。其一，6.4 的大幅改善高度依赖日周周期的稳定性（97% 以上的日子峰值落在 18–21 时），在作息规律较弱或负荷波动更剧烈的场景下，周同期特征的增益预计会小于本数据的观测值。其二，y(t−1002) 与天气特征一样，取的是预测起点时的</w:t>
+      </w:r>
+      <w:r>
+        <w:rPr>
+          <w:rFonts w:hint="eastAsia" w:ascii="SimSun" w:hAnsi="SimSun" w:eastAsia="SimSun" w:cs="SimSun"/>
+          <w:b w:val="1"/>
+          <w:color w:val="1f2430"/>
+          <w:sz w:val="24"/>
+        </w:rPr>
+        <w:t>历史</w:t>
+      </w:r>
+      <w:r>
+        <w:rPr>
+          <w:rFonts w:hint="eastAsia" w:ascii="SimSun" w:hAnsi="SimSun" w:eastAsia="SimSun" w:cs="SimSun"/>
+          <w:color w:val="1f2430"/>
+          <w:sz w:val="24"/>
+        </w:rPr>
+        <w:t>观测，不构成未来信息；实际部署时它与基线所需的数据完全相同，因此不额外增加获取成本，但如果当日存在检修、节假日等已知的日程突变，两个模型都会失效，需要另行加入日程特征。每条结论的证据与图表对应关系见 docs/results_conclusions.md 的对照表。</w:t>
       </w:r>
     </w:p>
     <w:p>
@@ -11886,7 +13831,7 @@
           <w:szCs w:val="44"/>
         </w:rPr>
       </w:pPr>
-      <w:bookmarkStart w:id="30" w:name="section-9"/>
+      <w:bookmarkStart w:id="31" w:name="section-9"/>
       <w:r>
         <w:rPr>
           <w:rFonts w:hint="eastAsia" w:ascii="SimHei" w:hAnsi="SimHei" w:eastAsia="SimHei" w:cs="SimHei"/>
@@ -11896,7 +13841,7 @@
         </w:rPr>
         <w:t>8　小组成员分工与个人承担</w:t>
       </w:r>
-      <w:bookmarkEnd w:id="30"/>
+      <w:bookmarkEnd w:id="31"/>
     </w:p>
     <w:p>
       <w:pPr>
@@ -11912,6 +13857,7 @@
           <w:szCs w:val="32"/>
         </w:rPr>
       </w:pPr>
+      <w:bookmarkStart w:id="32" w:name="section-9-1"/>
       <w:r>
         <w:rPr>
           <w:rFonts w:hint="eastAsia" w:ascii="SimHei" w:hAnsi="SimHei" w:eastAsia="SimHei" w:cs="SimHei"/>
@@ -11921,6 +13867,7 @@
         </w:rPr>
         <w:t>8.1　分工表</w:t>
       </w:r>
+      <w:bookmarkEnd w:id="32"/>
     </w:p>
     <w:tbl>
       <w:tblPr>
@@ -11978,7 +13925,7 @@
                 <w:color w:val="1f2430"/>
                 <w:sz w:val="21"/>
               </w:rPr>
-              <w:t>成员姓名</w:t>
+              <w:t>成员</w:t>
             </w:r>
           </w:p>
         </w:tc>
@@ -12220,7 +14167,7 @@
           </w:tcPr>
           <w:p>
             <w:pPr>
-              <w:jc w:val="left"/>
+              <w:jc w:val="center"/>
               <w:rPr>
                 <w:color w:val="1f2430"/>
               </w:rPr>
@@ -12359,7 +14306,7 @@
           </w:tcPr>
           <w:p>
             <w:pPr>
-              <w:jc w:val="left"/>
+              <w:jc w:val="center"/>
               <w:rPr>
                 <w:color w:val="1f2430"/>
               </w:rPr>
@@ -12498,7 +14445,7 @@
           </w:tcPr>
           <w:p>
             <w:pPr>
-              <w:jc w:val="left"/>
+              <w:jc w:val="center"/>
               <w:rPr>
                 <w:color w:val="1f2430"/>
               </w:rPr>
@@ -12529,6 +14476,7 @@
           <w:szCs w:val="32"/>
         </w:rPr>
       </w:pPr>
+      <w:bookmarkStart w:id="33" w:name="section-9-2"/>
       <w:r>
         <w:rPr>
           <w:rFonts w:hint="eastAsia" w:ascii="SimHei" w:hAnsi="SimHei" w:eastAsia="SimHei" w:cs="SimHei"/>
@@ -12538,6 +14486,7 @@
         </w:rPr>
         <w:t>8.2　个人承担说明</w:t>
       </w:r>
+      <w:bookmarkEnd w:id="33"/>
     </w:p>
     <w:p>
       <w:pPr>
@@ -12978,7 +14927,7 @@
           <w:color w:val="1f2430"/>
           <w:sz w:val="24"/>
         </w:rPr>
-        <w:t xml:space="preserve"> 摘要、第 1 章引言、第 7 章结论，第 6.4 节的天气特征消融、第 6.5 节的分区域与高峰时段误差分析，以及报告框架、实验记录规范和最后的整合定稿。代码对应 `src/ablation.py` 与 `src/error_analysis.py`，提交为 C1 至 C5。</w:t>
+        <w:t xml:space="preserve"> 摘要、第 1 章引言、第 7 章结论，第 6.4 节的归因实验、第 6.5 节的天气特征消融、第 6.6 节的分区域与高峰时段误差分析，以及报告框架、实验记录规范和最后的整合定稿。代码对应 `src/ablation.py`、`src/error_analysis.py` 与 `src/probe_target_week.py`，提交为 C1 至 C5。</w:t>
       </w:r>
     </w:p>
     <w:p>
@@ -13073,7 +15022,7 @@
           <w:color w:val="1f2430"/>
           <w:sz w:val="24"/>
         </w:rPr>
-        <w:t>一是消融结果与主实验对不上。梯度提升树带天气那一组的指标和成员 B 的主实验有 0.3% 到 3.1% 的相对差异。查下来是我本机 scikit-learn 版本与成员 B 的 1.6.1 不同，直方图实现有数值微差。线性回归、样本区间、样本量全部逐值一致，说明不是流程问题。处理方式是在实验日志里注明版本差异，并在结论中如实说明，同时建议全组锁定版本后重跑。</w:t>
+        <w:t>一是消融结果与主实验对不上。梯度提升树带天气那一组的指标和成员 B 的主实验有 0.3% 到 3.1% 的相对差异。查下来是我本机 scikit-learn 版本与成员 B 的 1.6.1 不同，直方图实现有数值微差。线性回归、样本区间、样本量全部逐值一致，说明不是流程问题。处理方式是先在实验日志里注明版本差异并如实写进结论，随后全组在 `requirements.txt` 中锁定 `scikit-learn==1.6.1` 并重跑，偏差已消除，消融带天气组与主实验逐值一致。</w:t>
       </w:r>
     </w:p>
     <w:p>
@@ -13150,7 +15099,7 @@
           <w:color w:val="1f2430"/>
           <w:sz w:val="24"/>
         </w:rPr>
-        <w:t xml:space="preserve"> 消融部分的梯度提升树受版本影响没有统一重跑，是本次报告的一处未完成项。高峰时段结论只有区域 2 有足够样本支撑，区域 1 和区域 3 留白。另外误差分析只做到分层描述，没有进一步建模归因，误差与温度、负荷水平之间的定量关系还可以再做。</w:t>
+        <w:t xml:space="preserve"> 版本统一后消融与误差分析都在新特征集上重做了一遍，但仍有两处留白：高峰时段结论只有区域 2 有足够样本支撑，区域 1 和区域 3 留白；误差分析只做到分层描述，没有进一步建模归因，误差与温度、负荷水平之间的定量关系还可以再做。另外时间特征目前取预测起点的小时、星期、月份，若改取目标时刻的对应值是否更合适，本次没有试验。</w:t>
       </w:r>
     </w:p>
     <w:p>
@@ -13191,7 +15140,7 @@
           <w:szCs w:val="44"/>
         </w:rPr>
       </w:pPr>
-      <w:bookmarkStart w:id="31" w:name="section-10"/>
+      <w:bookmarkStart w:id="34" w:name="section-10"/>
       <w:r>
         <w:rPr>
           <w:rFonts w:hint="eastAsia" w:ascii="SimHei" w:hAnsi="SimHei" w:eastAsia="SimHei" w:cs="SimHei"/>
@@ -13201,7 +15150,7 @@
         </w:rPr>
         <w:t>9　附录</w:t>
       </w:r>
-      <w:bookmarkEnd w:id="31"/>
+      <w:bookmarkEnd w:id="34"/>
     </w:p>
     <w:p>
       <w:pPr>
@@ -13217,6 +15166,7 @@
           <w:szCs w:val="32"/>
         </w:rPr>
       </w:pPr>
+      <w:bookmarkStart w:id="35" w:name="section-10-1"/>
       <w:r>
         <w:rPr>
           <w:rFonts w:hint="eastAsia" w:ascii="SimHei" w:hAnsi="SimHei" w:eastAsia="SimHei" w:cs="SimHei"/>
@@ -13226,6 +15176,7 @@
         </w:rPr>
         <w:t>附录 A　代码仓库</w:t>
       </w:r>
+      <w:bookmarkEnd w:id="35"/>
     </w:p>
     <w:p>
       <w:pPr>
@@ -13241,7 +15192,7 @@
           <w:color w:val="1f2430"/>
           <w:sz w:val="24"/>
         </w:rPr>
-        <w:t>GitHub 仓库：https://github.com/77xiang/python_data_processing（提交前最终确认）。</w:t>
+        <w:t>GitHub 仓库：https://github.com/77xiang/python_data_processing（待最终确认后填入报告）</w:t>
       </w:r>
     </w:p>
     <w:p>
@@ -13258,7 +15209,7 @@
           <w:color w:val="1f2430"/>
           <w:sz w:val="24"/>
         </w:rPr>
-        <w:t>代码结构：src/data_cleaning.py（清洗）→ src/features.py、src/splits.py（特征与切分）→ src/models.py、src/evaluate.py、src/compare.py（模型与比较）→ src/ablation.py（消融）→ src/error_analysis.py（误差分析）；分析图表分别由 src/eda.py、src/weather_analysis.py 生成。</w:t>
+        <w:t>代码结构：src/data_cleaning.py（清洗）→ src/features.py、src/splits.py（特征与切分）→ src/models.py、src/evaluate.py、src/compare.py（模型与比较）→ src/ablation.py（消融）→ src/error_analysis.py（误差分析）→ src/probe_target_week.py（归因实验）；分析图表分别由 src/eda.py、src/weather_analysis.py 生成。</w:t>
       </w:r>
     </w:p>
     <w:p>
@@ -13275,6 +15226,7 @@
           <w:szCs w:val="32"/>
         </w:rPr>
       </w:pPr>
+      <w:bookmarkStart w:id="36" w:name="section-10-2"/>
       <w:r>
         <w:rPr>
           <w:rFonts w:hint="eastAsia" w:ascii="SimHei" w:hAnsi="SimHei" w:eastAsia="SimHei" w:cs="SimHei"/>
@@ -13284,6 +15236,7 @@
         </w:rPr>
         <w:t>附录 B　复现说明</w:t>
       </w:r>
+      <w:bookmarkEnd w:id="36"/>
     </w:p>
     <w:p>
       <w:pPr>
@@ -13299,7 +15252,7 @@
           <w:color w:val="1f2430"/>
           <w:sz w:val="24"/>
         </w:rPr>
-        <w:t>1. 将原始数据放至 data/raw/（原始数据不入库）；2. 依赖见 requirements.txt（建议锁定 scikit-learn==1.6.1）；3. 运行 src/compare.py 完整重跑三模型并生成表 3、图 7，src/ablation.py 与 src/error_analysis.py 分别复现消融与误差分析；4. 自动化检查见 tests/（切分与特征索引、模型对齐、交付核对共 19 项）。</w:t>
+        <w:t>1. 将原始数据放至 data/raw/题4_城市电力负荷.csv（原始数据不入库）； 2. 依赖见 requirements.txt，其中 scikit-learn==1.6.1 必须锁定（梯度提升树数值随版本漂移，实测 1.6.1 与 1.9.1 之间相差 0.3%–3.1%）； 3. python src/compare.py 完整重跑三模型并生成表 3、图 7； 4. python src/probe_target_week.py 复现表 4（目标对齐周特征对照）并写出改进模型的测试集预测； 5. python src/ablation.py --target-week 复现表 5（新特征集上的天气消融），python src/ablation.py 复现原特征集消融； 6. python src/error_analysis.py --tag _tw 复现图 8 与误差分析（默认无 --tag 时分析原模型）； 7. 自动化检查：tests/（切分与特征索引含 purge 检查、模型对齐、交付核对共 20 项）。</w:t>
       </w:r>
     </w:p>
     <w:p>
@@ -13316,6 +15269,7 @@
           <w:szCs w:val="32"/>
         </w:rPr>
       </w:pPr>
+      <w:bookmarkStart w:id="37" w:name="section-10-3"/>
       <w:r>
         <w:rPr>
           <w:rFonts w:hint="eastAsia" w:ascii="SimHei" w:hAnsi="SimHei" w:eastAsia="SimHei" w:cs="SimHei"/>
@@ -13325,6 +15279,7 @@
         </w:rPr>
         <w:t>附录 C　主要代码片段</w:t>
       </w:r>
+      <w:bookmarkEnd w:id="37"/>
     </w:p>
     <w:p>
       <w:pPr>
@@ -13346,7 +15301,7 @@
           <w:color w:val="1f2430"/>
           <w:sz w:val="24"/>
         </w:rPr>
-        <w:t>（此处摘录核心函数：seasonal_naive_predict、build_zone_samples 的特征构造与 include_weather 开关、GBT 配置选择。）</w:t>
+        <w:t>（转 Word 时从上述模块摘录核心函数：seasonal_naive_predict、build_zone_samples 的特征构造与 include_weather 开关、GBT 配置选择。）</w:t>
       </w:r>
     </w:p>
     <w:p/>
@@ -13421,110 +15376,111 @@
     </w:pPrDefault>
   </w:docDefaults>
   <w:latentStyles w:defLockedState="0" w:defUIPriority="99" w:defSemiHidden="0" w:defUnhideWhenUsed="0" w:defQFormat="0" w:count="88">
+    <w:lsdException w:name="footnote text" w:semiHidden="1" w:unhideWhenUsed="1"/>
+    <w:lsdException w:name="index 9" w:semiHidden="1" w:unhideWhenUsed="1"/>
+    <w:lsdException w:name="heading 4" w:uiPriority="9" w:semiHidden="1" w:unhideWhenUsed="1" w:qFormat="1"/>
+    <w:lsdException w:name="List Number 4" w:semiHidden="1" w:unhideWhenUsed="1"/>
+    <w:lsdException w:name="Body Text" w:semiHidden="1" w:unhideWhenUsed="1"/>
+    <w:lsdException w:name="List" w:semiHidden="1" w:unhideWhenUsed="1"/>
+    <w:lsdException w:name="endnote text" w:semiHidden="1" w:unhideWhenUsed="1"/>
     <w:lsdException w:name="List 3" w:semiHidden="1" w:unhideWhenUsed="1"/>
+    <w:lsdException w:name="heading 3" w:uiPriority="9" w:semiHidden="1" w:unhideWhenUsed="1" w:qFormat="1"/>
+    <w:lsdException w:name="index 8" w:semiHidden="1" w:unhideWhenUsed="1"/>
+    <w:lsdException w:name="table of authorities" w:semiHidden="1" w:unhideWhenUsed="1"/>
+    <w:lsdException w:name="index 2" w:semiHidden="1" w:unhideWhenUsed="1"/>
+    <w:lsdException w:name="heading 9" w:uiPriority="9" w:semiHidden="1" w:unhideWhenUsed="1" w:qFormat="1"/>
+    <w:lsdException w:name="List Continue" w:semiHidden="1" w:unhideWhenUsed="1"/>
+    <w:lsdException w:name="Signature" w:semiHidden="1" w:unhideWhenUsed="1"/>
+    <w:lsdException w:name="List Number 5" w:semiHidden="1" w:unhideWhenUsed="1"/>
+    <w:lsdException w:name="index heading" w:semiHidden="1" w:unhideWhenUsed="1"/>
+    <w:lsdException w:name="header" w:semiHidden="1" w:unhideWhenUsed="1"/>
+    <w:lsdException w:name="Strong" w:uiPriority="22" w:qFormat="1"/>
+    <w:lsdException w:name="annotation text" w:semiHidden="1" w:unhideWhenUsed="1"/>
+    <w:lsdException w:name="Body Text Indent 2" w:semiHidden="1" w:unhideWhenUsed="1"/>
+    <w:lsdException w:name="annotation reference" w:semiHidden="1" w:unhideWhenUsed="1"/>
+    <w:lsdException w:name="index 5" w:semiHidden="1" w:unhideWhenUsed="1"/>
+    <w:lsdException w:name="heading 2" w:uiPriority="9" w:semiHidden="1" w:unhideWhenUsed="1" w:qFormat="1"/>
+    <w:lsdException w:name="heading 8" w:uiPriority="9" w:semiHidden="1" w:unhideWhenUsed="1" w:qFormat="1"/>
+    <w:lsdException w:name="List Bullet 3" w:semiHidden="1" w:unhideWhenUsed="1"/>
+    <w:lsdException w:name="List Number 2" w:semiHidden="1" w:unhideWhenUsed="1"/>
+    <w:lsdException w:name="toc 5" w:uiPriority="39" w:semiHidden="1" w:unhideWhenUsed="1"/>
+    <w:lsdException w:name="index 4" w:semiHidden="1" w:unhideWhenUsed="1"/>
+    <w:lsdException w:name="heading 7" w:uiPriority="9" w:semiHidden="1" w:unhideWhenUsed="1" w:qFormat="1"/>
+    <w:lsdException w:name="List Bullet 2" w:semiHidden="1" w:unhideWhenUsed="1"/>
+    <w:lsdException w:name="Date" w:semiHidden="1" w:unhideWhenUsed="1"/>
+    <w:lsdException w:name="footnote reference" w:semiHidden="1" w:unhideWhenUsed="1"/>
+    <w:lsdException w:name="toc 4" w:uiPriority="39" w:semiHidden="1" w:unhideWhenUsed="1"/>
+    <w:lsdException w:name="Note Heading" w:semiHidden="1" w:unhideWhenUsed="1"/>
+    <w:lsdException w:name="Message Header" w:semiHidden="1" w:unhideWhenUsed="1"/>
+    <w:lsdException w:name="Body Text 2" w:semiHidden="1" w:unhideWhenUsed="1"/>
+    <w:lsdException w:name="index 7" w:semiHidden="1" w:unhideWhenUsed="1"/>
+    <w:lsdException w:name="envelope return" w:semiHidden="1" w:unhideWhenUsed="1"/>
+    <w:lsdException w:name="List Bullet 5" w:semiHidden="1" w:unhideWhenUsed="1"/>
+    <w:lsdException w:name="Subtitle" w:uiPriority="11" w:qFormat="1"/>
+    <w:lsdException w:name="List Continue 3" w:semiHidden="1" w:unhideWhenUsed="1"/>
+    <w:lsdException w:name="index 1" w:semiHidden="1" w:unhideWhenUsed="1"/>
+    <w:lsdException w:name="Body Text Indent 3" w:semiHidden="1" w:unhideWhenUsed="1"/>
+    <w:lsdException w:name="toc 3" w:uiPriority="39" w:semiHidden="1" w:unhideWhenUsed="1"/>
+    <w:lsdException w:name="Block Text" w:semiHidden="1" w:unhideWhenUsed="1"/>
+    <w:lsdException w:name="toc 9" w:uiPriority="39" w:semiHidden="1" w:unhideWhenUsed="1"/>
+    <w:lsdException w:name="Body Text 3" w:semiHidden="1" w:unhideWhenUsed="1"/>
+    <w:lsdException w:name="endnote reference" w:semiHidden="1" w:unhideWhenUsed="1"/>
+    <w:lsdException w:name="index 6" w:semiHidden="1" w:unhideWhenUsed="1"/>
+    <w:lsdException w:name="page number" w:semiHidden="1" w:unhideWhenUsed="1"/>
+    <w:lsdException w:name="List Bullet 4" w:semiHidden="1" w:unhideWhenUsed="1"/>
+    <w:lsdException w:name="FollowedHyperlink" w:semiHidden="1" w:unhideWhenUsed="1"/>
+    <w:lsdException w:name="Hyperlink" w:semiHidden="1" w:unhideWhenUsed="1"/>
+    <w:lsdException w:name="toc 2" w:uiPriority="39" w:semiHidden="1" w:unhideWhenUsed="1"/>
+    <w:lsdException w:name="toc 8" w:uiPriority="39" w:semiHidden="1" w:unhideWhenUsed="1"/>
+    <w:lsdException w:name="Normal" w:uiPriority="0" w:qFormat="1"/>
+    <w:lsdException w:name="line number" w:semiHidden="1" w:unhideWhenUsed="1"/>
+    <w:lsdException w:name="List Number" w:semiHidden="1" w:unhideWhenUsed="1"/>
+    <w:lsdException w:name="index 3" w:semiHidden="1" w:unhideWhenUsed="1"/>
+    <w:lsdException w:name="Title" w:uiPriority="10" w:qFormat="1"/>
+    <w:lsdException w:name="List 5" w:semiHidden="1" w:unhideWhenUsed="1"/>
+    <w:lsdException w:name="toc 1" w:uiPriority="39" w:semiHidden="1" w:unhideWhenUsed="1"/>
+    <w:lsdException w:name="toc 7" w:uiPriority="39" w:semiHidden="1" w:unhideWhenUsed="1"/>
     <w:lsdException w:name="caption" w:uiPriority="35" w:semiHidden="1" w:unhideWhenUsed="1" w:qFormat="1"/>
     <w:lsdException w:name="footer" w:semiHidden="1" w:unhideWhenUsed="1"/>
-    <w:lsdException w:name="heading 9" w:uiPriority="9" w:semiHidden="1" w:unhideWhenUsed="1" w:qFormat="1"/>
+    <w:lsdException w:name="List 4" w:semiHidden="1" w:unhideWhenUsed="1"/>
+    <w:lsdException w:name="toc 6" w:uiPriority="39" w:semiHidden="1" w:unhideWhenUsed="1"/>
+    <w:lsdException w:name="List 2" w:semiHidden="1" w:unhideWhenUsed="1"/>
+    <w:lsdException w:name="List Continue 4" w:semiHidden="1" w:unhideWhenUsed="1"/>
+    <w:lsdException w:name="Body Text Indent" w:semiHidden="1" w:unhideWhenUsed="1"/>
+    <w:lsdException w:name="macro" w:semiHidden="1" w:unhideWhenUsed="1"/>
     <w:lsdException w:name="List Continue 5" w:semiHidden="1" w:unhideWhenUsed="1"/>
-    <w:lsdException w:name="Hyperlink" w:semiHidden="1" w:unhideWhenUsed="1"/>
-    <w:lsdException w:name="index 8" w:semiHidden="1" w:unhideWhenUsed="1"/>
-    <w:lsdException w:name="table of authorities" w:semiHidden="1" w:unhideWhenUsed="1"/>
-    <w:lsdException w:name="heading 8" w:uiPriority="9" w:semiHidden="1" w:unhideWhenUsed="1" w:qFormat="1"/>
-    <w:lsdException w:name="heading 3" w:uiPriority="9" w:semiHidden="1" w:unhideWhenUsed="1" w:qFormat="1"/>
-    <w:lsdException w:name="index heading" w:semiHidden="1" w:unhideWhenUsed="1"/>
+    <w:lsdException w:name="Salutation" w:semiHidden="1" w:unhideWhenUsed="1"/>
+    <w:lsdException w:name="Body Text First Indent 2" w:semiHidden="1" w:unhideWhenUsed="1"/>
+    <w:lsdException w:name="toa heading" w:semiHidden="1" w:unhideWhenUsed="1"/>
+    <w:lsdException w:name="heading 1" w:uiPriority="9" w:qFormat="1"/>
+    <w:lsdException w:name="List Continue 2" w:semiHidden="1" w:unhideWhenUsed="1"/>
+    <w:lsdException w:name="table of figures" w:semiHidden="1" w:unhideWhenUsed="1"/>
+    <w:lsdException w:name="List Number 3" w:semiHidden="1" w:unhideWhenUsed="1"/>
+    <w:lsdException w:name="heading 6" w:uiPriority="9" w:semiHidden="1" w:unhideWhenUsed="1" w:qFormat="1"/>
+    <w:lsdException w:name="Closing" w:semiHidden="1" w:unhideWhenUsed="1"/>
+    <w:lsdException w:name="Default Paragraph Font" w:uiPriority="1" w:semiHidden="1" w:unhideWhenUsed="1"/>
+    <w:lsdException w:name="List Bullet" w:semiHidden="1" w:unhideWhenUsed="1"/>
+    <w:lsdException w:name="envelope address" w:semiHidden="1" w:unhideWhenUsed="1"/>
+    <w:lsdException w:name="Body Text First Indent" w:semiHidden="1" w:unhideWhenUsed="1"/>
+    <w:lsdException w:name="Normal Indent" w:semiHidden="1" w:unhideWhenUsed="1"/>
     <w:lsdException w:name="heading 5" w:uiPriority="9" w:semiHidden="1" w:unhideWhenUsed="1" w:qFormat="1"/>
-    <w:lsdException w:name="toc 7" w:uiPriority="39" w:semiHidden="1" w:unhideWhenUsed="1"/>
-    <w:lsdException w:name="Body Text 3" w:semiHidden="1" w:unhideWhenUsed="1"/>
-    <w:lsdException w:name="List Continue" w:semiHidden="1" w:unhideWhenUsed="1"/>
-    <w:lsdException w:name="index 7" w:semiHidden="1" w:unhideWhenUsed="1"/>
-    <w:lsdException w:name="Strong" w:uiPriority="22" w:qFormat="1"/>
-    <w:lsdException w:name="Default Paragraph Font" w:uiPriority="1" w:semiHidden="1" w:unhideWhenUsed="1"/>
-    <w:lsdException w:name="Date" w:semiHidden="1" w:unhideWhenUsed="1"/>
-    <w:lsdException w:name="List Continue 2" w:semiHidden="1" w:unhideWhenUsed="1"/>
-    <w:lsdException w:name="Block Text" w:semiHidden="1" w:unhideWhenUsed="1"/>
-    <w:lsdException w:name="Salutation" w:semiHidden="1" w:unhideWhenUsed="1"/>
-    <w:lsdException w:name="List Continue 4" w:semiHidden="1" w:unhideWhenUsed="1"/>
-    <w:lsdException w:name="index 6" w:semiHidden="1" w:unhideWhenUsed="1"/>
-    <w:lsdException w:name="endnote reference" w:semiHidden="1" w:unhideWhenUsed="1"/>
-    <w:lsdException w:name="Body Text Indent" w:semiHidden="1" w:unhideWhenUsed="1"/>
-    <w:lsdException w:name="List Bullet 4" w:semiHidden="1" w:unhideWhenUsed="1"/>
-    <w:lsdException w:name="index 4" w:semiHidden="1" w:unhideWhenUsed="1"/>
-    <w:lsdException w:name="toc 2" w:uiPriority="39" w:semiHidden="1" w:unhideWhenUsed="1"/>
-    <w:lsdException w:name="Subtitle" w:uiPriority="11" w:qFormat="1"/>
-    <w:lsdException w:name="heading 7" w:uiPriority="9" w:semiHidden="1" w:unhideWhenUsed="1" w:qFormat="1"/>
-    <w:lsdException w:name="Body Text Indent 3" w:semiHidden="1" w:unhideWhenUsed="1"/>
-    <w:lsdException w:name="List Number 3" w:semiHidden="1" w:unhideWhenUsed="1"/>
-    <w:lsdException w:name="List Number" w:semiHidden="1" w:unhideWhenUsed="1"/>
-    <w:lsdException w:name="line number" w:semiHidden="1" w:unhideWhenUsed="1"/>
-    <w:lsdException w:name="List 2" w:semiHidden="1" w:unhideWhenUsed="1"/>
-    <w:lsdException w:name="envelope return" w:semiHidden="1" w:unhideWhenUsed="1"/>
-    <w:lsdException w:name="List 5" w:semiHidden="1" w:unhideWhenUsed="1"/>
-    <w:lsdException w:name="FollowedHyperlink" w:semiHidden="1" w:unhideWhenUsed="1"/>
-    <w:lsdException w:name="envelope address" w:semiHidden="1" w:unhideWhenUsed="1"/>
-    <w:lsdException w:name="macro" w:semiHidden="1" w:unhideWhenUsed="1"/>
-    <w:lsdException w:name="footnote text" w:semiHidden="1" w:unhideWhenUsed="1"/>
-    <w:lsdException w:name="Body Text First Indent" w:semiHidden="1" w:unhideWhenUsed="1"/>
-    <w:lsdException w:name="List 4" w:semiHidden="1" w:unhideWhenUsed="1"/>
-    <w:lsdException w:name="Body Text 2" w:semiHidden="1" w:unhideWhenUsed="1"/>
-    <w:lsdException w:name="Title" w:uiPriority="10" w:qFormat="1"/>
-    <w:lsdException w:name="index 3" w:semiHidden="1" w:unhideWhenUsed="1"/>
-    <w:lsdException w:name="List Number 4" w:semiHidden="1" w:unhideWhenUsed="1"/>
-    <w:lsdException w:name="page number" w:semiHidden="1" w:unhideWhenUsed="1"/>
-    <w:lsdException w:name="header" w:semiHidden="1" w:unhideWhenUsed="1"/>
-    <w:lsdException w:name="endnote text" w:semiHidden="1" w:unhideWhenUsed="1"/>
-    <w:lsdException w:name="heading 2" w:uiPriority="9" w:semiHidden="1" w:unhideWhenUsed="1" w:qFormat="1"/>
-    <w:lsdException w:name="annotation reference" w:semiHidden="1" w:unhideWhenUsed="1"/>
-    <w:lsdException w:name="List Bullet 2" w:semiHidden="1" w:unhideWhenUsed="1"/>
-    <w:lsdException w:name="index 2" w:semiHidden="1" w:unhideWhenUsed="1"/>
-    <w:lsdException w:name="index 9" w:semiHidden="1" w:unhideWhenUsed="1"/>
-    <w:lsdException w:name="toc 4" w:uiPriority="39" w:semiHidden="1" w:unhideWhenUsed="1"/>
-    <w:lsdException w:name="toc 6" w:uiPriority="39" w:semiHidden="1" w:unhideWhenUsed="1"/>
-    <w:lsdException w:name="Note Heading" w:semiHidden="1" w:unhideWhenUsed="1"/>
-    <w:lsdException w:name="toc 1" w:uiPriority="39" w:semiHidden="1" w:unhideWhenUsed="1"/>
-    <w:lsdException w:name="List Number 5" w:semiHidden="1" w:unhideWhenUsed="1"/>
-    <w:lsdException w:name="Body Text" w:semiHidden="1" w:unhideWhenUsed="1"/>
-    <w:lsdException w:name="List Bullet" w:semiHidden="1" w:unhideWhenUsed="1"/>
-    <w:lsdException w:name="Signature" w:semiHidden="1" w:unhideWhenUsed="1"/>
-    <w:lsdException w:name="annotation text" w:semiHidden="1" w:unhideWhenUsed="1"/>
-    <w:lsdException w:name="Body Text Indent 2" w:semiHidden="1" w:unhideWhenUsed="1"/>
-    <w:lsdException w:name="List Continue 3" w:semiHidden="1" w:unhideWhenUsed="1"/>
-    <w:lsdException w:name="index 1" w:semiHidden="1" w:unhideWhenUsed="1"/>
-    <w:lsdException w:name="table of figures" w:semiHidden="1" w:unhideWhenUsed="1"/>
-    <w:lsdException w:name="toc 9" w:uiPriority="39" w:semiHidden="1" w:unhideWhenUsed="1"/>
-    <w:lsdException w:name="Message Header" w:semiHidden="1" w:unhideWhenUsed="1"/>
-    <w:lsdException w:name="heading 4" w:uiPriority="9" w:semiHidden="1" w:unhideWhenUsed="1" w:qFormat="1"/>
-    <w:lsdException w:name="toa heading" w:semiHidden="1" w:unhideWhenUsed="1"/>
-    <w:lsdException w:name="heading 6" w:uiPriority="9" w:semiHidden="1" w:unhideWhenUsed="1" w:qFormat="1"/>
-    <w:lsdException w:name="List" w:semiHidden="1" w:unhideWhenUsed="1"/>
-    <w:lsdException w:name="Closing" w:semiHidden="1" w:unhideWhenUsed="1"/>
-    <w:lsdException w:name="heading 1" w:uiPriority="9" w:qFormat="1"/>
-    <w:lsdException w:name="List Bullet 5" w:semiHidden="1" w:unhideWhenUsed="1"/>
-    <w:lsdException w:name="index 5" w:semiHidden="1" w:unhideWhenUsed="1"/>
-    <w:lsdException w:name="Normal" w:uiPriority="0" w:qFormat="1"/>
-    <w:lsdException w:name="toc 8" w:uiPriority="39" w:semiHidden="1" w:unhideWhenUsed="1"/>
-    <w:lsdException w:name="List Bullet 3" w:semiHidden="1" w:unhideWhenUsed="1"/>
-    <w:lsdException w:name="toc 3" w:uiPriority="39" w:semiHidden="1" w:unhideWhenUsed="1"/>
-    <w:lsdException w:name="footnote reference" w:semiHidden="1" w:unhideWhenUsed="1"/>
-    <w:lsdException w:name="List Number 2" w:semiHidden="1" w:unhideWhenUsed="1"/>
-    <w:lsdException w:name="toc 5" w:uiPriority="39" w:semiHidden="1" w:unhideWhenUsed="1"/>
-    <w:lsdException w:name="Body Text First Indent 2" w:semiHidden="1" w:unhideWhenUsed="1"/>
-    <w:lsdException w:name="Normal Indent" w:semiHidden="1" w:unhideWhenUsed="1"/>
   </w:latentStyles>
-  <w:style w:type="paragraph" w:styleId="000004">
-    <w:name w:val="toc 2"/>
+  <w:style w:type="paragraph" w:styleId="000006">
+    <w:name w:val="heading 2"/>
     <w:basedOn w:val="Normal"/>
+    <w:next w:val="Normal"/>
+    <w:uiPriority w:val="9"/>
     <w:qFormat w:val="1"/>
     <w:pPr>
-      <w:tabs>
-        <w:tab w:val="right" w:leader="dot" w:pos="9072"/>
-      </w:tabs>
-      <w:spacing w:after="60" w:line="360"/>
-      <w:ind w:left="420"/>
+      <w:keepNext w:val="1"/>
+      <w:keepLines w:val="1"/>
+      <w:spacing w:before="200" w:after="100"/>
+      <w:outlineLvl w:val="1"/>
     </w:pPr>
     <w:rPr>
-      <w:rFonts w:ascii="SimSun" w:hAnsi="SimSun" w:eastAsia="SimSun" w:cs="SimSun"/>
-      <w:sz w:val="24"/>
-      <w:szCs w:val="24"/>
+      <w:b w:val="1"/>
+      <w:sz w:val="26"/>
+      <w:szCs w:val="26"/>
     </w:rPr>
   </w:style>
   <w:style w:type="paragraph" w:styleId="000003">
@@ -13543,24 +15499,6 @@
       <w:szCs w:val="24"/>
     </w:rPr>
   </w:style>
-  <w:style w:type="paragraph" w:styleId="000006">
-    <w:name w:val="heading 2"/>
-    <w:basedOn w:val="Normal"/>
-    <w:next w:val="Normal"/>
-    <w:uiPriority w:val="9"/>
-    <w:qFormat w:val="1"/>
-    <w:pPr>
-      <w:keepNext w:val="1"/>
-      <w:keepLines w:val="1"/>
-      <w:spacing w:before="200" w:after="100"/>
-      <w:outlineLvl w:val="1"/>
-    </w:pPr>
-    <w:rPr>
-      <w:b w:val="1"/>
-      <w:sz w:val="26"/>
-      <w:szCs w:val="26"/>
-    </w:rPr>
-  </w:style>
   <w:style w:type="paragraph" w:styleId="000005">
     <w:name w:val="heading 1"/>
     <w:basedOn w:val="Normal"/>
@@ -13577,6 +15515,23 @@
       <w:b w:val="1"/>
       <w:sz w:val="32"/>
       <w:szCs w:val="32"/>
+    </w:rPr>
+  </w:style>
+  <w:style w:type="paragraph" w:styleId="000004">
+    <w:name w:val="toc 2"/>
+    <w:basedOn w:val="Normal"/>
+    <w:qFormat w:val="1"/>
+    <w:pPr>
+      <w:tabs>
+        <w:tab w:val="right" w:leader="dot" w:pos="9072"/>
+      </w:tabs>
+      <w:spacing w:after="60" w:line="360"/>
+      <w:ind w:left="420"/>
+    </w:pPr>
+    <w:rPr>
+      <w:rFonts w:ascii="SimSun" w:hAnsi="SimSun" w:eastAsia="SimSun" w:cs="SimSun"/>
+      <w:sz w:val="24"/>
+      <w:szCs w:val="24"/>
     </w:rPr>
   </w:style>
 </w:styles>

</xml_diff>